<commit_message>
Fix portable handbook pagination and web syntax
</commit_message>
<xml_diff>
--- a/deliverables/greenhouse-sentinel-handbook.docx
+++ b/deliverables/greenhouse-sentinel-handbook.docx
@@ -33,16 +33,6 @@
       </w:r>
     </w:p>
     <w:p>
-      <w:r>
-        <w:br w:type="page"/>
-      </w:r>
-    </w:p>
-    <w:p>
-      <w:r>
-        <w:br w:type="page"/>
-      </w:r>
-    </w:p>
-    <w:p>
       <w:pPr>
         <w:pStyle w:val="Heading1"/>
       </w:pPr>
@@ -71,9 +61,6 @@
         </w:rPr>
         <w:t>Start the product tour</w:t>
       </w:r>
-      <w:r>
-        <w:t>{ .md-button .md-button--primary }</w:t>
-      </w:r>
     </w:p>
     <w:p>
       <w:r>
@@ -83,9 +70,6 @@
         </w:rPr>
         <w:t>See how the repo works</w:t>
       </w:r>
-      <w:r>
-        <w:t>{ .md-button }</w:t>
-      </w:r>
     </w:p>
     <w:p>
       <w:pPr>
@@ -142,7 +126,7 @@
     </w:p>
     <w:p>
       <w:r>
-        <w:t xml:space="preserve">    Greenhouse Sentinel does not exist. Its behavior, data, and interface are intentionally simple and invented. The repository exists to demonstrate documentation architecture, authoring, validation, CI, publishing, and multi-format delivery without confidential information.</w:t>
+        <w:t>Greenhouse Sentinel does not exist. Its behavior, data, and interface are intentionally simple and invented. The repository exists to demonstrate documentation architecture, authoring, validation, CI, publishing, and multi-format delivery without confidential information.</w:t>
       </w:r>
     </w:p>
     <w:p>
@@ -411,7 +395,7 @@
     </w:p>
     <w:p>
       <w:r>
-        <w:t xml:space="preserve">    The link text names the reader's problem instead of saying “click here.” The validator rejects common context-free labels and verifies the stable troubleshooting anchor. This makes the reference clearer in the page, a screen reader's links list, Word, and PDF.</w:t>
+        <w:t>The link text names the reader's problem instead of saying “click here.” The validator rejects common context-free labels and verifies the stable troubleshooting anchor. This makes the reference clearer in the page, a screen reader's links list, Word, and PDF.</w:t>
       </w:r>
     </w:p>
     <w:p>
@@ -602,7 +586,7 @@
     </w:p>
     <w:p>
       <w:r>
-        <w:t xml:space="preserve">    This source link points to </w:t>
+        <w:t xml:space="preserve">This source link points to </w:t>
       </w:r>
       <w:r>
         <w:rPr>
@@ -912,7 +896,7 @@
     </w:tbl>
     <w:p>
       <w:r>
-        <w:t xml:space="preserve">    This is a semantic Markdown table because the content has repeated, comparable fields. Zensical renders it responsively; the export script maps it to a real Word table with a header row. Ordinary explanatory prose remains outside tables for readability and accessibility.</w:t>
+        <w:t>This is a semantic Markdown table because the content has repeated, comparable fields. Zensical renders it responsively; the export script maps it to a real Word table with a header row. Ordinary explanatory prose remains outside tables for readability and accessibility.</w:t>
       </w:r>
     </w:p>
     <w:p>
@@ -1075,7 +1059,7 @@
     </w:p>
     <w:p>
       <w:r>
-        <w:t xml:space="preserve">    Troubleshooting the fictional dashboard never overrides physical greenhouse safety procedures.</w:t>
+        <w:t>Troubleshooting the fictional dashboard never overrides physical greenhouse safety procedures.</w:t>
       </w:r>
     </w:p>
     <w:p>

</xml_diff>

<commit_message>
Restart procedure numbering and include reviewed PDF
</commit_message>
<xml_diff>
--- a/deliverables/greenhouse-sentinel-handbook.docx
+++ b/deliverables/greenhouse-sentinel-handbook.docx
@@ -253,6 +253,10 @@
     <w:p>
       <w:pPr>
         <w:pStyle w:val="ListNumber"/>
+        <w:numPr>
+          <w:ilvl w:val="0"/>
+          <w:numId w:val="10"/>
+        </w:numPr>
       </w:pPr>
       <w:r>
         <w:t>Place the hub above the irrigation line and away from direct spray.</w:t>
@@ -450,6 +454,10 @@
     <w:p>
       <w:pPr>
         <w:pStyle w:val="ListNumber"/>
+        <w:numPr>
+          <w:ilvl w:val="0"/>
+          <w:numId w:val="11"/>
+        </w:numPr>
       </w:pPr>
       <w:r>
         <w:t>Confirm the dashboard timestamp is less than two minutes old.</w:t>
@@ -978,6 +986,10 @@
     <w:p>
       <w:pPr>
         <w:pStyle w:val="ListNumber"/>
+        <w:numPr>
+          <w:ilvl w:val="0"/>
+          <w:numId w:val="12"/>
+        </w:numPr>
       </w:pPr>
       <w:r>
         <w:t>Confirm the cable is fully seated and dry.</w:t>
@@ -1818,6 +1830,10 @@
     <w:p>
       <w:pPr>
         <w:pStyle w:val="ListNumber"/>
+        <w:numPr>
+          <w:ilvl w:val="0"/>
+          <w:numId w:val="13"/>
+        </w:numPr>
       </w:pPr>
       <w:r>
         <w:rPr>
@@ -2196,6 +2212,10 @@
     <w:p>
       <w:pPr>
         <w:pStyle w:val="ListNumber"/>
+        <w:numPr>
+          <w:ilvl w:val="0"/>
+          <w:numId w:val="14"/>
+        </w:numPr>
       </w:pPr>
       <w:r>
         <w:t xml:space="preserve">Open </w:t>
@@ -3244,6 +3264,36 @@
   </w:num>
   <w:num w:numId="9">
     <w:abstractNumId w:val="0"/>
+  </w:num>
+  <w:num w:numId="10">
+    <w:abstractNumId w:val="7"/>
+    <w:lvlOverride w:ilvl="0">
+      <w:startOverride w:val="1"/>
+    </w:lvlOverride>
+  </w:num>
+  <w:num w:numId="11">
+    <w:abstractNumId w:val="7"/>
+    <w:lvlOverride w:ilvl="0">
+      <w:startOverride w:val="1"/>
+    </w:lvlOverride>
+  </w:num>
+  <w:num w:numId="12">
+    <w:abstractNumId w:val="7"/>
+    <w:lvlOverride w:ilvl="0">
+      <w:startOverride w:val="1"/>
+    </w:lvlOverride>
+  </w:num>
+  <w:num w:numId="13">
+    <w:abstractNumId w:val="7"/>
+    <w:lvlOverride w:ilvl="0">
+      <w:startOverride w:val="1"/>
+    </w:lvlOverride>
+  </w:num>
+  <w:num w:numId="14">
+    <w:abstractNumId w:val="7"/>
+    <w:lvlOverride w:ilvl="0">
+      <w:startOverride w:val="1"/>
+    </w:lvlOverride>
   </w:num>
 </w:numbering>
 </file>

</xml_diff>

<commit_message>
Add numbered footers and title-case headings
</commit_message>
<xml_diff>
--- a/deliverables/greenhouse-sentinel-handbook.docx
+++ b/deliverables/greenhouse-sentinel-handbook.docx
@@ -19,7 +19,7 @@
           <w:color w:val="B45309"/>
           <w:sz w:val="30"/>
         </w:rPr>
-        <w:t>Product handbook and docs-as-code portfolio demonstration</w:t>
+        <w:t>Product Handbook and Docs-as-Code Portfolio Demonstration</w:t>
       </w:r>
     </w:p>
     <w:p>
@@ -37,7 +37,7 @@
         <w:pStyle w:val="Heading1"/>
       </w:pPr>
       <w:r>
-        <w:t>Greenhouse Sentinel</w:t>
+        <w:t>Greenhouse Sentinel Documentation Demo</w:t>
       </w:r>
     </w:p>
     <w:p>
@@ -50,7 +50,17 @@
     </w:p>
     <w:p>
       <w:r>
-        <w:t>Greenhouse Sentinel is a small controller that watches three environmental signals and recommends a response before plants are stressed. This site documents the fictional controller and, just as importantly, the docs-as-code system that publishes this site.</w:t>
+        <w:t xml:space="preserve">This is a public, self-documenting portfolio sample by </w:t>
+      </w:r>
+      <w:r>
+        <w:rPr>
+          <w:color w:val="075E54"/>
+          <w:u w:val="single"/>
+        </w:rPr>
+        <w:t>Katie Kearns</w:t>
+      </w:r>
+      <w:r>
+        <w:t>. Greenhouse Sentinel is a small fictional controller that watches three environmental signals and recommends a response before plants are stressed. Its limited scope makes the product documentation quick to understand while leaving enough structure to demonstrate a production-minded docs-as-code workflow.</w:t>
       </w:r>
     </w:p>
     <w:p>
@@ -76,12 +86,27 @@
         <w:pStyle w:val="Heading2"/>
       </w:pPr>
       <w:r>
-        <w:t>One source, several useful outputs</w:t>
-      </w:r>
-    </w:p>
-    <w:p>
-      <w:r>
-        <w:t>Authors write accessible Markdown. Automated checks verify navigation, internal links, anchors, and basic authoring rules. Zensical turns the reviewed source into this searchable site, and the export job creates Word and PDF versions for readers who need portable files.</w:t>
+        <w:t>Why This Demo Exists</w:t>
+      </w:r>
+    </w:p>
+    <w:p>
+      <w:r>
+        <w:t>This site is both a technical-writing sample and a reusable reference implementation. It shows how a documentation team can keep content reviewable in Git, publish a searchable site, customize presentation without rewriting source, detect broken navigation and cross-references, and generate portable Word and PDF deliverables.</w:t>
+      </w:r>
+    </w:p>
+    <w:p>
+      <w:r>
+        <w:t xml:space="preserve">Everything needed to evaluate the sample is documented on this site. The public </w:t>
+      </w:r>
+      <w:r>
+        <w:rPr>
+          <w:color w:val="075E54"/>
+          <w:u w:val="single"/>
+        </w:rPr>
+        <w:t>GitHub repository</w:t>
+      </w:r>
+      <w:r>
+        <w:t xml:space="preserve"> provides the source and commit history for reviewers who want to inspect the implementation.</w:t>
       </w:r>
     </w:p>
     <w:p>
@@ -89,7 +114,322 @@
         <w:pStyle w:val="Heading2"/>
       </w:pPr>
       <w:r>
-        <w:t>The fictional product in 30 seconds</w:t>
+        <w:t>One Source, Several Useful Outputs</w:t>
+      </w:r>
+    </w:p>
+    <w:p>
+      <w:r>
+        <w:t>Authors maintain one set of accessible Markdown files. Automated checks verify navigation, internal links, anchors, and basic authoring rules. The publishing workflow then generates three outputs from that same reviewed source:</w:t>
+      </w:r>
+    </w:p>
+    <w:p>
+      <w:pPr>
+        <w:pStyle w:val="ListNumber"/>
+        <w:numPr>
+          <w:ilvl w:val="0"/>
+          <w:numId w:val="10"/>
+        </w:numPr>
+      </w:pPr>
+      <w:r>
+        <w:t>this searchable Zensical site</w:t>
+      </w:r>
+    </w:p>
+    <w:p>
+      <w:pPr>
+        <w:pStyle w:val="ListNumber"/>
+      </w:pPr>
+      <w:r>
+        <w:t>a Microsoft Word handbook</w:t>
+      </w:r>
+    </w:p>
+    <w:p>
+      <w:pPr>
+        <w:pStyle w:val="ListNumber"/>
+      </w:pPr>
+      <w:r>
+        <w:t>a PDF handbook</w:t>
+      </w:r>
+    </w:p>
+    <w:p>
+      <w:r>
+        <w:t>The Word and PDF files are not separately maintained copies. When an approved Markdown change is merged, automation rebuilds all three outputs together.</w:t>
+      </w:r>
+    </w:p>
+    <w:p>
+      <w:r>
+        <w:rPr>
+          <w:color w:val="075E54"/>
+          <w:u w:val="single"/>
+        </w:rPr>
+        <w:t>Download the Word handbook</w:t>
+      </w:r>
+    </w:p>
+    <w:p>
+      <w:r>
+        <w:rPr>
+          <w:color w:val="075E54"/>
+          <w:u w:val="single"/>
+        </w:rPr>
+        <w:t>Download the PDF handbook</w:t>
+      </w:r>
+    </w:p>
+    <w:p>
+      <w:pPr>
+        <w:pStyle w:val="Heading2"/>
+      </w:pPr>
+      <w:r>
+        <w:t>What This Repository Demonstrates</w:t>
+      </w:r>
+    </w:p>
+    <w:p>
+      <w:pPr>
+        <w:pStyle w:val="ListBullet"/>
+      </w:pPr>
+      <w:r>
+        <w:rPr>
+          <w:b/>
+        </w:rPr>
+        <w:t>Single-source authoring:</w:t>
+      </w:r>
+      <w:r>
+        <w:t xml:space="preserve"> maintain content once in Markdown and generate the website, Word handbook, and PDF handbook together.</w:t>
+      </w:r>
+    </w:p>
+    <w:p>
+      <w:pPr>
+        <w:pStyle w:val="ListBullet"/>
+      </w:pPr>
+      <w:r>
+        <w:rPr>
+          <w:b/>
+        </w:rPr>
+        <w:t>Explicit navigation:</w:t>
+      </w:r>
+      <w:r>
+        <w:t xml:space="preserve"> control page order and grouping in </w:t>
+      </w:r>
+      <w:r>
+        <w:rPr>
+          <w:rFonts w:ascii="Consolas" w:hAnsi="Consolas"/>
+        </w:rPr>
+        <w:t>zensical.toml</w:t>
+      </w:r>
+      <w:r>
+        <w:t xml:space="preserve"> instead of relying on filenames.</w:t>
+      </w:r>
+    </w:p>
+    <w:p>
+      <w:pPr>
+        <w:pStyle w:val="ListBullet"/>
+      </w:pPr>
+      <w:r>
+        <w:rPr>
+          <w:b/>
+        </w:rPr>
+        <w:t>Stable cross-references:</w:t>
+      </w:r>
+      <w:r>
+        <w:t xml:space="preserve"> use deliberate anchors for important targets, as shown by </w:t>
+      </w:r>
+      <w:r>
+        <w:rPr>
+          <w:color w:val="075E54"/>
+          <w:u w:val="single"/>
+        </w:rPr>
+        <w:t>Decision states</w:t>
+      </w:r>
+      <w:r>
+        <w:t>.</w:t>
+      </w:r>
+    </w:p>
+    <w:p>
+      <w:pPr>
+        <w:pStyle w:val="ListBullet"/>
+      </w:pPr>
+      <w:r>
+        <w:rPr>
+          <w:b/>
+        </w:rPr>
+        <w:t>Automated validation:</w:t>
+      </w:r>
+      <w:r>
+        <w:t xml:space="preserve"> detect missing navigation entries, files, internal links, anchors, headings, and image text before publication.</w:t>
+      </w:r>
+    </w:p>
+    <w:p>
+      <w:pPr>
+        <w:pStyle w:val="ListBullet"/>
+      </w:pPr>
+      <w:r>
+        <w:rPr>
+          <w:b/>
+        </w:rPr>
+        <w:t>Continuous integration and publishing:</w:t>
+      </w:r>
+      <w:r>
+        <w:t xml:space="preserve"> run the same checks and builds for pull requests, then deploy approved changes through GitHub Actions.</w:t>
+      </w:r>
+    </w:p>
+    <w:p>
+      <w:pPr>
+        <w:pStyle w:val="ListBullet"/>
+      </w:pPr>
+      <w:r>
+        <w:rPr>
+          <w:b/>
+        </w:rPr>
+        <w:t>Accessible authoring:</w:t>
+      </w:r>
+      <w:r>
+        <w:t xml:space="preserve"> apply standards for headings, descriptive links, alternative text, tables, keyboard focus, readable sizing, zoom, and reduced motion.</w:t>
+      </w:r>
+    </w:p>
+    <w:p>
+      <w:pPr>
+        <w:pStyle w:val="ListBullet"/>
+      </w:pPr>
+      <w:r>
+        <w:rPr>
+          <w:b/>
+        </w:rPr>
+        <w:t>Replaceable branding:</w:t>
+      </w:r>
+      <w:r>
+        <w:t xml:space="preserve"> change logos, colors, typography, and presentation rules without rewriting the Markdown source.</w:t>
+      </w:r>
+    </w:p>
+    <w:p>
+      <w:pPr>
+        <w:pStyle w:val="ListBullet"/>
+      </w:pPr>
+      <w:r>
+        <w:rPr>
+          <w:b/>
+        </w:rPr>
+        <w:t>Multi-format delivery:</w:t>
+      </w:r>
+      <w:r>
+        <w:t xml:space="preserve"> publish searchable HTML plus downloadable Word and PDF files for different reading needs.</w:t>
+      </w:r>
+    </w:p>
+    <w:p>
+      <w:pPr>
+        <w:pStyle w:val="ListBullet"/>
+      </w:pPr>
+      <w:r>
+        <w:rPr>
+          <w:b/>
+        </w:rPr>
+        <w:t>Self-documentation:</w:t>
+      </w:r>
+      <w:r>
+        <w:t xml:space="preserve"> explain the architecture, authoring process, automation, construction steps, and release checks inside the artifact itself.</w:t>
+      </w:r>
+    </w:p>
+    <w:p>
+      <w:r>
+        <w:t xml:space="preserve">See </w:t>
+      </w:r>
+      <w:r>
+        <w:rPr>
+          <w:color w:val="075E54"/>
+          <w:u w:val="single"/>
+        </w:rPr>
+        <w:t>How this repository works</w:t>
+      </w:r>
+      <w:r>
+        <w:t xml:space="preserve"> for an inspectable example of each feature.</w:t>
+      </w:r>
+    </w:p>
+    <w:p>
+      <w:pPr>
+        <w:pStyle w:val="Heading2"/>
+      </w:pPr>
+      <w:r>
+        <w:t>Architecture at a Glance</w:t>
+      </w:r>
+    </w:p>
+    <w:p>
+      <w:pPr>
+        <w:pStyle w:val="Code"/>
+      </w:pPr>
+      <w:r>
+        <w:t>One reviewed Markdown source</w:t>
+      </w:r>
+    </w:p>
+    <w:p>
+      <w:pPr>
+        <w:pStyle w:val="Code"/>
+      </w:pPr>
+      <w:r>
+        <w:t xml:space="preserve">          |</w:t>
+      </w:r>
+    </w:p>
+    <w:p>
+      <w:pPr>
+        <w:pStyle w:val="Code"/>
+      </w:pPr>
+      <w:r>
+        <w:t xml:space="preserve">          +--&gt; validation --&gt; pull-request and release gates</w:t>
+      </w:r>
+    </w:p>
+    <w:p>
+      <w:pPr>
+        <w:pStyle w:val="Code"/>
+      </w:pPr>
+      <w:r>
+        <w:t xml:space="preserve">          |</w:t>
+      </w:r>
+    </w:p>
+    <w:p>
+      <w:pPr>
+        <w:pStyle w:val="Code"/>
+      </w:pPr>
+      <w:r>
+        <w:t xml:space="preserve">          +--&gt; Zensical --&gt; searchable HTML site</w:t>
+      </w:r>
+    </w:p>
+    <w:p>
+      <w:pPr>
+        <w:pStyle w:val="Code"/>
+      </w:pPr>
+      <w:r>
+        <w:t xml:space="preserve">          |</w:t>
+      </w:r>
+    </w:p>
+    <w:p>
+      <w:pPr>
+        <w:pStyle w:val="Code"/>
+      </w:pPr>
+      <w:r>
+        <w:t xml:space="preserve">          +--&gt; export script --&gt; Word handbook --&gt; PDF handbook</w:t>
+      </w:r>
+    </w:p>
+    <w:p>
+      <w:pPr>
+        <w:pStyle w:val="Code"/>
+      </w:pPr>
+      <w:r/>
+    </w:p>
+    <w:p>
+      <w:pPr>
+        <w:pStyle w:val="Code"/>
+      </w:pPr>
+      <w:r>
+        <w:t>Brand tokens change presentation without changing source meaning.</w:t>
+      </w:r>
+    </w:p>
+    <w:p>
+      <w:r>
+        <w:t>The renderer can change while the release requirements remain stable. Explicit navigation, valid links and anchors, accessible structure, reproducible builds, and reviewable changes remain required.</w:t>
+      </w:r>
+    </w:p>
+    <w:p>
+      <w:pPr>
+        <w:pStyle w:val="Heading2"/>
+      </w:pPr>
+      <w:r>
+        <w:t>The Fictional Product in 30 Seconds</w:t>
       </w:r>
     </w:p>
     <w:p>
@@ -134,7 +474,7 @@
         <w:pStyle w:val="Heading2"/>
       </w:pPr>
       <w:r>
-        <w:t>Explore both layers</w:t>
+        <w:t>What Is Included</w:t>
       </w:r>
     </w:p>
     <w:p>
@@ -142,7 +482,13 @@
         <w:pStyle w:val="ListBullet"/>
       </w:pPr>
       <w:r>
-        <w:t xml:space="preserve">Use the </w:t>
+        <w:rPr>
+          <w:b/>
+        </w:rPr>
+        <w:t>Product documentation</w:t>
+      </w:r>
+      <w:r>
+        <w:t xml:space="preserve"> proves the workflow can support task-based technical content. Start with the </w:t>
       </w:r>
       <w:r>
         <w:rPr>
@@ -152,7 +498,7 @@
         <w:t>quick start</w:t>
       </w:r>
       <w:r>
-        <w:t xml:space="preserve"> and </w:t>
+        <w:t xml:space="preserve">, </w:t>
       </w:r>
       <w:r>
         <w:rPr>
@@ -162,7 +508,17 @@
         <w:t>operating guide</w:t>
       </w:r>
       <w:r>
-        <w:t xml:space="preserve"> as if you were evaluating product documentation.</w:t>
+        <w:t xml:space="preserve">, and </w:t>
+      </w:r>
+      <w:r>
+        <w:rPr>
+          <w:color w:val="075E54"/>
+          <w:u w:val="single"/>
+        </w:rPr>
+        <w:t>architecture</w:t>
+      </w:r>
+      <w:r>
+        <w:t>.</w:t>
       </w:r>
     </w:p>
     <w:p>
@@ -170,7 +526,13 @@
         <w:pStyle w:val="ListBullet"/>
       </w:pPr>
       <w:r>
-        <w:t xml:space="preserve">Read </w:t>
+        <w:rPr>
+          <w:b/>
+        </w:rPr>
+        <w:t>Repository documentation</w:t>
+      </w:r>
+      <w:r>
+        <w:t xml:space="preserve"> reveals how the example is assembled and governed. Read </w:t>
       </w:r>
       <w:r>
         <w:rPr>
@@ -180,7 +542,17 @@
         <w:t>How this repository works</w:t>
       </w:r>
       <w:r>
-        <w:t xml:space="preserve"> to inspect the mechanics behind the site.</w:t>
+        <w:t xml:space="preserve"> and </w:t>
+      </w:r>
+      <w:r>
+        <w:rPr>
+          <w:color w:val="075E54"/>
+          <w:u w:val="single"/>
+        </w:rPr>
+        <w:t>Build it from scratch</w:t>
+      </w:r>
+      <w:r>
+        <w:t>.</w:t>
       </w:r>
     </w:p>
     <w:p>
@@ -188,7 +560,23 @@
         <w:pStyle w:val="ListBullet"/>
       </w:pPr>
       <w:r>
-        <w:t xml:space="preserve">Review the </w:t>
+        <w:rPr>
+          <w:b/>
+        </w:rPr>
+        <w:t>Contributor guidance</w:t>
+      </w:r>
+      <w:r>
+        <w:t xml:space="preserve"> makes quality expectations explicit and repeatable. Review the </w:t>
+      </w:r>
+      <w:r>
+        <w:rPr>
+          <w:color w:val="075E54"/>
+          <w:u w:val="single"/>
+        </w:rPr>
+        <w:t>writing guide</w:t>
+      </w:r>
+      <w:r>
+        <w:t xml:space="preserve">, </w:t>
       </w:r>
       <w:r>
         <w:rPr>
@@ -198,7 +586,7 @@
         <w:t>accessibility standard</w:t>
       </w:r>
       <w:r>
-        <w:t xml:space="preserve"> and </w:t>
+        <w:t xml:space="preserve">, and </w:t>
       </w:r>
       <w:r>
         <w:rPr>
@@ -208,7 +596,49 @@
         <w:t>release checklist</w:t>
       </w:r>
       <w:r>
-        <w:t xml:space="preserve"> to see how quality becomes part of the workflow.</w:t>
+        <w:t>.</w:t>
+      </w:r>
+    </w:p>
+    <w:p>
+      <w:pPr>
+        <w:pStyle w:val="ListBullet"/>
+      </w:pPr>
+      <w:r>
+        <w:rPr>
+          <w:b/>
+        </w:rPr>
+        <w:t>Generated deliverables</w:t>
+      </w:r>
+      <w:r>
+        <w:t xml:space="preserve"> prove that one reviewed source can support several channels. Use the Word and PDF download buttons above to inspect the portable versions.</w:t>
+      </w:r>
+    </w:p>
+    <w:p>
+      <w:pPr>
+        <w:pStyle w:val="Heading2"/>
+      </w:pPr>
+      <w:r>
+        <w:t>Public Portfolio Scope</w:t>
+      </w:r>
+    </w:p>
+    <w:p>
+      <w:r>
+        <w:t>All product names, specifications, incidents, commands, and workflows in this demonstration are invented. The repository contains no Peraton-specific, customer, proprietary, export-controlled, or classified information. “ThreatBoard-style” describes the general docs-as-code pattern demonstrated by this sample, not copied content or branding.</w:t>
+      </w:r>
+    </w:p>
+    <w:p>
+      <w:r>
+        <w:t xml:space="preserve">Katie Kearns created this sample as a technical-writing and documentation-systems portfolio project. The code and documentation are available under the </w:t>
+      </w:r>
+      <w:r>
+        <w:rPr>
+          <w:color w:val="075E54"/>
+          <w:u w:val="single"/>
+        </w:rPr>
+        <w:t>MIT License</w:t>
+      </w:r>
+      <w:r>
+        <w:t>.</w:t>
       </w:r>
     </w:p>
     <w:p>
@@ -221,12 +651,12 @@
         <w:pStyle w:val="Heading1"/>
       </w:pPr>
       <w:r>
-        <w:t>Quick start</w:t>
-      </w:r>
-    </w:p>
-    <w:p>
-      <w:r>
-        <w:t>This walkthrough connects a fictional Sentinel hub and confirms that its three sensors are reporting. No hardware is required; the commands are illustrative.</w:t>
+        <w:t>Quick Start</w:t>
+      </w:r>
+    </w:p>
+    <w:p>
+      <w:r>
+        <w:t>This walkthrough connects a fictional Sentinel hub and confirms that its three sensors are reporting. No hardware is required. The commands are illustrative.</w:t>
       </w:r>
     </w:p>
     <w:p>
@@ -234,7 +664,7 @@
         <w:pStyle w:val="Heading2"/>
       </w:pPr>
       <w:r>
-        <w:t>Before you begin</w:t>
+        <w:t>Before You Begin</w:t>
       </w:r>
     </w:p>
     <w:p>
@@ -247,7 +677,7 @@
         <w:pStyle w:val="Heading2"/>
       </w:pPr>
       <w:r>
-        <w:t>Connect and verify</w:t>
+        <w:t>Connect and Verify</w:t>
       </w:r>
     </w:p>
     <w:p>
@@ -255,7 +685,7 @@
         <w:pStyle w:val="ListNumber"/>
         <w:numPr>
           <w:ilvl w:val="0"/>
-          <w:numId w:val="10"/>
+          <w:numId w:val="11"/>
         </w:numPr>
       </w:pPr>
       <w:r>
@@ -355,7 +785,7 @@
         <w:pStyle w:val="Heading2"/>
       </w:pPr>
       <w:r>
-        <w:t>Understand the first result</w:t>
+        <w:t>Understand the First Result</w:t>
       </w:r>
     </w:p>
     <w:p>
@@ -407,7 +837,7 @@
         <w:pStyle w:val="Heading2"/>
       </w:pPr>
       <w:r>
-        <w:t>Next step</w:t>
+        <w:t>Next Step</w:t>
       </w:r>
     </w:p>
     <w:p>
@@ -435,7 +865,7 @@
         <w:pStyle w:val="Heading1"/>
       </w:pPr>
       <w:r>
-        <w:t>Operating guide</w:t>
+        <w:t>Operating Guide</w:t>
       </w:r>
     </w:p>
     <w:p>
@@ -448,7 +878,7 @@
         <w:pStyle w:val="Heading2"/>
       </w:pPr>
       <w:r>
-        <w:t>Daily check</w:t>
+        <w:t>Daily Check</w:t>
       </w:r>
     </w:p>
     <w:p>
@@ -456,7 +886,7 @@
         <w:pStyle w:val="ListNumber"/>
         <w:numPr>
           <w:ilvl w:val="0"/>
-          <w:numId w:val="11"/>
+          <w:numId w:val="12"/>
         </w:numPr>
       </w:pPr>
       <w:r>
@@ -500,7 +930,7 @@
         <w:pStyle w:val="Heading2"/>
       </w:pPr>
       <w:r>
-        <w:t>Respond to a state</w:t>
+        <w:t>Respond to a State</w:t>
       </w:r>
     </w:p>
     <w:p>
@@ -547,12 +977,12 @@
         <w:pStyle w:val="Heading2"/>
       </w:pPr>
       <w:r>
-        <w:t>Acknowledge an alert</w:t>
-      </w:r>
-    </w:p>
-    <w:p>
-      <w:r>
-        <w:t>Acknowledgement records that a person saw the alert; it does not change the sensor reading or decision state. Add a short note that states what you observed and what you did.</w:t>
+        <w:t>Acknowledge an Alert</w:t>
+      </w:r>
+    </w:p>
+    <w:p>
+      <w:r>
+        <w:t>Acknowledgement records that a person saw the alert. It does not change the sensor reading or decision state. Add a short note that states what you observed and what you did.</w:t>
       </w:r>
     </w:p>
     <w:p>
@@ -603,7 +1033,7 @@
         <w:t>architecture.md#decision-states</w:t>
       </w:r>
       <w:r>
-        <w:t xml:space="preserve">. The file path keeps the link useful in GitHub and other Markdown tools; Zensical rewrites it for the published site. The destination has an explicit </w:t>
+        <w:t xml:space="preserve">. The file path keeps the link useful in GitHub and other Markdown tools. Zensical rewrites it for the published site. The destination has an explicit </w:t>
       </w:r>
       <w:r>
         <w:rPr>
@@ -638,7 +1068,7 @@
         <w:pStyle w:val="Heading2"/>
       </w:pPr>
       <w:r>
-        <w:t>System boundary</w:t>
+        <w:t>System Boundary</w:t>
       </w:r>
     </w:p>
     <w:p>
@@ -739,7 +1169,7 @@
         <w:pStyle w:val="Heading2"/>
       </w:pPr>
       <w:r>
-        <w:t>Decision states</w:t>
+        <w:t>Decision States</w:t>
       </w:r>
     </w:p>
     <w:p>
@@ -904,7 +1334,7 @@
     </w:tbl>
     <w:p>
       <w:r>
-        <w:t>This is a semantic Markdown table because the content has repeated, comparable fields. Zensical renders it responsively; the export script maps it to a real Word table with a header row. Ordinary explanatory prose remains outside tables for readability and accessibility.</w:t>
+        <w:t>This is a semantic Markdown table because the content has repeated, comparable fields. Zensical renders it responsively. The export script maps it to a real Word table with a header row. Ordinary explanatory prose remains outside tables for readability and accessibility.</w:t>
       </w:r>
     </w:p>
     <w:p>
@@ -917,7 +1347,7 @@
         <w:pStyle w:val="Heading2"/>
       </w:pPr>
       <w:r>
-        <w:t>Data retention</w:t>
+        <w:t>Data Retention</w:t>
       </w:r>
     </w:p>
     <w:p>
@@ -930,7 +1360,7 @@
         <w:pStyle w:val="Heading2"/>
       </w:pPr>
       <w:r>
-        <w:t>Failure behavior</w:t>
+        <w:t>Failure Behavior</w:t>
       </w:r>
     </w:p>
     <w:p>
@@ -980,7 +1410,7 @@
         <w:pStyle w:val="Heading2"/>
       </w:pPr>
       <w:r>
-        <w:t>A sensor reports no data</w:t>
+        <w:t>A Sensor Reports No Data</w:t>
       </w:r>
     </w:p>
     <w:p>
@@ -988,7 +1418,7 @@
         <w:pStyle w:val="ListNumber"/>
         <w:numPr>
           <w:ilvl w:val="0"/>
-          <w:numId w:val="12"/>
+          <w:numId w:val="13"/>
         </w:numPr>
       </w:pPr>
       <w:r>
@@ -1029,7 +1459,7 @@
         <w:pStyle w:val="Heading2"/>
       </w:pPr>
       <w:r>
-        <w:t>The dashboard is unavailable</w:t>
+        <w:t>The Dashboard Is Unavailable</w:t>
       </w:r>
     </w:p>
     <w:p>
@@ -1051,7 +1481,7 @@
         <w:pStyle w:val="Heading2"/>
       </w:pPr>
       <w:r>
-        <w:t>A state seems incorrect</w:t>
+        <w:t>A State Seems Incorrect</w:t>
       </w:r>
     </w:p>
     <w:p>
@@ -1084,7 +1514,7 @@
         <w:pStyle w:val="Heading1"/>
       </w:pPr>
       <w:r>
-        <w:t>How this repository works</w:t>
+        <w:t>How This Repository Works</w:t>
       </w:r>
     </w:p>
     <w:p>
@@ -1112,7 +1542,7 @@
         <w:pStyle w:val="Heading2"/>
       </w:pPr>
       <w:r>
-        <w:t>Author once in Markdown</w:t>
+        <w:t>Author Once in Markdown</w:t>
       </w:r>
     </w:p>
     <w:p>
@@ -1126,7 +1556,7 @@
         <w:t>docs/</w:t>
       </w:r>
       <w:r>
-        <w:t>. Product guides and repository guidance use the same lightweight syntax, review process, and validation rules. Page titles use one level-one heading; sections follow a logical hierarchy; links remain relative so the content can move between renderers.</w:t>
+        <w:t>. Product guides and repository guidance use the same lightweight syntax, review process, and validation rules. Each page has one level-one heading. Sections follow a logical hierarchy. Relative links keep the content portable between source review and rendered output.</w:t>
       </w:r>
     </w:p>
     <w:p>
@@ -1134,7 +1564,324 @@
         <w:pStyle w:val="Heading2"/>
       </w:pPr>
       <w:r>
-        <w:t>Control the information architecture</w:t>
+        <w:t>Follow One Authoring Process</w:t>
+      </w:r>
+    </w:p>
+    <w:p>
+      <w:r>
+        <w:t>An author works with the Markdown source rather than editing the generated site, Word file, or PDF.</w:t>
+      </w:r>
+    </w:p>
+    <w:p>
+      <w:pPr>
+        <w:pStyle w:val="ListNumber"/>
+        <w:numPr>
+          <w:ilvl w:val="0"/>
+          <w:numId w:val="14"/>
+        </w:numPr>
+      </w:pPr>
+      <w:r>
+        <w:rPr>
+          <w:b/>
+        </w:rPr>
+        <w:t>Start with a reader need.</w:t>
+      </w:r>
+      <w:r>
+        <w:t xml:space="preserve"> Identify the task, question, or decision the page must support.</w:t>
+      </w:r>
+    </w:p>
+    <w:p>
+      <w:pPr>
+        <w:pStyle w:val="ListNumber"/>
+      </w:pPr>
+      <w:r>
+        <w:rPr>
+          <w:b/>
+        </w:rPr>
+        <w:t>Find the maintained source.</w:t>
+      </w:r>
+      <w:r>
+        <w:t xml:space="preserve"> Edit the existing Markdown page or create a focused new page under </w:t>
+      </w:r>
+      <w:r>
+        <w:rPr>
+          <w:rFonts w:ascii="Consolas" w:hAnsi="Consolas"/>
+        </w:rPr>
+        <w:t>docs/</w:t>
+      </w:r>
+      <w:r>
+        <w:t>.</w:t>
+      </w:r>
+    </w:p>
+    <w:p>
+      <w:pPr>
+        <w:pStyle w:val="ListNumber"/>
+      </w:pPr>
+      <w:r>
+        <w:rPr>
+          <w:b/>
+        </w:rPr>
+        <w:t>Write and connect the content.</w:t>
+      </w:r>
+      <w:r>
+        <w:t xml:space="preserve"> Use headings, descriptive relative links, stable anchors when needed, accessible tables, and verified examples.</w:t>
+      </w:r>
+    </w:p>
+    <w:p>
+      <w:pPr>
+        <w:pStyle w:val="ListNumber"/>
+      </w:pPr>
+      <w:r>
+        <w:rPr>
+          <w:b/>
+        </w:rPr>
+        <w:t>Run the local checks.</w:t>
+      </w:r>
+      <w:r>
+        <w:t xml:space="preserve"> The validator checks navigation, files, anchors, headings, image text, and link wording. Zensical builds a local preview from the same source.</w:t>
+      </w:r>
+    </w:p>
+    <w:p>
+      <w:pPr>
+        <w:pStyle w:val="ListNumber"/>
+      </w:pPr>
+      <w:r>
+        <w:rPr>
+          <w:b/>
+        </w:rPr>
+        <w:t>Review the rendered result.</w:t>
+      </w:r>
+      <w:r>
+        <w:t xml:space="preserve"> The author checks the page as a reader would, including navigation, responsive layout, keyboard behavior, and any generated Word or PDF pages affected by the change.</w:t>
+      </w:r>
+    </w:p>
+    <w:p>
+      <w:pPr>
+        <w:pStyle w:val="ListNumber"/>
+      </w:pPr>
+      <w:r>
+        <w:rPr>
+          <w:b/>
+        </w:rPr>
+        <w:t>Open a pull request.</w:t>
+      </w:r>
+      <w:r>
+        <w:t xml:space="preserve"> Reviewers see the exact source diff, the automated results, and the generated artifacts. They do not edit a separate Word copy.</w:t>
+      </w:r>
+    </w:p>
+    <w:p>
+      <w:pPr>
+        <w:pStyle w:val="ListNumber"/>
+      </w:pPr>
+      <w:r>
+        <w:rPr>
+          <w:b/>
+        </w:rPr>
+        <w:t>Merge the approved change.</w:t>
+      </w:r>
+      <w:r>
+        <w:t xml:space="preserve"> GitHub Actions repeats the checks, rebuilds every output, and publishes the live site from the accepted source.</w:t>
+      </w:r>
+    </w:p>
+    <w:p>
+      <w:r>
+        <w:t>The Markdown commit is the maintained record. The website, Word handbook, and PDF are outputs of that record.</w:t>
+      </w:r>
+    </w:p>
+    <w:p>
+      <w:pPr>
+        <w:pStyle w:val="Heading2"/>
+      </w:pPr>
+      <w:r>
+        <w:t>Divide Human and Automated Work</w:t>
+      </w:r>
+    </w:p>
+    <w:tbl>
+      <w:tblPr>
+        <w:tblW w:type="auto" w:w="0"/>
+        <w:tblLayout w:type="fixed"/>
+        <w:tblLook w:firstColumn="1" w:firstRow="1" w:lastColumn="0" w:lastRow="0" w:noHBand="0" w:noVBand="1" w:val="04A0"/>
+      </w:tblPr>
+      <w:tblGrid>
+        <w:gridCol w:w="4824"/>
+        <w:gridCol w:w="4824"/>
+      </w:tblGrid>
+      <w:tr>
+        <w:tc>
+          <w:tcPr>
+            <w:tcW w:type="dxa" w:w="4680"/>
+            <w:shd w:fill="075E54"/>
+          </w:tcPr>
+          <w:p>
+            <w:r>
+              <w:rPr>
+                <w:b/>
+                <w:color w:val="FFFFFF"/>
+              </w:rPr>
+              <w:t>Human judgment</w:t>
+            </w:r>
+          </w:p>
+        </w:tc>
+        <w:tc>
+          <w:tcPr>
+            <w:tcW w:type="dxa" w:w="4680"/>
+            <w:shd w:fill="075E54"/>
+          </w:tcPr>
+          <w:p>
+            <w:r>
+              <w:rPr>
+                <w:b/>
+                <w:color w:val="FFFFFF"/>
+              </w:rPr>
+              <w:t>Automated work</w:t>
+            </w:r>
+          </w:p>
+        </w:tc>
+      </w:tr>
+      <w:tr>
+        <w:tc>
+          <w:tcPr>
+            <w:tcW w:type="dxa" w:w="4680"/>
+          </w:tcPr>
+          <w:p>
+            <w:r>
+              <w:t>Decide what readers need and what belongs in scope</w:t>
+            </w:r>
+          </w:p>
+        </w:tc>
+        <w:tc>
+          <w:tcPr>
+            <w:tcW w:type="dxa" w:w="4680"/>
+          </w:tcPr>
+          <w:p>
+            <w:r>
+              <w:t>Confirm every configured navigation file exists</w:t>
+            </w:r>
+          </w:p>
+        </w:tc>
+      </w:tr>
+      <w:tr>
+        <w:tc>
+          <w:tcPr>
+            <w:tcW w:type="dxa" w:w="4680"/>
+          </w:tcPr>
+          <w:p>
+            <w:r>
+              <w:t>Verify technical meaning and release accuracy</w:t>
+            </w:r>
+          </w:p>
+        </w:tc>
+        <w:tc>
+          <w:tcPr>
+            <w:tcW w:type="dxa" w:w="4680"/>
+          </w:tcPr>
+          <w:p>
+            <w:r>
+              <w:t>Detect missing pages, files, links, and anchors</w:t>
+            </w:r>
+          </w:p>
+        </w:tc>
+      </w:tr>
+      <w:tr>
+        <w:tc>
+          <w:tcPr>
+            <w:tcW w:type="dxa" w:w="4680"/>
+          </w:tcPr>
+          <w:p>
+            <w:r>
+              <w:t>Write procedures, explanations, warnings, and troubleshooting guidance</w:t>
+            </w:r>
+          </w:p>
+        </w:tc>
+        <w:tc>
+          <w:tcPr>
+            <w:tcW w:type="dxa" w:w="4680"/>
+          </w:tcPr>
+          <w:p>
+            <w:r>
+              <w:t>Enforce basic heading, image-text, and link-label rules</w:t>
+            </w:r>
+          </w:p>
+        </w:tc>
+      </w:tr>
+      <w:tr>
+        <w:tc>
+          <w:tcPr>
+            <w:tcW w:type="dxa" w:w="4680"/>
+          </w:tcPr>
+          <w:p>
+            <w:r>
+              <w:t>Decide whether a table, note, example, or cross-reference helps</w:t>
+            </w:r>
+          </w:p>
+        </w:tc>
+        <w:tc>
+          <w:tcPr>
+            <w:tcW w:type="dxa" w:w="4680"/>
+          </w:tcPr>
+          <w:p>
+            <w:r>
+              <w:t>Build the Zensical HTML site from Markdown</w:t>
+            </w:r>
+          </w:p>
+        </w:tc>
+      </w:tr>
+      <w:tr>
+        <w:tc>
+          <w:tcPr>
+            <w:tcW w:type="dxa" w:w="4680"/>
+          </w:tcPr>
+          <w:p>
+            <w:r>
+              <w:t>Review accessibility, usability, and visual quality</w:t>
+            </w:r>
+          </w:p>
+        </w:tc>
+        <w:tc>
+          <w:tcPr>
+            <w:tcW w:type="dxa" w:w="4680"/>
+          </w:tcPr>
+          <w:p>
+            <w:r>
+              <w:t>Generate the Word handbook and convert it to PDF</w:t>
+            </w:r>
+          </w:p>
+        </w:tc>
+      </w:tr>
+      <w:tr>
+        <w:tc>
+          <w:tcPr>
+            <w:tcW w:type="dxa" w:w="4680"/>
+          </w:tcPr>
+          <w:p>
+            <w:r>
+              <w:t>Approve the change</w:t>
+            </w:r>
+          </w:p>
+        </w:tc>
+        <w:tc>
+          <w:tcPr>
+            <w:tcW w:type="dxa" w:w="4680"/>
+          </w:tcPr>
+          <w:p>
+            <w:r>
+              <w:t>Check that expected artifacts exist and deploy the site</w:t>
+            </w:r>
+          </w:p>
+        </w:tc>
+      </w:tr>
+    </w:tbl>
+    <w:p>
+      <w:r>
+        <w:t>Automation handles repeatable questions with objective answers. Authors and reviewers remain responsible for accuracy, usefulness, safety, and clarity.</w:t>
+      </w:r>
+    </w:p>
+    <w:p>
+      <w:pPr>
+        <w:pStyle w:val="Heading2"/>
+      </w:pPr>
+      <w:r>
+        <w:t>Control the Information Architecture</w:t>
       </w:r>
     </w:p>
     <w:p>
@@ -1162,7 +1909,7 @@
         <w:pStyle w:val="Heading2"/>
       </w:pPr>
       <w:r>
-        <w:t>Keep cross-references stable</w:t>
+        <w:t>Keep Cross-References Stable</w:t>
       </w:r>
     </w:p>
     <w:p>
@@ -1217,7 +1964,7 @@
         <w:pStyle w:val="Heading2"/>
       </w:pPr>
       <w:r>
-        <w:t>See each authoring feature work</w:t>
+        <w:t>See Each Authoring Feature Work</w:t>
       </w:r>
     </w:p>
     <w:p>
@@ -1240,7 +1987,7 @@
         <w:t>architecture.md#decision-states</w:t>
       </w:r>
       <w:r>
-        <w:t>; the explicit anchor is stable and validated.</w:t>
+        <w:t>. The explicit anchor is stable and validated.</w:t>
       </w:r>
     </w:p>
     <w:p>
@@ -1268,7 +2015,7 @@
         <w:t>Semantic table:</w:t>
       </w:r>
       <w:r>
-        <w:t xml:space="preserve"> the architecture page uses a table only for repeated state, condition, and expectation fields; exports preserve the header relationship.</w:t>
+        <w:t xml:space="preserve"> the architecture page uses a table only for repeated state, condition, and expectation fields. Exports preserve the header relationship.</w:t>
       </w:r>
     </w:p>
     <w:p>
@@ -1305,7 +2052,7 @@
         <w:t>Code block:</w:t>
       </w:r>
       <w:r>
-        <w:t xml:space="preserve"> fenced blocks preserve commands and sample output; the site adds copy support and the Word export applies a monospaced style.</w:t>
+        <w:t xml:space="preserve"> fenced blocks preserve commands and sample output. The site adds copy support, and the Word export applies a monospaced style.</w:t>
       </w:r>
     </w:p>
     <w:p>
@@ -1328,7 +2075,7 @@
         <w:t>zensical.toml</w:t>
       </w:r>
       <w:r>
-        <w:t xml:space="preserve"> controls order and labels; the validator detects both missing targets and unlisted pages.</w:t>
+        <w:t xml:space="preserve"> controls order and labels. The validator detects both missing targets and unlisted pages.</w:t>
       </w:r>
     </w:p>
     <w:p>
@@ -1364,7 +2111,7 @@
         <w:pStyle w:val="Heading2"/>
       </w:pPr>
       <w:r>
-        <w:t>Separate content from presentation</w:t>
+        <w:t>Separate Content from Presentation</w:t>
       </w:r>
     </w:p>
     <w:p>
@@ -1372,7 +2119,7 @@
         <w:rPr>
           <w:rFonts w:ascii="Consolas" w:hAnsi="Consolas"/>
         </w:rPr>
-        <w:t>docs/assets/stylesheets/brand.css</w:t>
+        <w:t>docs/assets/stylesheets/brand-2026.css</w:t>
       </w:r>
       <w:r>
         <w:t xml:space="preserve"> defines brand tokens and a small set of presentation rules. </w:t>
@@ -1402,7 +2149,7 @@
         <w:pStyle w:val="Heading2"/>
       </w:pPr>
       <w:r>
-        <w:t>Validate before rendering</w:t>
+        <w:t>Validate Before Rendering</w:t>
       </w:r>
     </w:p>
     <w:p>
@@ -1421,7 +2168,7 @@
         <w:pStyle w:val="ListBullet"/>
       </w:pPr>
       <w:r>
-        <w:t>every configured navigation target exists;</w:t>
+        <w:t>every configured navigation target exists</w:t>
       </w:r>
     </w:p>
     <w:p>
@@ -1429,7 +2176,7 @@
         <w:pStyle w:val="ListBullet"/>
       </w:pPr>
       <w:r>
-        <w:t>every maintained Markdown page appears in navigation;</w:t>
+        <w:t>every maintained Markdown page appears in navigation</w:t>
       </w:r>
     </w:p>
     <w:p>
@@ -1437,7 +2184,7 @@
         <w:pStyle w:val="ListBullet"/>
       </w:pPr>
       <w:r>
-        <w:t>internal files and anchors resolve;</w:t>
+        <w:t>internal files and anchors resolve</w:t>
       </w:r>
     </w:p>
     <w:p>
@@ -1445,7 +2192,7 @@
         <w:pStyle w:val="ListBullet"/>
       </w:pPr>
       <w:r>
-        <w:t>each page has exactly one level-one heading;</w:t>
+        <w:t>each page has exactly one level-one heading</w:t>
       </w:r>
     </w:p>
     <w:p>
@@ -1453,7 +2200,7 @@
         <w:pStyle w:val="ListBullet"/>
       </w:pPr>
       <w:r>
-        <w:t>images have useful alternative text; and</w:t>
+        <w:t>images have useful alternative text</w:t>
       </w:r>
     </w:p>
     <w:p>
@@ -1480,7 +2227,7 @@
         <w:pStyle w:val="Heading2"/>
       </w:pPr>
       <w:r>
-        <w:t>Build and review automatically</w:t>
+        <w:t>Build and Review Automatically</w:t>
       </w:r>
     </w:p>
     <w:p>
@@ -1499,7 +2246,7 @@
         <w:pStyle w:val="Heading2"/>
       </w:pPr>
       <w:r>
-        <w:t>Publish several channels</w:t>
+        <w:t>Publish Several Channels</w:t>
       </w:r>
     </w:p>
     <w:p>
@@ -1513,7 +2260,16 @@
         <w:t>scripts/export_handbook.py</w:t>
       </w:r>
       <w:r>
-        <w:t xml:space="preserve"> assembles the same maintained Markdown into a styled Word handbook. CI converts that Word file to PDF. These are publishing transformations, not separate authoring silos.</w:t>
+        <w:t xml:space="preserve"> assembles the same maintained Markdown into a styled Word handbook with a </w:t>
+      </w:r>
+      <w:r>
+        <w:rPr>
+          <w:b/>
+        </w:rPr>
+        <w:t>Page X of Y</w:t>
+      </w:r>
+      <w:r>
+        <w:t xml:space="preserve"> footer. CI converts that Word file to PDF and preserves the footer numbers. These are publishing transformations, not separate authoring silos.</w:t>
       </w:r>
     </w:p>
     <w:p>
@@ -1521,7 +2277,7 @@
         <w:pStyle w:val="Heading2"/>
       </w:pPr>
       <w:r>
-        <w:t>Treat accessibility as an authoring constraint</w:t>
+        <w:t>Treat Accessibility as an Authoring Constraint</w:t>
       </w:r>
     </w:p>
     <w:p>
@@ -1544,7 +2300,7 @@
         <w:pStyle w:val="Heading2"/>
       </w:pPr>
       <w:r>
-        <w:t>Release with evidence</w:t>
+        <w:t>Release with Evidence</w:t>
       </w:r>
     </w:p>
     <w:p>
@@ -1572,7 +2328,7 @@
         <w:pStyle w:val="Heading1"/>
       </w:pPr>
       <w:r>
-        <w:t>Build it from scratch</w:t>
+        <w:t>Build It from Scratch</w:t>
       </w:r>
     </w:p>
     <w:p>
@@ -1585,7 +2341,7 @@
         <w:pStyle w:val="Heading2"/>
       </w:pPr>
       <w:r>
-        <w:t>1. Define the public boundary</w:t>
+        <w:t>1. Define the Public Boundary</w:t>
       </w:r>
     </w:p>
     <w:p>
@@ -1598,7 +2354,7 @@
         <w:pStyle w:val="Heading2"/>
       </w:pPr>
       <w:r>
-        <w:t>2. Create an independent repository</w:t>
+        <w:t>2. Create an Independent Repository</w:t>
       </w:r>
     </w:p>
     <w:p>
@@ -1730,7 +2486,7 @@
         <w:pStyle w:val="Heading2"/>
       </w:pPr>
       <w:r>
-        <w:t>3. Design the information architecture</w:t>
+        <w:t>3. Design the Information Architecture</w:t>
       </w:r>
     </w:p>
     <w:p>
@@ -1788,7 +2544,7 @@
         <w:pStyle w:val="Heading2"/>
       </w:pPr>
       <w:r>
-        <w:t>4. Configure the renderer</w:t>
+        <w:t>4. Configure the Renderer</w:t>
       </w:r>
     </w:p>
     <w:p>
@@ -1819,7 +2575,7 @@
         <w:pStyle w:val="Heading2"/>
       </w:pPr>
       <w:r>
-        <w:t>5. Write a thin but complete product set</w:t>
+        <w:t>5. Write a Thin but Complete Product Set</w:t>
       </w:r>
     </w:p>
     <w:p>
@@ -1832,7 +2588,7 @@
         <w:pStyle w:val="ListNumber"/>
         <w:numPr>
           <w:ilvl w:val="0"/>
-          <w:numId w:val="13"/>
+          <w:numId w:val="15"/>
         </w:numPr>
       </w:pPr>
       <w:r>
@@ -1897,7 +2653,7 @@
         <w:pStyle w:val="Heading2"/>
       </w:pPr>
       <w:r>
-        <w:t>6. Add stable cross-references</w:t>
+        <w:t>6. Add Stable Cross-References</w:t>
       </w:r>
     </w:p>
     <w:p>
@@ -1918,7 +2674,7 @@
         <w:pStyle w:val="Code"/>
       </w:pPr>
       <w:r>
-        <w:t>## Decision states</w:t>
+        <w:t>## Decision States</w:t>
       </w:r>
     </w:p>
     <w:p>
@@ -1958,7 +2714,7 @@
         <w:pStyle w:val="Heading2"/>
       </w:pPr>
       <w:r>
-        <w:t>7. Build independent validation</w:t>
+        <w:t>7. Build Independent Validation</w:t>
       </w:r>
     </w:p>
     <w:p>
@@ -1994,7 +2750,7 @@
         <w:pStyle w:val="Heading2"/>
       </w:pPr>
       <w:r>
-        <w:t>8. Add replaceable branding</w:t>
+        <w:t>8. Add Replaceable Branding</w:t>
       </w:r>
     </w:p>
     <w:p>
@@ -2005,7 +2761,7 @@
         <w:rPr>
           <w:rFonts w:ascii="Consolas" w:hAnsi="Consolas"/>
         </w:rPr>
-        <w:t>docs/assets/stylesheets/brand.css</w:t>
+        <w:t>docs/assets/stylesheets/brand-2026.css</w:t>
       </w:r>
       <w:r>
         <w:t xml:space="preserve"> with purpose-based tokens for primary, accent, surface, text, focus, and radius values. Add a compact accessible SVG mark. Use the tokens for visible focus, mobile button stacking, readable line lengths, and reduced-motion behavior. Do not place brand decisions in Markdown.</w:t>
@@ -2016,7 +2772,7 @@
         <w:pStyle w:val="Heading2"/>
       </w:pPr>
       <w:r>
-        <w:t>9. Generate Word from reviewed source</w:t>
+        <w:t>9. Generate Word from Reviewed Source</w:t>
       </w:r>
     </w:p>
     <w:p>
@@ -2030,7 +2786,34 @@
         <w:t>scripts/export_handbook.py</w:t>
       </w:r>
       <w:r>
-        <w:t>. Read the same navigation list as the site and process pages in that order. Map Markdown headings to real Word heading styles, sequences and bullets to list styles, code to a monospaced style, and Markdown tables to Word tables. Apply explicit page geometry, typography, spacing, colors, footer text, and public document properties.</w:t>
+        <w:t xml:space="preserve">. Read the same navigation list as the site and process pages in that order. Map Markdown headings to real Word heading styles, sequences and bullets to list styles, code to a monospaced style, and Markdown tables to Word tables. Apply explicit page geometry, typography, spacing, colors, public document properties, and dynamic </w:t>
+      </w:r>
+      <w:r>
+        <w:rPr>
+          <w:rFonts w:ascii="Consolas" w:hAnsi="Consolas"/>
+        </w:rPr>
+        <w:t>PAGE</w:t>
+      </w:r>
+      <w:r>
+        <w:t xml:space="preserve"> and </w:t>
+      </w:r>
+      <w:r>
+        <w:rPr>
+          <w:rFonts w:ascii="Consolas" w:hAnsi="Consolas"/>
+        </w:rPr>
+        <w:t>NUMPAGES</w:t>
+      </w:r>
+      <w:r>
+        <w:t xml:space="preserve"> footer fields so every page displays </w:t>
+      </w:r>
+      <w:r>
+        <w:rPr>
+          <w:b/>
+        </w:rPr>
+        <w:t>Page X of Y</w:t>
+      </w:r>
+      <w:r>
+        <w:t>.</w:t>
       </w:r>
     </w:p>
     <w:p>
@@ -2043,7 +2826,7 @@
     </w:p>
     <w:p>
       <w:r>
-        <w:t>In CI, convert the Word handbook with headless LibreOffice. Check that Word and PDF files exist and are non-empty. Render every page to images for visual review; inspect for clipping, overlap, broken tables, awkward breaks, missing glyphs, headers, and footers.</w:t>
+        <w:t>In CI, convert the Word handbook with headless LibreOffice. Check that Word and PDF files exist and are non-empty. Render every page to images for visual review. Inspect the pages for clipping, overlap, broken tables, awkward breaks, missing glyphs, misplaced page furniture, and correct footer page numbers.</w:t>
       </w:r>
     </w:p>
     <w:p>
@@ -2051,7 +2834,7 @@
         <w:pStyle w:val="Heading2"/>
       </w:pPr>
       <w:r>
-        <w:t>11. Automate the workflow</w:t>
+        <w:t>11. Automate the Workflow</w:t>
       </w:r>
     </w:p>
     <w:p>
@@ -2065,7 +2848,123 @@
         <w:t>.github/workflows/docs.yml</w:t>
       </w:r>
       <w:r>
-        <w:t xml:space="preserve"> for pushes, pull requests, and manual runs. The job checks out the repo, installs pinned dependencies, runs independent validation, requests a strict Zensical build, generates Word and PDF, checks artifacts, and uploads the site plus portable files for review.</w:t>
+        <w:t xml:space="preserve"> for pushes, pull requests, and manual runs. The workflow automates the mechanical publishing sequence:</w:t>
+      </w:r>
+    </w:p>
+    <w:p>
+      <w:pPr>
+        <w:pStyle w:val="ListNumber"/>
+        <w:numPr>
+          <w:ilvl w:val="0"/>
+          <w:numId w:val="16"/>
+        </w:numPr>
+      </w:pPr>
+      <w:r>
+        <w:t>Check out the exact Git commit under review.</w:t>
+      </w:r>
+    </w:p>
+    <w:p>
+      <w:pPr>
+        <w:pStyle w:val="ListNumber"/>
+      </w:pPr>
+      <w:r>
+        <w:t>Install the dependency versions pinned by the repository.</w:t>
+      </w:r>
+    </w:p>
+    <w:p>
+      <w:pPr>
+        <w:pStyle w:val="ListNumber"/>
+      </w:pPr>
+      <w:r>
+        <w:t xml:space="preserve">Run </w:t>
+      </w:r>
+      <w:r>
+        <w:rPr>
+          <w:rFonts w:ascii="Consolas" w:hAnsi="Consolas"/>
+        </w:rPr>
+        <w:t>scripts/validate_docs.py</w:t>
+      </w:r>
+      <w:r>
+        <w:t xml:space="preserve"> against the Markdown and navigation configuration.</w:t>
+      </w:r>
+    </w:p>
+    <w:p>
+      <w:pPr>
+        <w:pStyle w:val="ListNumber"/>
+      </w:pPr>
+      <w:r>
+        <w:t>Build the complete Zensical site from the reviewed source.</w:t>
+      </w:r>
+    </w:p>
+    <w:p>
+      <w:pPr>
+        <w:pStyle w:val="ListNumber"/>
+      </w:pPr>
+      <w:r>
+        <w:t xml:space="preserve">Run </w:t>
+      </w:r>
+      <w:r>
+        <w:rPr>
+          <w:rFonts w:ascii="Consolas" w:hAnsi="Consolas"/>
+        </w:rPr>
+        <w:t>scripts/export_handbook.py</w:t>
+      </w:r>
+      <w:r>
+        <w:t xml:space="preserve"> to assemble the Markdown pages in explicit navigation order.</w:t>
+      </w:r>
+    </w:p>
+    <w:p>
+      <w:pPr>
+        <w:pStyle w:val="ListNumber"/>
+      </w:pPr>
+      <w:r>
+        <w:t>Create the Word handbook with real heading, list, table, and document styles.</w:t>
+      </w:r>
+    </w:p>
+    <w:p>
+      <w:pPr>
+        <w:pStyle w:val="ListNumber"/>
+      </w:pPr>
+      <w:r>
+        <w:t>Convert the Word handbook to PDF with headless LibreOffice.</w:t>
+      </w:r>
+    </w:p>
+    <w:p>
+      <w:pPr>
+        <w:pStyle w:val="ListNumber"/>
+      </w:pPr>
+      <w:r>
+        <w:t>Confirm that the site, Word file, and PDF exist and are non-empty.</w:t>
+      </w:r>
+    </w:p>
+    <w:p>
+      <w:pPr>
+        <w:pStyle w:val="ListNumber"/>
+      </w:pPr>
+      <w:r>
+        <w:t>Upload the site and portable files as reviewable build artifacts.</w:t>
+      </w:r>
+    </w:p>
+    <w:p>
+      <w:pPr>
+        <w:pStyle w:val="ListNumber"/>
+      </w:pPr>
+      <w:r>
+        <w:t xml:space="preserve">On the </w:t>
+      </w:r>
+      <w:r>
+        <w:rPr>
+          <w:rFonts w:ascii="Consolas" w:hAnsi="Consolas"/>
+        </w:rPr>
+        <w:t>main</w:t>
+      </w:r>
+      <w:r>
+        <w:t xml:space="preserve"> branch, upload the site to GitHub Pages and deploy the live URL.</w:t>
+      </w:r>
+    </w:p>
+    <w:p>
+      <w:r>
+        <w:t>The workflow does not decide whether an explanation is correct or whether a procedure is useful. Those decisions remain with the author and reviewers. Automation answers repeatable questions such as whether a target exists, whether the build succeeds, and whether all expected outputs were produced.</w:t>
       </w:r>
     </w:p>
     <w:p>
@@ -2078,7 +2977,7 @@
         <w:pStyle w:val="Heading2"/>
       </w:pPr>
       <w:r>
-        <w:t>12. Test the site</w:t>
+        <w:t>12. Test the Site</w:t>
       </w:r>
     </w:p>
     <w:p>
@@ -2109,7 +3008,7 @@
         <w:pStyle w:val="Heading2"/>
       </w:pPr>
       <w:r>
-        <w:t>13. Review for public release</w:t>
+        <w:t>13. Review for Public Release</w:t>
       </w:r>
     </w:p>
     <w:p>
@@ -2122,7 +3021,7 @@
         <w:pStyle w:val="Heading2"/>
       </w:pPr>
       <w:r>
-        <w:t>14. Publish the GitHub repository</w:t>
+        <w:t>14. Publish the GitHub Repository</w:t>
       </w:r>
     </w:p>
     <w:p>
@@ -2162,7 +3061,7 @@
         <w:pStyle w:val="Heading2"/>
       </w:pPr>
       <w:r>
-        <w:t>15. Link from the portfolio</w:t>
+        <w:t>15. Link from the Portfolio</w:t>
       </w:r>
     </w:p>
     <w:p>
@@ -2175,38 +3074,20 @@
         <w:pStyle w:val="Heading2"/>
       </w:pPr>
       <w:r>
-        <w:t>16. Update and release</w:t>
-      </w:r>
-    </w:p>
-    <w:p>
-      <w:r>
-        <w:t>For every change: edit the isolated source or presentation layer, add new pages to navigation, validate, build, regenerate portable outputs, complete proportional editorial/accessibility/responsive QA, open a focused pull request, and merge only after CI and review pass.</w:t>
-      </w:r>
-    </w:p>
-    <w:p>
-      <w:r>
-        <w:br w:type="page"/>
-      </w:r>
-    </w:p>
-    <w:p>
-      <w:pPr>
-        <w:pStyle w:val="Heading1"/>
-      </w:pPr>
-      <w:r>
-        <w:t>Branding</w:t>
-      </w:r>
-    </w:p>
-    <w:p>
-      <w:r>
-        <w:t>Branding belongs in the publishing layer. The source should still make sense as plain Markdown, in GitHub preview, in Word, and in a different web theme.</w:t>
-      </w:r>
-    </w:p>
-    <w:p>
-      <w:pPr>
-        <w:pStyle w:val="Heading2"/>
-      </w:pPr>
-      <w:r>
-        <w:t>Five-minute rebrand</w:t>
+        <w:t>16. Update and Release</w:t>
+      </w:r>
+    </w:p>
+    <w:p>
+      <w:r>
+        <w:t>The normal authoring cycle is smaller than the initial repository setup.</w:t>
+      </w:r>
+    </w:p>
+    <w:p>
+      <w:pPr>
+        <w:pStyle w:val="Heading3"/>
+      </w:pPr>
+      <w:r>
+        <w:t>Author the Change</w:t>
       </w:r>
     </w:p>
     <w:p>
@@ -2214,17 +3095,249 @@
         <w:pStyle w:val="ListNumber"/>
         <w:numPr>
           <w:ilvl w:val="0"/>
-          <w:numId w:val="14"/>
+          <w:numId w:val="17"/>
         </w:numPr>
       </w:pPr>
       <w:r>
-        <w:t xml:space="preserve">Open </w:t>
+        <w:t>Start with a reader problem or a verified product change.</w:t>
+      </w:r>
+    </w:p>
+    <w:p>
+      <w:pPr>
+        <w:pStyle w:val="ListNumber"/>
+      </w:pPr>
+      <w:r>
+        <w:t xml:space="preserve">Edit the relevant Markdown under </w:t>
       </w:r>
       <w:r>
         <w:rPr>
           <w:rFonts w:ascii="Consolas" w:hAnsi="Consolas"/>
         </w:rPr>
-        <w:t>docs/assets/stylesheets/brand.css</w:t>
+        <w:t>docs/</w:t>
+      </w:r>
+      <w:r>
+        <w:t xml:space="preserve">. Do not edit </w:t>
+      </w:r>
+      <w:r>
+        <w:rPr>
+          <w:rFonts w:ascii="Consolas" w:hAnsi="Consolas"/>
+        </w:rPr>
+        <w:t>site/</w:t>
+      </w:r>
+      <w:r>
+        <w:t>, Word, or PDF because those files are generated outputs.</w:t>
+      </w:r>
+    </w:p>
+    <w:p>
+      <w:pPr>
+        <w:pStyle w:val="ListNumber"/>
+      </w:pPr>
+      <w:r>
+        <w:t xml:space="preserve">Add a new page to </w:t>
+      </w:r>
+      <w:r>
+        <w:rPr>
+          <w:rFonts w:ascii="Consolas" w:hAnsi="Consolas"/>
+        </w:rPr>
+        <w:t>zensical.toml</w:t>
+      </w:r>
+      <w:r>
+        <w:t xml:space="preserve"> when the change introduces a new topic.</w:t>
+      </w:r>
+    </w:p>
+    <w:p>
+      <w:pPr>
+        <w:pStyle w:val="ListNumber"/>
+      </w:pPr>
+      <w:r>
+        <w:t>Add or update relative links and stable anchors when other pages depend on the content.</w:t>
+      </w:r>
+    </w:p>
+    <w:p>
+      <w:pPr>
+        <w:pStyle w:val="ListNumber"/>
+      </w:pPr>
+      <w:r>
+        <w:t>Keep branding changes in the stylesheet, logo asset, or publishing configuration.</w:t>
+      </w:r>
+    </w:p>
+    <w:p>
+      <w:pPr>
+        <w:pStyle w:val="Heading3"/>
+      </w:pPr>
+      <w:r>
+        <w:t>Check the Change Locally</w:t>
+      </w:r>
+    </w:p>
+    <w:p>
+      <w:pPr>
+        <w:pStyle w:val="ListNumber"/>
+        <w:numPr>
+          <w:ilvl w:val="0"/>
+          <w:numId w:val="18"/>
+        </w:numPr>
+      </w:pPr>
+      <w:r>
+        <w:t xml:space="preserve">Run </w:t>
+      </w:r>
+      <w:r>
+        <w:rPr>
+          <w:rFonts w:ascii="Consolas" w:hAnsi="Consolas"/>
+        </w:rPr>
+        <w:t>python scripts/validate_docs.py</w:t>
+      </w:r>
+      <w:r>
+        <w:t>.</w:t>
+      </w:r>
+    </w:p>
+    <w:p>
+      <w:pPr>
+        <w:pStyle w:val="ListNumber"/>
+      </w:pPr>
+      <w:r>
+        <w:t>Build or serve the Zensical site.</w:t>
+      </w:r>
+    </w:p>
+    <w:p>
+      <w:pPr>
+        <w:pStyle w:val="ListNumber"/>
+      </w:pPr>
+      <w:r>
+        <w:t>Read the rendered page in context, not only the source diff.</w:t>
+      </w:r>
+    </w:p>
+    <w:p>
+      <w:pPr>
+        <w:pStyle w:val="ListNumber"/>
+      </w:pPr>
+      <w:r>
+        <w:t>Regenerate Word and PDF when the change affects portable output.</w:t>
+      </w:r>
+    </w:p>
+    <w:p>
+      <w:pPr>
+        <w:pStyle w:val="ListNumber"/>
+      </w:pPr>
+      <w:r>
+        <w:t>Complete editorial, accessibility, responsive, and generated-file review in proportion to the risk of the change.</w:t>
+      </w:r>
+    </w:p>
+    <w:p>
+      <w:pPr>
+        <w:pStyle w:val="Heading3"/>
+      </w:pPr>
+      <w:r>
+        <w:t>Review and Publish</w:t>
+      </w:r>
+    </w:p>
+    <w:p>
+      <w:pPr>
+        <w:pStyle w:val="ListNumber"/>
+        <w:numPr>
+          <w:ilvl w:val="0"/>
+          <w:numId w:val="19"/>
+        </w:numPr>
+      </w:pPr>
+      <w:r>
+        <w:t>Commit only the intended source and configuration changes.</w:t>
+      </w:r>
+    </w:p>
+    <w:p>
+      <w:pPr>
+        <w:pStyle w:val="ListNumber"/>
+      </w:pPr>
+      <w:r>
+        <w:t>Open a focused pull request that explains the reader need and the checks performed.</w:t>
+      </w:r>
+    </w:p>
+    <w:p>
+      <w:pPr>
+        <w:pStyle w:val="ListNumber"/>
+      </w:pPr>
+      <w:r>
+        <w:t>Let CI repeat validation and generate review artifacts from a clean environment.</w:t>
+      </w:r>
+    </w:p>
+    <w:p>
+      <w:pPr>
+        <w:pStyle w:val="ListNumber"/>
+      </w:pPr>
+      <w:r>
+        <w:t>Have the appropriate people review technical meaning, writing quality, accessibility, and presentation.</w:t>
+      </w:r>
+    </w:p>
+    <w:p>
+      <w:pPr>
+        <w:pStyle w:val="ListNumber"/>
+      </w:pPr>
+      <w:r>
+        <w:t>Merge only after the automated gates and human review pass.</w:t>
+      </w:r>
+    </w:p>
+    <w:p>
+      <w:pPr>
+        <w:pStyle w:val="ListNumber"/>
+      </w:pPr>
+      <w:r>
+        <w:t xml:space="preserve">Let the </w:t>
+      </w:r>
+      <w:r>
+        <w:rPr>
+          <w:rFonts w:ascii="Consolas" w:hAnsi="Consolas"/>
+        </w:rPr>
+        <w:t>main</w:t>
+      </w:r>
+      <w:r>
+        <w:t>-branch workflow rebuild every output and deploy GitHub Pages.</w:t>
+      </w:r>
+    </w:p>
+    <w:p>
+      <w:r>
+        <w:t>This creates a simple ownership boundary. People author and approve meaning. The repository automates validation, transformation, packaging, and deployment.</w:t>
+      </w:r>
+    </w:p>
+    <w:p>
+      <w:r>
+        <w:br w:type="page"/>
+      </w:r>
+    </w:p>
+    <w:p>
+      <w:pPr>
+        <w:pStyle w:val="Heading1"/>
+      </w:pPr>
+      <w:r>
+        <w:t>Branding</w:t>
+      </w:r>
+    </w:p>
+    <w:p>
+      <w:r>
+        <w:t>Branding belongs in the publishing layer. The source should still make sense as plain Markdown, in GitHub preview, in Word, and in a different web theme.</w:t>
+      </w:r>
+    </w:p>
+    <w:p>
+      <w:pPr>
+        <w:pStyle w:val="Heading2"/>
+      </w:pPr>
+      <w:r>
+        <w:t>Five-Minute Rebrand</w:t>
+      </w:r>
+    </w:p>
+    <w:p>
+      <w:pPr>
+        <w:pStyle w:val="ListNumber"/>
+        <w:numPr>
+          <w:ilvl w:val="0"/>
+          <w:numId w:val="20"/>
+        </w:numPr>
+      </w:pPr>
+      <w:r>
+        <w:t xml:space="preserve">Open </w:t>
+      </w:r>
+      <w:r>
+        <w:rPr>
+          <w:rFonts w:ascii="Consolas" w:hAnsi="Consolas"/>
+        </w:rPr>
+        <w:t>docs/assets/stylesheets/brand-2026.css</w:t>
       </w:r>
       <w:r>
         <w:t>.</w:t>
@@ -2329,7 +3442,7 @@
         <w:pStyle w:val="Heading2"/>
       </w:pPr>
       <w:r>
-        <w:t>Token approach</w:t>
+        <w:t>Token Approach</w:t>
       </w:r>
     </w:p>
     <w:p>
@@ -2360,7 +3473,7 @@
         <w:pStyle w:val="Heading2"/>
       </w:pPr>
       <w:r>
-        <w:t>Content that should not be branded</w:t>
+        <w:t>Content That Should Not Be Branded</w:t>
       </w:r>
     </w:p>
     <w:p>
@@ -2422,7 +3535,16 @@
     </w:p>
     <w:p>
       <w:r>
-        <w:t>The export script reads the explicit navigation list so portable outputs follow the same order as the site. It applies a restrained document style, real heading levels, a running footer, and link text that remains understandable outside the site.</w:t>
+        <w:t xml:space="preserve">The export script reads the explicit navigation list so portable outputs follow the same order as the site. It applies a restrained document style, real heading levels, descriptive link text, and a running footer with dynamic </w:t>
+      </w:r>
+      <w:r>
+        <w:rPr>
+          <w:b/>
+        </w:rPr>
+        <w:t>Page X of Y</w:t>
+      </w:r>
+      <w:r>
+        <w:t xml:space="preserve"> fields. LibreOffice preserves those page numbers when it creates the PDF.</w:t>
       </w:r>
     </w:p>
     <w:p>
@@ -2435,7 +3557,30 @@
     </w:p>
     <w:p>
       <w:r>
-        <w:t>CI uses LibreOffice to convert the generated Word file to PDF. Both files are checked for existence and plausible size before they are uploaded as build artifacts.</w:t>
+        <w:t>CI uses LibreOffice to convert the generated Word file to PDF. Both files are checked for existence and plausible size before publication.</w:t>
+      </w:r>
+    </w:p>
+    <w:p>
+      <w:r>
+        <w:t>The website, Word handbook, and PDF handbook are three presentations of the same reviewed Markdown source. Authors do not update any of them separately. After an approved Markdown change is merged, the workflow rebuilds the site, generates Word, converts Word to PDF, verifies all three outputs, and publishes them together.</w:t>
+      </w:r>
+    </w:p>
+    <w:p>
+      <w:r>
+        <w:rPr>
+          <w:color w:val="075E54"/>
+          <w:u w:val="single"/>
+        </w:rPr>
+        <w:t>Download the Word handbook</w:t>
+      </w:r>
+    </w:p>
+    <w:p>
+      <w:r>
+        <w:rPr>
+          <w:color w:val="075E54"/>
+          <w:u w:val="single"/>
+        </w:rPr>
+        <w:t>Download the PDF handbook</w:t>
       </w:r>
     </w:p>
     <w:p>
@@ -2443,12 +3588,12 @@
         <w:pStyle w:val="Heading2"/>
       </w:pPr>
       <w:r>
-        <w:t>Renderer-independent gates</w:t>
-      </w:r>
-    </w:p>
-    <w:p>
-      <w:r>
-        <w:t>A replacement renderer is acceptable only if the release continues to verify navigation completeness, target files, anchors, accessible structure, responsive layout, and portable outputs. Tool choice can evolve; the acceptance criteria stay explicit.</w:t>
+        <w:t>Renderer-Independent Gates</w:t>
+      </w:r>
+    </w:p>
+    <w:p>
+      <w:r>
+        <w:t>A replacement renderer is acceptable only if the release continues to verify navigation completeness, target files, anchors, accessible structure, responsive layout, and portable outputs. Tool choice can evolve. The acceptance criteria stay explicit.</w:t>
       </w:r>
     </w:p>
     <w:p>
@@ -2461,7 +3606,7 @@
         <w:pStyle w:val="Heading1"/>
       </w:pPr>
       <w:r>
-        <w:t>Writing guide</w:t>
+        <w:t>Writing Guide</w:t>
       </w:r>
     </w:p>
     <w:p>
@@ -2490,7 +3635,7 @@
         <w:pStyle w:val="ListBullet"/>
       </w:pPr>
       <w:r>
-        <w:t>Keep heading levels sequential; do not skip from level two to level four.</w:t>
+        <w:t>Keep heading levels sequential. Do not skip from level two to level four.</w:t>
       </w:r>
     </w:p>
     <w:p>
@@ -2588,7 +3733,7 @@
         <w:pStyle w:val="Heading2"/>
       </w:pPr>
       <w:r>
-        <w:t>Cross-references</w:t>
+        <w:t>Cross-References</w:t>
       </w:r>
     </w:p>
     <w:p>
@@ -2619,6 +3764,96 @@
       </w:r>
     </w:p>
     <w:p>
+      <w:pPr>
+        <w:pStyle w:val="Heading2"/>
+      </w:pPr>
+      <w:r>
+        <w:t>Authoring Workflow</w:t>
+      </w:r>
+    </w:p>
+    <w:p>
+      <w:pPr>
+        <w:pStyle w:val="ListNumber"/>
+        <w:numPr>
+          <w:ilvl w:val="0"/>
+          <w:numId w:val="21"/>
+        </w:numPr>
+      </w:pPr>
+      <w:r>
+        <w:t>Identify the reader goal and confirm the product information.</w:t>
+      </w:r>
+    </w:p>
+    <w:p>
+      <w:pPr>
+        <w:pStyle w:val="ListNumber"/>
+      </w:pPr>
+      <w:r>
+        <w:t xml:space="preserve">Edit Markdown under </w:t>
+      </w:r>
+      <w:r>
+        <w:rPr>
+          <w:rFonts w:ascii="Consolas" w:hAnsi="Consolas"/>
+        </w:rPr>
+        <w:t>docs/</w:t>
+      </w:r>
+      <w:r>
+        <w:t>. Treat the website, Word handbook, and PDF as generated outputs.</w:t>
+      </w:r>
+    </w:p>
+    <w:p>
+      <w:pPr>
+        <w:pStyle w:val="ListNumber"/>
+      </w:pPr>
+      <w:r>
+        <w:t>Update explicit navigation when adding or moving a page.</w:t>
+      </w:r>
+    </w:p>
+    <w:p>
+      <w:pPr>
+        <w:pStyle w:val="ListNumber"/>
+      </w:pPr>
+      <w:r>
+        <w:t>Add descriptive links, stable anchors, images, and examples needed by the topic.</w:t>
+      </w:r>
+    </w:p>
+    <w:p>
+      <w:pPr>
+        <w:pStyle w:val="ListNumber"/>
+      </w:pPr>
+      <w:r>
+        <w:t>Run the independent validator and build a local Zensical preview.</w:t>
+      </w:r>
+    </w:p>
+    <w:p>
+      <w:pPr>
+        <w:pStyle w:val="ListNumber"/>
+      </w:pPr>
+      <w:r>
+        <w:t>Review the rendered page for content, accessibility, navigation, and responsive behavior.</w:t>
+      </w:r>
+    </w:p>
+    <w:p>
+      <w:pPr>
+        <w:pStyle w:val="ListNumber"/>
+      </w:pPr>
+      <w:r>
+        <w:t>Open a focused pull request and describe the checks performed.</w:t>
+      </w:r>
+    </w:p>
+    <w:p>
+      <w:pPr>
+        <w:pStyle w:val="ListNumber"/>
+      </w:pPr>
+      <w:r>
+        <w:t>Address human review. Merge only after the required automated gates pass.</w:t>
+      </w:r>
+    </w:p>
+    <w:p>
+      <w:r>
+        <w:t>After merge, GitHub Actions rebuilds the site and portable files. It then deploys the approved site to GitHub Pages.</w:t>
+      </w:r>
+    </w:p>
+    <w:p>
       <w:r>
         <w:br w:type="page"/>
       </w:r>
@@ -2641,7 +3876,7 @@
         <w:pStyle w:val="Heading2"/>
       </w:pPr>
       <w:r>
-        <w:t>Authoring standard</w:t>
+        <w:t>Authoring Standard</w:t>
       </w:r>
     </w:p>
     <w:p>
@@ -2665,7 +3900,7 @@
         <w:pStyle w:val="ListBullet"/>
       </w:pPr>
       <w:r>
-        <w:t>Add concise alternative text to informative images; hide decorative imagery from assistive technology in templates.</w:t>
+        <w:t>Add concise alternative text to informative images. Hide decorative imagery from assistive technology in templates.</w:t>
       </w:r>
     </w:p>
     <w:p>
@@ -2697,7 +3932,7 @@
         <w:pStyle w:val="Heading2"/>
       </w:pPr>
       <w:r>
-        <w:t>Rendered-site checks</w:t>
+        <w:t>Rendered-Site Checks</w:t>
       </w:r>
     </w:p>
     <w:p>
@@ -2754,7 +3989,7 @@
         <w:t>prefers-reduced-motion</w:t>
       </w:r>
       <w:r>
-        <w:t>; do not require animation to understand content.</w:t>
+        <w:t>. Do not require animation to understand content.</w:t>
       </w:r>
     </w:p>
     <w:p>
@@ -2762,7 +3997,7 @@
         <w:pStyle w:val="Heading2"/>
       </w:pPr>
       <w:r>
-        <w:t>Portable-output checks</w:t>
+        <w:t>Portable-Output Checks</w:t>
       </w:r>
     </w:p>
     <w:p>
@@ -2780,7 +4015,7 @@
         <w:pStyle w:val="Heading1"/>
       </w:pPr>
       <w:r>
-        <w:t>Release checklist</w:t>
+        <w:t>Release Checklist</w:t>
       </w:r>
     </w:p>
     <w:p>
@@ -2788,7 +4023,7 @@
         <w:pStyle w:val="Heading2"/>
       </w:pPr>
       <w:r>
-        <w:t>Automated gates</w:t>
+        <w:t>Automated Gates</w:t>
       </w:r>
     </w:p>
     <w:p>
@@ -2865,7 +4100,7 @@
         <w:pStyle w:val="Heading2"/>
       </w:pPr>
       <w:r>
-        <w:t>Editorial review</w:t>
+        <w:t>Editorial Review</w:t>
       </w:r>
     </w:p>
     <w:p>
@@ -2921,7 +4156,7 @@
         <w:pStyle w:val="Heading2"/>
       </w:pPr>
       <w:r>
-        <w:t>Accessibility and responsive review</w:t>
+        <w:t>Accessibility and Responsive Review</w:t>
       </w:r>
     </w:p>
     <w:p>
@@ -3001,7 +4236,7 @@
         <w:pStyle w:val="Heading2"/>
       </w:pPr>
       <w:r>
-        <w:t>Generated-file review</w:t>
+        <w:t>Generated-File Review</w:t>
       </w:r>
     </w:p>
     <w:p>
@@ -3059,7 +4294,40 @@
       <w:jc w:val="center"/>
     </w:pPr>
     <w:r>
-      <w:t>Greenhouse Sentinel · Portfolio demonstration · Katie Kearns</w:t>
+      <w:t xml:space="preserve">Greenhouse Sentinel · Portfolio demonstration · Katie Kearns · Page </w:t>
+    </w:r>
+    <w:r>
+      <w:fldChar w:fldCharType="begin"/>
+    </w:r>
+    <w:r>
+      <w:instrText xml:space="preserve"> PAGE </w:instrText>
+    </w:r>
+    <w:r>
+      <w:fldChar w:fldCharType="separate"/>
+    </w:r>
+    <w:r>
+      <w:t>1</w:t>
+    </w:r>
+    <w:r>
+      <w:fldChar w:fldCharType="end"/>
+    </w:r>
+    <w:r>
+      <w:t xml:space="preserve"> of </w:t>
+    </w:r>
+    <w:r>
+      <w:fldChar w:fldCharType="begin"/>
+    </w:r>
+    <w:r>
+      <w:instrText xml:space="preserve"> NUMPAGES </w:instrText>
+    </w:r>
+    <w:r>
+      <w:fldChar w:fldCharType="separate"/>
+    </w:r>
+    <w:r>
+      <w:t>1</w:t>
+    </w:r>
+    <w:r>
+      <w:fldChar w:fldCharType="end"/>
     </w:r>
   </w:p>
 </w:ftr>
@@ -3290,6 +4558,48 @@
     </w:lvlOverride>
   </w:num>
   <w:num w:numId="14">
+    <w:abstractNumId w:val="7"/>
+    <w:lvlOverride w:ilvl="0">
+      <w:startOverride w:val="1"/>
+    </w:lvlOverride>
+  </w:num>
+  <w:num w:numId="15">
+    <w:abstractNumId w:val="7"/>
+    <w:lvlOverride w:ilvl="0">
+      <w:startOverride w:val="1"/>
+    </w:lvlOverride>
+  </w:num>
+  <w:num w:numId="16">
+    <w:abstractNumId w:val="7"/>
+    <w:lvlOverride w:ilvl="0">
+      <w:startOverride w:val="1"/>
+    </w:lvlOverride>
+  </w:num>
+  <w:num w:numId="17">
+    <w:abstractNumId w:val="7"/>
+    <w:lvlOverride w:ilvl="0">
+      <w:startOverride w:val="1"/>
+    </w:lvlOverride>
+  </w:num>
+  <w:num w:numId="18">
+    <w:abstractNumId w:val="7"/>
+    <w:lvlOverride w:ilvl="0">
+      <w:startOverride w:val="1"/>
+    </w:lvlOverride>
+  </w:num>
+  <w:num w:numId="19">
+    <w:abstractNumId w:val="7"/>
+    <w:lvlOverride w:ilvl="0">
+      <w:startOverride w:val="1"/>
+    </w:lvlOverride>
+  </w:num>
+  <w:num w:numId="20">
+    <w:abstractNumId w:val="7"/>
+    <w:lvlOverride w:ilvl="0">
+      <w:startOverride w:val="1"/>
+    </w:lvlOverride>
+  </w:num>
+  <w:num w:numId="21">
     <w:abstractNumId w:val="7"/>
     <w:lvlOverride w:ilvl="0">
       <w:startOverride w:val="1"/>

</xml_diff>

<commit_message>
Improve handbook list and table pagination
</commit_message>
<xml_diff>
--- a/deliverables/greenhouse-sentinel-handbook.docx
+++ b/deliverables/greenhouse-sentinel-handbook.docx
@@ -129,6 +129,7 @@
           <w:ilvl w:val="0"/>
           <w:numId w:val="10"/>
         </w:numPr>
+        <w:ind w:left="576" w:hanging="360"/>
       </w:pPr>
       <w:r>
         <w:t>this searchable Zensical site</w:t>
@@ -137,6 +138,7 @@
     <w:p>
       <w:pPr>
         <w:pStyle w:val="ListNumber"/>
+        <w:ind w:left="576" w:hanging="360"/>
       </w:pPr>
       <w:r>
         <w:t>a Microsoft Word handbook</w:t>
@@ -145,6 +147,7 @@
     <w:p>
       <w:pPr>
         <w:pStyle w:val="ListNumber"/>
+        <w:ind w:left="576" w:hanging="360"/>
       </w:pPr>
       <w:r>
         <w:t>a PDF handbook</w:t>
@@ -687,6 +690,7 @@
           <w:ilvl w:val="0"/>
           <w:numId w:val="11"/>
         </w:numPr>
+        <w:ind w:left="576" w:hanging="360"/>
       </w:pPr>
       <w:r>
         <w:t>Place the hub above the irrigation line and away from direct spray.</w:t>
@@ -695,6 +699,7 @@
     <w:p>
       <w:pPr>
         <w:pStyle w:val="ListNumber"/>
+        <w:ind w:left="576" w:hanging="360"/>
       </w:pPr>
       <w:r>
         <w:t>Connect both probes before applying power.</w:t>
@@ -703,6 +708,7 @@
     <w:p>
       <w:pPr>
         <w:pStyle w:val="ListNumber"/>
+        <w:ind w:left="576" w:hanging="360"/>
       </w:pPr>
       <w:r>
         <w:t xml:space="preserve">Join the temporary network named </w:t>
@@ -720,6 +726,7 @@
     <w:p>
       <w:pPr>
         <w:pStyle w:val="ListNumber"/>
+        <w:ind w:left="576" w:hanging="360"/>
       </w:pPr>
       <w:r>
         <w:t xml:space="preserve">Open </w:t>
@@ -737,6 +744,7 @@
     <w:p>
       <w:pPr>
         <w:pStyle w:val="ListNumber"/>
+        <w:ind w:left="576" w:hanging="360"/>
       </w:pPr>
       <w:r>
         <w:t xml:space="preserve">Select </w:t>
@@ -888,6 +896,7 @@
           <w:ilvl w:val="0"/>
           <w:numId w:val="12"/>
         </w:numPr>
+        <w:ind w:left="576" w:hanging="360"/>
       </w:pPr>
       <w:r>
         <w:t>Confirm the dashboard timestamp is less than two minutes old.</w:t>
@@ -896,6 +905,7 @@
     <w:p>
       <w:pPr>
         <w:pStyle w:val="ListNumber"/>
+        <w:ind w:left="576" w:hanging="360"/>
       </w:pPr>
       <w:r>
         <w:t>Review the current state and its explanation.</w:t>
@@ -904,6 +914,7 @@
     <w:p>
       <w:pPr>
         <w:pStyle w:val="ListNumber"/>
+        <w:ind w:left="576" w:hanging="360"/>
       </w:pPr>
       <w:r>
         <w:t>Compare soil moisture across the three most recent samples.</w:t>
@@ -912,6 +923,7 @@
     <w:p>
       <w:pPr>
         <w:pStyle w:val="ListNumber"/>
+        <w:ind w:left="576" w:hanging="360"/>
       </w:pPr>
       <w:r>
         <w:t>Acknowledge any completed response.</w:t>
@@ -920,6 +932,7 @@
     <w:p>
       <w:pPr>
         <w:pStyle w:val="ListNumber"/>
+        <w:ind w:left="576" w:hanging="360"/>
       </w:pPr>
       <w:r>
         <w:t>Record an observation only when local conditions differ from the sensor data.</w:t>
@@ -1189,6 +1202,9 @@
         <w:gridCol w:w="3216"/>
       </w:tblGrid>
       <w:tr>
+        <w:trPr>
+          <w:tblHeader w:val="true"/>
+        </w:trPr>
         <w:tc>
           <w:tcPr>
             <w:tcW w:type="dxa" w:w="3120"/>
@@ -1420,6 +1436,7 @@
           <w:ilvl w:val="0"/>
           <w:numId w:val="13"/>
         </w:numPr>
+        <w:ind w:left="576" w:hanging="360"/>
       </w:pPr>
       <w:r>
         <w:t>Confirm the cable is fully seated and dry.</w:t>
@@ -1428,6 +1445,7 @@
     <w:p>
       <w:pPr>
         <w:pStyle w:val="ListNumber"/>
+        <w:ind w:left="576" w:hanging="360"/>
       </w:pPr>
       <w:r>
         <w:t>Check whether the dashboard timestamp continues to advance for other sensors.</w:t>
@@ -1436,6 +1454,7 @@
     <w:p>
       <w:pPr>
         <w:pStyle w:val="ListNumber"/>
+        <w:ind w:left="576" w:hanging="360"/>
       </w:pPr>
       <w:r>
         <w:t>Disconnect power, reconnect the sensor, and restore power.</w:t>
@@ -1444,6 +1463,7 @@
     <w:p>
       <w:pPr>
         <w:pStyle w:val="ListNumber"/>
+        <w:ind w:left="576" w:hanging="360"/>
       </w:pPr>
       <w:r>
         <w:t>Wait three sampling intervals.</w:t>
@@ -1579,6 +1599,7 @@
           <w:ilvl w:val="0"/>
           <w:numId w:val="14"/>
         </w:numPr>
+        <w:ind w:left="576" w:hanging="360"/>
       </w:pPr>
       <w:r>
         <w:rPr>
@@ -1593,6 +1614,7 @@
     <w:p>
       <w:pPr>
         <w:pStyle w:val="ListNumber"/>
+        <w:ind w:left="576" w:hanging="360"/>
       </w:pPr>
       <w:r>
         <w:rPr>
@@ -1616,6 +1638,7 @@
     <w:p>
       <w:pPr>
         <w:pStyle w:val="ListNumber"/>
+        <w:ind w:left="576" w:hanging="360"/>
       </w:pPr>
       <w:r>
         <w:rPr>
@@ -1630,6 +1653,7 @@
     <w:p>
       <w:pPr>
         <w:pStyle w:val="ListNumber"/>
+        <w:ind w:left="576" w:hanging="360"/>
       </w:pPr>
       <w:r>
         <w:rPr>
@@ -1644,6 +1668,7 @@
     <w:p>
       <w:pPr>
         <w:pStyle w:val="ListNumber"/>
+        <w:ind w:left="576" w:hanging="360"/>
       </w:pPr>
       <w:r>
         <w:rPr>
@@ -1658,6 +1683,7 @@
     <w:p>
       <w:pPr>
         <w:pStyle w:val="ListNumber"/>
+        <w:ind w:left="576" w:hanging="360"/>
       </w:pPr>
       <w:r>
         <w:rPr>
@@ -1672,6 +1698,7 @@
     <w:p>
       <w:pPr>
         <w:pStyle w:val="ListNumber"/>
+        <w:ind w:left="576" w:hanging="360"/>
       </w:pPr>
       <w:r>
         <w:rPr>
@@ -1707,6 +1734,9 @@
         <w:gridCol w:w="4824"/>
       </w:tblGrid>
       <w:tr>
+        <w:trPr>
+          <w:tblHeader w:val="true"/>
+        </w:trPr>
         <w:tc>
           <w:tcPr>
             <w:tcW w:type="dxa" w:w="4680"/>
@@ -2590,6 +2620,7 @@
           <w:ilvl w:val="0"/>
           <w:numId w:val="15"/>
         </w:numPr>
+        <w:ind w:left="576" w:hanging="360"/>
       </w:pPr>
       <w:r>
         <w:rPr>
@@ -2604,6 +2635,7 @@
     <w:p>
       <w:pPr>
         <w:pStyle w:val="ListNumber"/>
+        <w:ind w:left="576" w:hanging="360"/>
       </w:pPr>
       <w:r>
         <w:rPr>
@@ -2618,6 +2650,7 @@
     <w:p>
       <w:pPr>
         <w:pStyle w:val="ListNumber"/>
+        <w:ind w:left="576" w:hanging="360"/>
       </w:pPr>
       <w:r>
         <w:rPr>
@@ -2632,6 +2665,7 @@
     <w:p>
       <w:pPr>
         <w:pStyle w:val="ListNumber"/>
+        <w:ind w:left="576" w:hanging="360"/>
       </w:pPr>
       <w:r>
         <w:rPr>
@@ -2858,6 +2892,7 @@
           <w:ilvl w:val="0"/>
           <w:numId w:val="16"/>
         </w:numPr>
+        <w:ind w:left="576" w:hanging="360"/>
       </w:pPr>
       <w:r>
         <w:t>Check out the exact Git commit under review.</w:t>
@@ -2866,6 +2901,7 @@
     <w:p>
       <w:pPr>
         <w:pStyle w:val="ListNumber"/>
+        <w:ind w:left="576" w:hanging="360"/>
       </w:pPr>
       <w:r>
         <w:t>Install the dependency versions pinned by the repository.</w:t>
@@ -2874,6 +2910,7 @@
     <w:p>
       <w:pPr>
         <w:pStyle w:val="ListNumber"/>
+        <w:ind w:left="576" w:hanging="360"/>
       </w:pPr>
       <w:r>
         <w:t xml:space="preserve">Run </w:t>
@@ -2891,6 +2928,7 @@
     <w:p>
       <w:pPr>
         <w:pStyle w:val="ListNumber"/>
+        <w:ind w:left="576" w:hanging="360"/>
       </w:pPr>
       <w:r>
         <w:t>Build the complete Zensical site from the reviewed source.</w:t>
@@ -2899,6 +2937,7 @@
     <w:p>
       <w:pPr>
         <w:pStyle w:val="ListNumber"/>
+        <w:ind w:left="576" w:hanging="360"/>
       </w:pPr>
       <w:r>
         <w:t xml:space="preserve">Run </w:t>
@@ -2916,6 +2955,7 @@
     <w:p>
       <w:pPr>
         <w:pStyle w:val="ListNumber"/>
+        <w:ind w:left="576" w:hanging="360"/>
       </w:pPr>
       <w:r>
         <w:t>Create the Word handbook with real heading, list, table, and document styles.</w:t>
@@ -2924,6 +2964,7 @@
     <w:p>
       <w:pPr>
         <w:pStyle w:val="ListNumber"/>
+        <w:ind w:left="576" w:hanging="360"/>
       </w:pPr>
       <w:r>
         <w:t>Convert the Word handbook to PDF with headless LibreOffice.</w:t>
@@ -2932,6 +2973,7 @@
     <w:p>
       <w:pPr>
         <w:pStyle w:val="ListNumber"/>
+        <w:ind w:left="576" w:hanging="360"/>
       </w:pPr>
       <w:r>
         <w:t>Confirm that the site, Word file, and PDF exist and are non-empty.</w:t>
@@ -2940,6 +2982,7 @@
     <w:p>
       <w:pPr>
         <w:pStyle w:val="ListNumber"/>
+        <w:ind w:left="576" w:hanging="360"/>
       </w:pPr>
       <w:r>
         <w:t>Upload the site and portable files as reviewable build artifacts.</w:t>
@@ -2948,6 +2991,7 @@
     <w:p>
       <w:pPr>
         <w:pStyle w:val="ListNumber"/>
+        <w:ind w:left="576" w:hanging="360"/>
       </w:pPr>
       <w:r>
         <w:t xml:space="preserve">On the </w:t>
@@ -3097,6 +3141,7 @@
           <w:ilvl w:val="0"/>
           <w:numId w:val="17"/>
         </w:numPr>
+        <w:ind w:left="576" w:hanging="360"/>
       </w:pPr>
       <w:r>
         <w:t>Start with a reader problem or a verified product change.</w:t>
@@ -3105,6 +3150,7 @@
     <w:p>
       <w:pPr>
         <w:pStyle w:val="ListNumber"/>
+        <w:ind w:left="576" w:hanging="360"/>
       </w:pPr>
       <w:r>
         <w:t xml:space="preserve">Edit the relevant Markdown under </w:t>
@@ -3131,6 +3177,7 @@
     <w:p>
       <w:pPr>
         <w:pStyle w:val="ListNumber"/>
+        <w:ind w:left="576" w:hanging="360"/>
       </w:pPr>
       <w:r>
         <w:t xml:space="preserve">Add a new page to </w:t>
@@ -3148,6 +3195,7 @@
     <w:p>
       <w:pPr>
         <w:pStyle w:val="ListNumber"/>
+        <w:ind w:left="576" w:hanging="360"/>
       </w:pPr>
       <w:r>
         <w:t>Add or update relative links and stable anchors when other pages depend on the content.</w:t>
@@ -3156,6 +3204,7 @@
     <w:p>
       <w:pPr>
         <w:pStyle w:val="ListNumber"/>
+        <w:ind w:left="576" w:hanging="360"/>
       </w:pPr>
       <w:r>
         <w:t>Keep branding changes in the stylesheet, logo asset, or publishing configuration.</w:t>
@@ -3176,6 +3225,7 @@
           <w:ilvl w:val="0"/>
           <w:numId w:val="18"/>
         </w:numPr>
+        <w:ind w:left="576" w:hanging="360"/>
       </w:pPr>
       <w:r>
         <w:t xml:space="preserve">Run </w:t>
@@ -3193,6 +3243,7 @@
     <w:p>
       <w:pPr>
         <w:pStyle w:val="ListNumber"/>
+        <w:ind w:left="576" w:hanging="360"/>
       </w:pPr>
       <w:r>
         <w:t>Build or serve the Zensical site.</w:t>
@@ -3201,6 +3252,7 @@
     <w:p>
       <w:pPr>
         <w:pStyle w:val="ListNumber"/>
+        <w:ind w:left="576" w:hanging="360"/>
       </w:pPr>
       <w:r>
         <w:t>Read the rendered page in context, not only the source diff.</w:t>
@@ -3209,6 +3261,7 @@
     <w:p>
       <w:pPr>
         <w:pStyle w:val="ListNumber"/>
+        <w:ind w:left="576" w:hanging="360"/>
       </w:pPr>
       <w:r>
         <w:t>Regenerate Word and PDF when the change affects portable output.</w:t>
@@ -3217,6 +3270,7 @@
     <w:p>
       <w:pPr>
         <w:pStyle w:val="ListNumber"/>
+        <w:ind w:left="576" w:hanging="360"/>
       </w:pPr>
       <w:r>
         <w:t>Complete editorial, accessibility, responsive, and generated-file review in proportion to the risk of the change.</w:t>
@@ -3237,6 +3291,7 @@
           <w:ilvl w:val="0"/>
           <w:numId w:val="19"/>
         </w:numPr>
+        <w:ind w:left="576" w:hanging="360"/>
       </w:pPr>
       <w:r>
         <w:t>Commit only the intended source and configuration changes.</w:t>
@@ -3245,6 +3300,7 @@
     <w:p>
       <w:pPr>
         <w:pStyle w:val="ListNumber"/>
+        <w:ind w:left="576" w:hanging="360"/>
       </w:pPr>
       <w:r>
         <w:t>Open a focused pull request that explains the reader need and the checks performed.</w:t>
@@ -3253,6 +3309,7 @@
     <w:p>
       <w:pPr>
         <w:pStyle w:val="ListNumber"/>
+        <w:ind w:left="576" w:hanging="360"/>
       </w:pPr>
       <w:r>
         <w:t>Let CI repeat validation and generate review artifacts from a clean environment.</w:t>
@@ -3261,6 +3318,7 @@
     <w:p>
       <w:pPr>
         <w:pStyle w:val="ListNumber"/>
+        <w:ind w:left="576" w:hanging="360"/>
       </w:pPr>
       <w:r>
         <w:t>Have the appropriate people review technical meaning, writing quality, accessibility, and presentation.</w:t>
@@ -3269,6 +3327,7 @@
     <w:p>
       <w:pPr>
         <w:pStyle w:val="ListNumber"/>
+        <w:ind w:left="576" w:hanging="360"/>
       </w:pPr>
       <w:r>
         <w:t>Merge only after the automated gates and human review pass.</w:t>
@@ -3277,6 +3336,7 @@
     <w:p>
       <w:pPr>
         <w:pStyle w:val="ListNumber"/>
+        <w:ind w:left="576" w:hanging="360"/>
       </w:pPr>
       <w:r>
         <w:t xml:space="preserve">Let the </w:t>
@@ -3329,6 +3389,7 @@
           <w:ilvl w:val="0"/>
           <w:numId w:val="20"/>
         </w:numPr>
+        <w:ind w:left="576" w:hanging="360"/>
       </w:pPr>
       <w:r>
         <w:t xml:space="preserve">Open </w:t>
@@ -3346,6 +3407,7 @@
     <w:p>
       <w:pPr>
         <w:pStyle w:val="ListNumber"/>
+        <w:ind w:left="576" w:hanging="360"/>
       </w:pPr>
       <w:r>
         <w:t xml:space="preserve">Replace the values under </w:t>
@@ -3363,6 +3425,7 @@
     <w:p>
       <w:pPr>
         <w:pStyle w:val="ListNumber"/>
+        <w:ind w:left="576" w:hanging="360"/>
       </w:pPr>
       <w:r>
         <w:t xml:space="preserve">Replace </w:t>
@@ -3380,6 +3443,7 @@
     <w:p>
       <w:pPr>
         <w:pStyle w:val="ListNumber"/>
+        <w:ind w:left="576" w:hanging="360"/>
       </w:pPr>
       <w:r>
         <w:t xml:space="preserve">Update </w:t>
@@ -3424,6 +3488,7 @@
     <w:p>
       <w:pPr>
         <w:pStyle w:val="ListNumber"/>
+        <w:ind w:left="576" w:hanging="360"/>
       </w:pPr>
       <w:r>
         <w:t>Run the validator and a strict production build.</w:t>
@@ -3432,6 +3497,7 @@
     <w:p>
       <w:pPr>
         <w:pStyle w:val="ListNumber"/>
+        <w:ind w:left="576" w:hanging="360"/>
       </w:pPr>
       <w:r>
         <w:t>Test the rendered site at the widths in the release checklist.</w:t>
@@ -3778,6 +3844,7 @@
           <w:ilvl w:val="0"/>
           <w:numId w:val="21"/>
         </w:numPr>
+        <w:ind w:left="576" w:hanging="360"/>
       </w:pPr>
       <w:r>
         <w:t>Identify the reader goal and confirm the product information.</w:t>
@@ -3786,6 +3853,7 @@
     <w:p>
       <w:pPr>
         <w:pStyle w:val="ListNumber"/>
+        <w:ind w:left="576" w:hanging="360"/>
       </w:pPr>
       <w:r>
         <w:t xml:space="preserve">Edit Markdown under </w:t>
@@ -3803,6 +3871,7 @@
     <w:p>
       <w:pPr>
         <w:pStyle w:val="ListNumber"/>
+        <w:ind w:left="576" w:hanging="360"/>
       </w:pPr>
       <w:r>
         <w:t>Update explicit navigation when adding or moving a page.</w:t>
@@ -3811,6 +3880,7 @@
     <w:p>
       <w:pPr>
         <w:pStyle w:val="ListNumber"/>
+        <w:ind w:left="576" w:hanging="360"/>
       </w:pPr>
       <w:r>
         <w:t>Add descriptive links, stable anchors, images, and examples needed by the topic.</w:t>
@@ -3819,6 +3889,7 @@
     <w:p>
       <w:pPr>
         <w:pStyle w:val="ListNumber"/>
+        <w:ind w:left="576" w:hanging="360"/>
       </w:pPr>
       <w:r>
         <w:t>Run the independent validator and build a local Zensical preview.</w:t>
@@ -3827,6 +3898,7 @@
     <w:p>
       <w:pPr>
         <w:pStyle w:val="ListNumber"/>
+        <w:ind w:left="576" w:hanging="360"/>
       </w:pPr>
       <w:r>
         <w:t>Review the rendered page for content, accessibility, navigation, and responsive behavior.</w:t>
@@ -3835,6 +3907,7 @@
     <w:p>
       <w:pPr>
         <w:pStyle w:val="ListNumber"/>
+        <w:ind w:left="576" w:hanging="360"/>
       </w:pPr>
       <w:r>
         <w:t>Open a focused pull request and describe the checks performed.</w:t>
@@ -3843,6 +3916,7 @@
     <w:p>
       <w:pPr>
         <w:pStyle w:val="ListNumber"/>
+        <w:ind w:left="576" w:hanging="360"/>
       </w:pPr>
       <w:r>
         <w:t>Address human review. Merge only after the required automated gates pass.</w:t>

</xml_diff>

<commit_message>
Improve portable handbook typography
</commit_message>
<xml_diff>
--- a/deliverables/greenhouse-sentinel-handbook.docx
+++ b/deliverables/greenhouse-sentinel-handbook.docx
@@ -213,7 +213,7 @@
       </w:r>
       <w:r>
         <w:rPr>
-          <w:rFonts w:ascii="Consolas" w:hAnsi="Consolas"/>
+          <w:rFonts w:ascii="DejaVu Sans Mono" w:hAnsi="DejaVu Sans Mono" w:eastAsia="DejaVu Sans Mono"/>
         </w:rPr>
         <w:t>zensical.toml</w:t>
       </w:r>
@@ -715,7 +715,7 @@
       </w:r>
       <w:r>
         <w:rPr>
-          <w:rFonts w:ascii="Consolas" w:hAnsi="Consolas"/>
+          <w:rFonts w:ascii="DejaVu Sans Mono" w:hAnsi="DejaVu Sans Mono" w:eastAsia="DejaVu Sans Mono"/>
         </w:rPr>
         <w:t>sentinel-setup</w:t>
       </w:r>
@@ -733,7 +733,7 @@
       </w:r>
       <w:r>
         <w:rPr>
-          <w:rFonts w:ascii="Consolas" w:hAnsi="Consolas"/>
+          <w:rFonts w:ascii="DejaVu Sans Mono" w:hAnsi="DejaVu Sans Mono" w:eastAsia="DejaVu Sans Mono"/>
         </w:rPr>
         <w:t>http://sentinel.local</w:t>
       </w:r>
@@ -1004,7 +1004,7 @@
       </w:r>
       <w:r>
         <w:rPr>
-          <w:rFonts w:ascii="Consolas" w:hAnsi="Consolas"/>
+          <w:rFonts w:ascii="DejaVu Sans Mono" w:hAnsi="DejaVu Sans Mono" w:eastAsia="DejaVu Sans Mono"/>
         </w:rPr>
         <w:t>Opened roof vent; temperature fell to 27 C within 12 minutes.</w:t>
       </w:r>
@@ -1015,7 +1015,7 @@
       </w:r>
       <w:r>
         <w:rPr>
-          <w:rFonts w:ascii="Consolas" w:hAnsi="Consolas"/>
+          <w:rFonts w:ascii="DejaVu Sans Mono" w:hAnsi="DejaVu Sans Mono" w:eastAsia="DejaVu Sans Mono"/>
         </w:rPr>
         <w:t>Fixed.</w:t>
       </w:r>
@@ -1041,7 +1041,7 @@
       </w:r>
       <w:r>
         <w:rPr>
-          <w:rFonts w:ascii="Consolas" w:hAnsi="Consolas"/>
+          <w:rFonts w:ascii="DejaVu Sans Mono" w:hAnsi="DejaVu Sans Mono" w:eastAsia="DejaVu Sans Mono"/>
         </w:rPr>
         <w:t>architecture.md#decision-states</w:t>
       </w:r>
@@ -1050,7 +1050,7 @@
       </w:r>
       <w:r>
         <w:rPr>
-          <w:rFonts w:ascii="Consolas" w:hAnsi="Consolas"/>
+          <w:rFonts w:ascii="DejaVu Sans Mono" w:hAnsi="DejaVu Sans Mono" w:eastAsia="DejaVu Sans Mono"/>
         </w:rPr>
         <w:t>decision-states</w:t>
       </w:r>
@@ -1211,6 +1211,9 @@
             <w:shd w:fill="075E54"/>
           </w:tcPr>
           <w:p>
+            <w:pPr>
+              <w:spacing w:line="276" w:lineRule="auto" w:after="40"/>
+            </w:pPr>
             <w:r>
               <w:rPr>
                 <w:b/>
@@ -1226,6 +1229,9 @@
             <w:shd w:fill="075E54"/>
           </w:tcPr>
           <w:p>
+            <w:pPr>
+              <w:spacing w:line="276" w:lineRule="auto" w:after="40"/>
+            </w:pPr>
             <w:r>
               <w:rPr>
                 <w:b/>
@@ -1241,6 +1247,9 @@
             <w:shd w:fill="075E54"/>
           </w:tcPr>
           <w:p>
+            <w:pPr>
+              <w:spacing w:line="276" w:lineRule="auto" w:after="40"/>
+            </w:pPr>
             <w:r>
               <w:rPr>
                 <w:b/>
@@ -1257,6 +1266,9 @@
             <w:tcW w:type="dxa" w:w="3120"/>
           </w:tcPr>
           <w:p>
+            <w:pPr>
+              <w:spacing w:line="276" w:lineRule="auto" w:after="40"/>
+            </w:pPr>
             <w:r>
               <w:t>Normal</w:t>
             </w:r>
@@ -1267,6 +1279,9 @@
             <w:tcW w:type="dxa" w:w="3120"/>
           </w:tcPr>
           <w:p>
+            <w:pPr>
+              <w:spacing w:line="276" w:lineRule="auto" w:after="40"/>
+            </w:pPr>
             <w:r>
               <w:t>All readings are inside target ranges</w:t>
             </w:r>
@@ -1277,6 +1292,9 @@
             <w:tcW w:type="dxa" w:w="3120"/>
           </w:tcPr>
           <w:p>
+            <w:pPr>
+              <w:spacing w:line="276" w:lineRule="auto" w:after="40"/>
+            </w:pPr>
             <w:r>
               <w:t>Continue scheduled checks</w:t>
             </w:r>
@@ -1289,6 +1307,9 @@
             <w:tcW w:type="dxa" w:w="3120"/>
           </w:tcPr>
           <w:p>
+            <w:pPr>
+              <w:spacing w:line="276" w:lineRule="auto" w:after="40"/>
+            </w:pPr>
             <w:r>
               <w:t>Watch</w:t>
             </w:r>
@@ -1299,6 +1320,9 @@
             <w:tcW w:type="dxa" w:w="3120"/>
           </w:tcPr>
           <w:p>
+            <w:pPr>
+              <w:spacing w:line="276" w:lineRule="auto" w:after="40"/>
+            </w:pPr>
             <w:r>
               <w:t>One reading is near a threshold</w:t>
             </w:r>
@@ -1309,6 +1333,9 @@
             <w:tcW w:type="dxa" w:w="3120"/>
           </w:tcPr>
           <w:p>
+            <w:pPr>
+              <w:spacing w:line="276" w:lineRule="auto" w:after="40"/>
+            </w:pPr>
             <w:r>
               <w:t>Inspect within 30 minutes</w:t>
             </w:r>
@@ -1321,6 +1348,9 @@
             <w:tcW w:type="dxa" w:w="3120"/>
           </w:tcPr>
           <w:p>
+            <w:pPr>
+              <w:spacing w:line="276" w:lineRule="auto" w:after="40"/>
+            </w:pPr>
             <w:r>
               <w:t>Act</w:t>
             </w:r>
@@ -1331,6 +1361,9 @@
             <w:tcW w:type="dxa" w:w="3120"/>
           </w:tcPr>
           <w:p>
+            <w:pPr>
+              <w:spacing w:line="276" w:lineRule="auto" w:after="40"/>
+            </w:pPr>
             <w:r>
               <w:t>One reading exceeds a threshold</w:t>
             </w:r>
@@ -1341,6 +1374,9 @@
             <w:tcW w:type="dxa" w:w="3120"/>
           </w:tcPr>
           <w:p>
+            <w:pPr>
+              <w:spacing w:line="276" w:lineRule="auto" w:after="40"/>
+            </w:pPr>
             <w:r>
               <w:t>Follow the displayed response</w:t>
             </w:r>
@@ -1488,7 +1524,7 @@
       </w:r>
       <w:r>
         <w:rPr>
-          <w:rFonts w:ascii="Consolas" w:hAnsi="Consolas"/>
+          <w:rFonts w:ascii="DejaVu Sans Mono" w:hAnsi="DejaVu Sans Mono" w:eastAsia="DejaVu Sans Mono"/>
         </w:rPr>
         <w:t>http://sentinel.local</w:t>
       </w:r>
@@ -1571,7 +1607,7 @@
       </w:r>
       <w:r>
         <w:rPr>
-          <w:rFonts w:ascii="Consolas" w:hAnsi="Consolas"/>
+          <w:rFonts w:ascii="DejaVu Sans Mono" w:hAnsi="DejaVu Sans Mono" w:eastAsia="DejaVu Sans Mono"/>
         </w:rPr>
         <w:t>docs/</w:t>
       </w:r>
@@ -1627,7 +1663,7 @@
       </w:r>
       <w:r>
         <w:rPr>
-          <w:rFonts w:ascii="Consolas" w:hAnsi="Consolas"/>
+          <w:rFonts w:ascii="DejaVu Sans Mono" w:hAnsi="DejaVu Sans Mono" w:eastAsia="DejaVu Sans Mono"/>
         </w:rPr>
         <w:t>docs/</w:t>
       </w:r>
@@ -1743,6 +1779,9 @@
             <w:shd w:fill="075E54"/>
           </w:tcPr>
           <w:p>
+            <w:pPr>
+              <w:spacing w:line="276" w:lineRule="auto" w:after="40"/>
+            </w:pPr>
             <w:r>
               <w:rPr>
                 <w:b/>
@@ -1758,6 +1797,9 @@
             <w:shd w:fill="075E54"/>
           </w:tcPr>
           <w:p>
+            <w:pPr>
+              <w:spacing w:line="276" w:lineRule="auto" w:after="40"/>
+            </w:pPr>
             <w:r>
               <w:rPr>
                 <w:b/>
@@ -1774,6 +1816,9 @@
             <w:tcW w:type="dxa" w:w="4680"/>
           </w:tcPr>
           <w:p>
+            <w:pPr>
+              <w:spacing w:line="276" w:lineRule="auto" w:after="40"/>
+            </w:pPr>
             <w:r>
               <w:t>Decide what readers need and what belongs in scope</w:t>
             </w:r>
@@ -1784,6 +1829,9 @@
             <w:tcW w:type="dxa" w:w="4680"/>
           </w:tcPr>
           <w:p>
+            <w:pPr>
+              <w:spacing w:line="276" w:lineRule="auto" w:after="40"/>
+            </w:pPr>
             <w:r>
               <w:t>Confirm every configured navigation file exists</w:t>
             </w:r>
@@ -1796,6 +1844,9 @@
             <w:tcW w:type="dxa" w:w="4680"/>
           </w:tcPr>
           <w:p>
+            <w:pPr>
+              <w:spacing w:line="276" w:lineRule="auto" w:after="40"/>
+            </w:pPr>
             <w:r>
               <w:t>Verify technical meaning and release accuracy</w:t>
             </w:r>
@@ -1806,6 +1857,9 @@
             <w:tcW w:type="dxa" w:w="4680"/>
           </w:tcPr>
           <w:p>
+            <w:pPr>
+              <w:spacing w:line="276" w:lineRule="auto" w:after="40"/>
+            </w:pPr>
             <w:r>
               <w:t>Detect missing pages, files, links, and anchors</w:t>
             </w:r>
@@ -1818,6 +1872,9 @@
             <w:tcW w:type="dxa" w:w="4680"/>
           </w:tcPr>
           <w:p>
+            <w:pPr>
+              <w:spacing w:line="276" w:lineRule="auto" w:after="40"/>
+            </w:pPr>
             <w:r>
               <w:t>Write procedures, explanations, warnings, and troubleshooting guidance</w:t>
             </w:r>
@@ -1828,6 +1885,9 @@
             <w:tcW w:type="dxa" w:w="4680"/>
           </w:tcPr>
           <w:p>
+            <w:pPr>
+              <w:spacing w:line="276" w:lineRule="auto" w:after="40"/>
+            </w:pPr>
             <w:r>
               <w:t>Enforce basic heading, image-text, and link-label rules</w:t>
             </w:r>
@@ -1840,6 +1900,9 @@
             <w:tcW w:type="dxa" w:w="4680"/>
           </w:tcPr>
           <w:p>
+            <w:pPr>
+              <w:spacing w:line="276" w:lineRule="auto" w:after="40"/>
+            </w:pPr>
             <w:r>
               <w:t>Decide whether a table, note, example, or cross-reference helps</w:t>
             </w:r>
@@ -1850,6 +1913,9 @@
             <w:tcW w:type="dxa" w:w="4680"/>
           </w:tcPr>
           <w:p>
+            <w:pPr>
+              <w:spacing w:line="276" w:lineRule="auto" w:after="40"/>
+            </w:pPr>
             <w:r>
               <w:t>Build the Zensical HTML site from Markdown</w:t>
             </w:r>
@@ -1862,6 +1928,9 @@
             <w:tcW w:type="dxa" w:w="4680"/>
           </w:tcPr>
           <w:p>
+            <w:pPr>
+              <w:spacing w:line="276" w:lineRule="auto" w:after="40"/>
+            </w:pPr>
             <w:r>
               <w:t>Review accessibility, usability, and visual quality</w:t>
             </w:r>
@@ -1872,6 +1941,9 @@
             <w:tcW w:type="dxa" w:w="4680"/>
           </w:tcPr>
           <w:p>
+            <w:pPr>
+              <w:spacing w:line="276" w:lineRule="auto" w:after="40"/>
+            </w:pPr>
             <w:r>
               <w:t>Generate the Word handbook and convert it to PDF</w:t>
             </w:r>
@@ -1884,6 +1956,9 @@
             <w:tcW w:type="dxa" w:w="4680"/>
           </w:tcPr>
           <w:p>
+            <w:pPr>
+              <w:spacing w:line="276" w:lineRule="auto" w:after="40"/>
+            </w:pPr>
             <w:r>
               <w:t>Approve the change</w:t>
             </w:r>
@@ -1894,6 +1969,9 @@
             <w:tcW w:type="dxa" w:w="4680"/>
           </w:tcPr>
           <w:p>
+            <w:pPr>
+              <w:spacing w:line="276" w:lineRule="auto" w:after="40"/>
+            </w:pPr>
             <w:r>
               <w:t>Check that expected artifacts exist and deploy the site</w:t>
             </w:r>
@@ -1917,7 +1995,7 @@
     <w:p>
       <w:r>
         <w:rPr>
-          <w:rFonts w:ascii="Consolas" w:hAnsi="Consolas"/>
+          <w:rFonts w:ascii="DejaVu Sans Mono" w:hAnsi="DejaVu Sans Mono" w:eastAsia="DejaVu Sans Mono"/>
         </w:rPr>
         <w:t>zensical.toml</w:t>
       </w:r>
@@ -1926,7 +2004,7 @@
       </w:r>
       <w:r>
         <w:rPr>
-          <w:rFonts w:ascii="Consolas" w:hAnsi="Consolas"/>
+          <w:rFonts w:ascii="DejaVu Sans Mono" w:hAnsi="DejaVu Sans Mono" w:eastAsia="DejaVu Sans Mono"/>
         </w:rPr>
         <w:t>nav</w:t>
       </w:r>
@@ -1948,7 +2026,7 @@
       </w:r>
       <w:r>
         <w:rPr>
-          <w:rFonts w:ascii="Consolas" w:hAnsi="Consolas"/>
+          <w:rFonts w:ascii="DejaVu Sans Mono" w:hAnsi="DejaVu Sans Mono" w:eastAsia="DejaVu Sans Mono"/>
         </w:rPr>
         <w:t>decision-states</w:t>
       </w:r>
@@ -1967,7 +2045,7 @@
       </w:r>
       <w:r>
         <w:rPr>
-          <w:rFonts w:ascii="Consolas" w:hAnsi="Consolas"/>
+          <w:rFonts w:ascii="DejaVu Sans Mono" w:hAnsi="DejaVu Sans Mono" w:eastAsia="DejaVu Sans Mono"/>
         </w:rPr>
         <w:t>scripts/validate_docs.py</w:t>
       </w:r>
@@ -2012,7 +2090,7 @@
       </w:r>
       <w:r>
         <w:rPr>
-          <w:rFonts w:ascii="Consolas" w:hAnsi="Consolas"/>
+          <w:rFonts w:ascii="DejaVu Sans Mono" w:hAnsi="DejaVu Sans Mono" w:eastAsia="DejaVu Sans Mono"/>
         </w:rPr>
         <w:t>architecture.md#decision-states</w:t>
       </w:r>
@@ -2063,7 +2141,7 @@
       </w:r>
       <w:r>
         <w:rPr>
-          <w:rFonts w:ascii="Consolas" w:hAnsi="Consolas"/>
+          <w:rFonts w:ascii="DejaVu Sans Mono" w:hAnsi="DejaVu Sans Mono" w:eastAsia="DejaVu Sans Mono"/>
         </w:rPr>
         <w:t>!!! info</w:t>
       </w:r>
@@ -2100,7 +2178,7 @@
       </w:r>
       <w:r>
         <w:rPr>
-          <w:rFonts w:ascii="Consolas" w:hAnsi="Consolas"/>
+          <w:rFonts w:ascii="DejaVu Sans Mono" w:hAnsi="DejaVu Sans Mono" w:eastAsia="DejaVu Sans Mono"/>
         </w:rPr>
         <w:t>zensical.toml</w:t>
       </w:r>
@@ -2147,7 +2225,7 @@
     <w:p>
       <w:r>
         <w:rPr>
-          <w:rFonts w:ascii="Consolas" w:hAnsi="Consolas"/>
+          <w:rFonts w:ascii="DejaVu Sans Mono" w:hAnsi="DejaVu Sans Mono" w:eastAsia="DejaVu Sans Mono"/>
         </w:rPr>
         <w:t>docs/assets/stylesheets/brand-2026.css</w:t>
       </w:r>
@@ -2156,7 +2234,7 @@
       </w:r>
       <w:r>
         <w:rPr>
-          <w:rFonts w:ascii="Consolas" w:hAnsi="Consolas"/>
+          <w:rFonts w:ascii="DejaVu Sans Mono" w:hAnsi="DejaVu Sans Mono" w:eastAsia="DejaVu Sans Mono"/>
         </w:rPr>
         <w:t>docs/assets/images/mark.svg</w:t>
       </w:r>
@@ -2185,7 +2263,7 @@
     <w:p>
       <w:r>
         <w:rPr>
-          <w:rFonts w:ascii="Consolas" w:hAnsi="Consolas"/>
+          <w:rFonts w:ascii="DejaVu Sans Mono" w:hAnsi="DejaVu Sans Mono" w:eastAsia="DejaVu Sans Mono"/>
         </w:rPr>
         <w:t>scripts/validate_docs.py</w:t>
       </w:r>
@@ -2244,7 +2322,7 @@
     <w:p>
       <w:r>
         <w:rPr>
-          <w:rFonts w:ascii="Consolas" w:hAnsi="Consolas"/>
+          <w:rFonts w:ascii="DejaVu Sans Mono" w:hAnsi="DejaVu Sans Mono" w:eastAsia="DejaVu Sans Mono"/>
         </w:rPr>
         <w:t>zensical build --strict</w:t>
       </w:r>
@@ -2263,7 +2341,7 @@
     <w:p>
       <w:r>
         <w:rPr>
-          <w:rFonts w:ascii="Consolas" w:hAnsi="Consolas"/>
+          <w:rFonts w:ascii="DejaVu Sans Mono" w:hAnsi="DejaVu Sans Mono" w:eastAsia="DejaVu Sans Mono"/>
         </w:rPr>
         <w:t>.github/workflows/docs.yml</w:t>
       </w:r>
@@ -2285,7 +2363,7 @@
       </w:r>
       <w:r>
         <w:rPr>
-          <w:rFonts w:ascii="Consolas" w:hAnsi="Consolas"/>
+          <w:rFonts w:ascii="DejaVu Sans Mono" w:hAnsi="DejaVu Sans Mono" w:eastAsia="DejaVu Sans Mono"/>
         </w:rPr>
         <w:t>scripts/export_handbook.py</w:t>
       </w:r>
@@ -2494,7 +2572,7 @@
       </w:r>
       <w:r>
         <w:rPr>
-          <w:rFonts w:ascii="Consolas" w:hAnsi="Consolas"/>
+          <w:rFonts w:ascii="DejaVu Sans Mono" w:hAnsi="DejaVu Sans Mono" w:eastAsia="DejaVu Sans Mono"/>
         </w:rPr>
         <w:t>site/</w:t>
       </w:r>
@@ -2503,7 +2581,7 @@
       </w:r>
       <w:r>
         <w:rPr>
-          <w:rFonts w:ascii="Consolas" w:hAnsi="Consolas"/>
+          <w:rFonts w:ascii="DejaVu Sans Mono" w:hAnsi="DejaVu Sans Mono" w:eastAsia="DejaVu Sans Mono"/>
         </w:rPr>
         <w:t>deliverables/</w:t>
       </w:r>
@@ -2552,7 +2630,7 @@
       </w:r>
       <w:r>
         <w:rPr>
-          <w:rFonts w:ascii="Consolas" w:hAnsi="Consolas"/>
+          <w:rFonts w:ascii="DejaVu Sans Mono" w:hAnsi="DejaVu Sans Mono" w:eastAsia="DejaVu Sans Mono"/>
         </w:rPr>
         <w:t>nav</w:t>
       </w:r>
@@ -2561,7 +2639,7 @@
       </w:r>
       <w:r>
         <w:rPr>
-          <w:rFonts w:ascii="Consolas" w:hAnsi="Consolas"/>
+          <w:rFonts w:ascii="DejaVu Sans Mono" w:hAnsi="DejaVu Sans Mono" w:eastAsia="DejaVu Sans Mono"/>
         </w:rPr>
         <w:t>zensical.toml</w:t>
       </w:r>
@@ -2583,7 +2661,7 @@
       </w:r>
       <w:r>
         <w:rPr>
-          <w:rFonts w:ascii="Consolas" w:hAnsi="Consolas"/>
+          <w:rFonts w:ascii="DejaVu Sans Mono" w:hAnsi="DejaVu Sans Mono" w:eastAsia="DejaVu Sans Mono"/>
         </w:rPr>
         <w:t>requirements.txt</w:t>
       </w:r>
@@ -2592,7 +2670,7 @@
       </w:r>
       <w:r>
         <w:rPr>
-          <w:rFonts w:ascii="Consolas" w:hAnsi="Consolas"/>
+          <w:rFonts w:ascii="DejaVu Sans Mono" w:hAnsi="DejaVu Sans Mono" w:eastAsia="DejaVu Sans Mono"/>
         </w:rPr>
         <w:t>zensical.toml</w:t>
       </w:r>
@@ -2624,7 +2702,7 @@
       </w:pPr>
       <w:r>
         <w:rPr>
-          <w:rFonts w:ascii="Consolas" w:hAnsi="Consolas"/>
+          <w:rFonts w:ascii="DejaVu Sans Mono" w:hAnsi="DejaVu Sans Mono" w:eastAsia="DejaVu Sans Mono"/>
         </w:rPr>
         <w:t>quickstart.md</w:t>
       </w:r>
@@ -2639,7 +2717,7 @@
       </w:pPr>
       <w:r>
         <w:rPr>
-          <w:rFonts w:ascii="Consolas" w:hAnsi="Consolas"/>
+          <w:rFonts w:ascii="DejaVu Sans Mono" w:hAnsi="DejaVu Sans Mono" w:eastAsia="DejaVu Sans Mono"/>
         </w:rPr>
         <w:t>operations.md</w:t>
       </w:r>
@@ -2654,7 +2732,7 @@
       </w:pPr>
       <w:r>
         <w:rPr>
-          <w:rFonts w:ascii="Consolas" w:hAnsi="Consolas"/>
+          <w:rFonts w:ascii="DejaVu Sans Mono" w:hAnsi="DejaVu Sans Mono" w:eastAsia="DejaVu Sans Mono"/>
         </w:rPr>
         <w:t>architecture.md</w:t>
       </w:r>
@@ -2669,7 +2747,7 @@
       </w:pPr>
       <w:r>
         <w:rPr>
-          <w:rFonts w:ascii="Consolas" w:hAnsi="Consolas"/>
+          <w:rFonts w:ascii="DejaVu Sans Mono" w:hAnsi="DejaVu Sans Mono" w:eastAsia="DejaVu Sans Mono"/>
         </w:rPr>
         <w:t>troubleshooting.md</w:t>
       </w:r>
@@ -2735,7 +2813,7 @@
       </w:r>
       <w:r>
         <w:rPr>
-          <w:rFonts w:ascii="Consolas" w:hAnsi="Consolas"/>
+          <w:rFonts w:ascii="DejaVu Sans Mono" w:hAnsi="DejaVu Sans Mono" w:eastAsia="DejaVu Sans Mono"/>
         </w:rPr>
         <w:t>!!! info</w:t>
       </w:r>
@@ -2757,7 +2835,7 @@
       </w:r>
       <w:r>
         <w:rPr>
-          <w:rFonts w:ascii="Consolas" w:hAnsi="Consolas"/>
+          <w:rFonts w:ascii="DejaVu Sans Mono" w:hAnsi="DejaVu Sans Mono" w:eastAsia="DejaVu Sans Mono"/>
         </w:rPr>
         <w:t>scripts/validate_docs.py</w:t>
       </w:r>
@@ -2766,7 +2844,7 @@
       </w:r>
       <w:r>
         <w:rPr>
-          <w:rFonts w:ascii="Consolas" w:hAnsi="Consolas"/>
+          <w:rFonts w:ascii="DejaVu Sans Mono" w:hAnsi="DejaVu Sans Mono" w:eastAsia="DejaVu Sans Mono"/>
         </w:rPr>
         <w:t>zensical.toml</w:t>
       </w:r>
@@ -2793,7 +2871,7 @@
       </w:r>
       <w:r>
         <w:rPr>
-          <w:rFonts w:ascii="Consolas" w:hAnsi="Consolas"/>
+          <w:rFonts w:ascii="DejaVu Sans Mono" w:hAnsi="DejaVu Sans Mono" w:eastAsia="DejaVu Sans Mono"/>
         </w:rPr>
         <w:t>docs/assets/stylesheets/brand-2026.css</w:t>
       </w:r>
@@ -2815,7 +2893,7 @@
       </w:r>
       <w:r>
         <w:rPr>
-          <w:rFonts w:ascii="Consolas" w:hAnsi="Consolas"/>
+          <w:rFonts w:ascii="DejaVu Sans Mono" w:hAnsi="DejaVu Sans Mono" w:eastAsia="DejaVu Sans Mono"/>
         </w:rPr>
         <w:t>scripts/export_handbook.py</w:t>
       </w:r>
@@ -2824,7 +2902,7 @@
       </w:r>
       <w:r>
         <w:rPr>
-          <w:rFonts w:ascii="Consolas" w:hAnsi="Consolas"/>
+          <w:rFonts w:ascii="DejaVu Sans Mono" w:hAnsi="DejaVu Sans Mono" w:eastAsia="DejaVu Sans Mono"/>
         </w:rPr>
         <w:t>PAGE</w:t>
       </w:r>
@@ -2833,7 +2911,7 @@
       </w:r>
       <w:r>
         <w:rPr>
-          <w:rFonts w:ascii="Consolas" w:hAnsi="Consolas"/>
+          <w:rFonts w:ascii="DejaVu Sans Mono" w:hAnsi="DejaVu Sans Mono" w:eastAsia="DejaVu Sans Mono"/>
         </w:rPr>
         <w:t>NUMPAGES</w:t>
       </w:r>
@@ -2877,7 +2955,7 @@
       </w:r>
       <w:r>
         <w:rPr>
-          <w:rFonts w:ascii="Consolas" w:hAnsi="Consolas"/>
+          <w:rFonts w:ascii="DejaVu Sans Mono" w:hAnsi="DejaVu Sans Mono" w:eastAsia="DejaVu Sans Mono"/>
         </w:rPr>
         <w:t>.github/workflows/docs.yml</w:t>
       </w:r>
@@ -2917,7 +2995,7 @@
       </w:r>
       <w:r>
         <w:rPr>
-          <w:rFonts w:ascii="Consolas" w:hAnsi="Consolas"/>
+          <w:rFonts w:ascii="DejaVu Sans Mono" w:hAnsi="DejaVu Sans Mono" w:eastAsia="DejaVu Sans Mono"/>
         </w:rPr>
         <w:t>scripts/validate_docs.py</w:t>
       </w:r>
@@ -2944,7 +3022,7 @@
       </w:r>
       <w:r>
         <w:rPr>
-          <w:rFonts w:ascii="Consolas" w:hAnsi="Consolas"/>
+          <w:rFonts w:ascii="DejaVu Sans Mono" w:hAnsi="DejaVu Sans Mono" w:eastAsia="DejaVu Sans Mono"/>
         </w:rPr>
         <w:t>scripts/export_handbook.py</w:t>
       </w:r>
@@ -2998,7 +3076,7 @@
       </w:r>
       <w:r>
         <w:rPr>
-          <w:rFonts w:ascii="Consolas" w:hAnsi="Consolas"/>
+          <w:rFonts w:ascii="DejaVu Sans Mono" w:hAnsi="DejaVu Sans Mono" w:eastAsia="DejaVu Sans Mono"/>
         </w:rPr>
         <w:t>main</w:t>
       </w:r>
@@ -3030,7 +3108,7 @@
       </w:r>
       <w:r>
         <w:rPr>
-          <w:rFonts w:ascii="Consolas" w:hAnsi="Consolas"/>
+          <w:rFonts w:ascii="DejaVu Sans Mono" w:hAnsi="DejaVu Sans Mono" w:eastAsia="DejaVu Sans Mono"/>
         </w:rPr>
         <w:t>site/</w:t>
       </w:r>
@@ -3039,7 +3117,7 @@
       </w:r>
       <w:r>
         <w:rPr>
-          <w:rFonts w:ascii="Consolas" w:hAnsi="Consolas"/>
+          <w:rFonts w:ascii="DejaVu Sans Mono" w:hAnsi="DejaVu Sans Mono" w:eastAsia="DejaVu Sans Mono"/>
         </w:rPr>
         <w:t>scrollWidth &lt;= clientWidth</w:t>
       </w:r>
@@ -3074,7 +3152,7 @@
       </w:r>
       <w:r>
         <w:rPr>
-          <w:rFonts w:ascii="Consolas" w:hAnsi="Consolas"/>
+          <w:rFonts w:ascii="DejaVu Sans Mono" w:hAnsi="DejaVu Sans Mono" w:eastAsia="DejaVu Sans Mono"/>
         </w:rPr>
         <w:t>main</w:t>
       </w:r>
@@ -3083,7 +3161,7 @@
       </w:r>
       <w:r>
         <w:rPr>
-          <w:rFonts w:ascii="Consolas" w:hAnsi="Consolas"/>
+          <w:rFonts w:ascii="DejaVu Sans Mono" w:hAnsi="DejaVu Sans Mono" w:eastAsia="DejaVu Sans Mono"/>
         </w:rPr>
         <w:t>greenhouse-sentinel-docs</w:t>
       </w:r>
@@ -3092,7 +3170,7 @@
       </w:r>
       <w:r>
         <w:rPr>
-          <w:rFonts w:ascii="Consolas" w:hAnsi="Consolas"/>
+          <w:rFonts w:ascii="DejaVu Sans Mono" w:hAnsi="DejaVu Sans Mono" w:eastAsia="DejaVu Sans Mono"/>
         </w:rPr>
         <w:t>site/</w:t>
       </w:r>
@@ -3157,7 +3235,7 @@
       </w:r>
       <w:r>
         <w:rPr>
-          <w:rFonts w:ascii="Consolas" w:hAnsi="Consolas"/>
+          <w:rFonts w:ascii="DejaVu Sans Mono" w:hAnsi="DejaVu Sans Mono" w:eastAsia="DejaVu Sans Mono"/>
         </w:rPr>
         <w:t>docs/</w:t>
       </w:r>
@@ -3166,7 +3244,7 @@
       </w:r>
       <w:r>
         <w:rPr>
-          <w:rFonts w:ascii="Consolas" w:hAnsi="Consolas"/>
+          <w:rFonts w:ascii="DejaVu Sans Mono" w:hAnsi="DejaVu Sans Mono" w:eastAsia="DejaVu Sans Mono"/>
         </w:rPr>
         <w:t>site/</w:t>
       </w:r>
@@ -3184,7 +3262,7 @@
       </w:r>
       <w:r>
         <w:rPr>
-          <w:rFonts w:ascii="Consolas" w:hAnsi="Consolas"/>
+          <w:rFonts w:ascii="DejaVu Sans Mono" w:hAnsi="DejaVu Sans Mono" w:eastAsia="DejaVu Sans Mono"/>
         </w:rPr>
         <w:t>zensical.toml</w:t>
       </w:r>
@@ -3232,7 +3310,7 @@
       </w:r>
       <w:r>
         <w:rPr>
-          <w:rFonts w:ascii="Consolas" w:hAnsi="Consolas"/>
+          <w:rFonts w:ascii="DejaVu Sans Mono" w:hAnsi="DejaVu Sans Mono" w:eastAsia="DejaVu Sans Mono"/>
         </w:rPr>
         <w:t>python scripts/validate_docs.py</w:t>
       </w:r>
@@ -3343,7 +3421,7 @@
       </w:r>
       <w:r>
         <w:rPr>
-          <w:rFonts w:ascii="Consolas" w:hAnsi="Consolas"/>
+          <w:rFonts w:ascii="DejaVu Sans Mono" w:hAnsi="DejaVu Sans Mono" w:eastAsia="DejaVu Sans Mono"/>
         </w:rPr>
         <w:t>main</w:t>
       </w:r>
@@ -3396,7 +3474,7 @@
       </w:r>
       <w:r>
         <w:rPr>
-          <w:rFonts w:ascii="Consolas" w:hAnsi="Consolas"/>
+          <w:rFonts w:ascii="DejaVu Sans Mono" w:hAnsi="DejaVu Sans Mono" w:eastAsia="DejaVu Sans Mono"/>
         </w:rPr>
         <w:t>docs/assets/stylesheets/brand-2026.css</w:t>
       </w:r>
@@ -3414,7 +3492,7 @@
       </w:r>
       <w:r>
         <w:rPr>
-          <w:rFonts w:ascii="Consolas" w:hAnsi="Consolas"/>
+          <w:rFonts w:ascii="DejaVu Sans Mono" w:hAnsi="DejaVu Sans Mono" w:eastAsia="DejaVu Sans Mono"/>
         </w:rPr>
         <w:t>:root</w:t>
       </w:r>
@@ -3432,7 +3510,7 @@
       </w:r>
       <w:r>
         <w:rPr>
-          <w:rFonts w:ascii="Consolas" w:hAnsi="Consolas"/>
+          <w:rFonts w:ascii="DejaVu Sans Mono" w:hAnsi="DejaVu Sans Mono" w:eastAsia="DejaVu Sans Mono"/>
         </w:rPr>
         <w:t>docs/assets/images/mark.svg</w:t>
       </w:r>
@@ -3450,7 +3528,7 @@
       </w:r>
       <w:r>
         <w:rPr>
-          <w:rFonts w:ascii="Consolas" w:hAnsi="Consolas"/>
+          <w:rFonts w:ascii="DejaVu Sans Mono" w:hAnsi="DejaVu Sans Mono" w:eastAsia="DejaVu Sans Mono"/>
         </w:rPr>
         <w:t>site_name</w:t>
       </w:r>
@@ -3459,7 +3537,7 @@
       </w:r>
       <w:r>
         <w:rPr>
-          <w:rFonts w:ascii="Consolas" w:hAnsi="Consolas"/>
+          <w:rFonts w:ascii="DejaVu Sans Mono" w:hAnsi="DejaVu Sans Mono" w:eastAsia="DejaVu Sans Mono"/>
         </w:rPr>
         <w:t>site_author</w:t>
       </w:r>
@@ -3468,7 +3546,7 @@
       </w:r>
       <w:r>
         <w:rPr>
-          <w:rFonts w:ascii="Consolas" w:hAnsi="Consolas"/>
+          <w:rFonts w:ascii="DejaVu Sans Mono" w:hAnsi="DejaVu Sans Mono" w:eastAsia="DejaVu Sans Mono"/>
         </w:rPr>
         <w:t>copyright</w:t>
       </w:r>
@@ -3477,7 +3555,7 @@
       </w:r>
       <w:r>
         <w:rPr>
-          <w:rFonts w:ascii="Consolas" w:hAnsi="Consolas"/>
+          <w:rFonts w:ascii="DejaVu Sans Mono" w:hAnsi="DejaVu Sans Mono" w:eastAsia="DejaVu Sans Mono"/>
         </w:rPr>
         <w:t>zensical.toml</w:t>
       </w:r>
@@ -3517,7 +3595,7 @@
       </w:r>
       <w:r>
         <w:rPr>
-          <w:rFonts w:ascii="Consolas" w:hAnsi="Consolas"/>
+          <w:rFonts w:ascii="DejaVu Sans Mono" w:hAnsi="DejaVu Sans Mono" w:eastAsia="DejaVu Sans Mono"/>
         </w:rPr>
         <w:t>--brand-primary</w:t>
       </w:r>
@@ -3526,7 +3604,7 @@
       </w:r>
       <w:r>
         <w:rPr>
-          <w:rFonts w:ascii="Consolas" w:hAnsi="Consolas"/>
+          <w:rFonts w:ascii="DejaVu Sans Mono" w:hAnsi="DejaVu Sans Mono" w:eastAsia="DejaVu Sans Mono"/>
         </w:rPr>
         <w:t>--brand-focus</w:t>
       </w:r>
@@ -3821,7 +3899,7 @@
       </w:r>
       <w:r>
         <w:rPr>
-          <w:rFonts w:ascii="Consolas" w:hAnsi="Consolas"/>
+          <w:rFonts w:ascii="DejaVu Sans Mono" w:hAnsi="DejaVu Sans Mono" w:eastAsia="DejaVu Sans Mono"/>
         </w:rPr>
         <w:t>python scripts/validate_docs.py</w:t>
       </w:r>
@@ -3860,7 +3938,7 @@
       </w:r>
       <w:r>
         <w:rPr>
-          <w:rFonts w:ascii="Consolas" w:hAnsi="Consolas"/>
+          <w:rFonts w:ascii="DejaVu Sans Mono" w:hAnsi="DejaVu Sans Mono" w:eastAsia="DejaVu Sans Mono"/>
         </w:rPr>
         <w:t>docs/</w:t>
       </w:r>
@@ -4058,7 +4136,7 @@
       </w:r>
       <w:r>
         <w:rPr>
-          <w:rFonts w:ascii="Consolas" w:hAnsi="Consolas"/>
+          <w:rFonts w:ascii="DejaVu Sans Mono" w:hAnsi="DejaVu Sans Mono" w:eastAsia="DejaVu Sans Mono"/>
         </w:rPr>
         <w:t>prefers-reduced-motion</w:t>
       </w:r>
@@ -4125,7 +4203,7 @@
       </w:r>
       <w:r>
         <w:rPr>
-          <w:rFonts w:ascii="Consolas" w:hAnsi="Consolas"/>
+          <w:rFonts w:ascii="DejaVu Sans Mono" w:hAnsi="DejaVu Sans Mono" w:eastAsia="DejaVu Sans Mono"/>
         </w:rPr>
         <w:t>zensical build --strict</w:t>
       </w:r>
@@ -4843,10 +4921,10 @@
     <w:qFormat/>
     <w:rsid w:val="00FC693F"/>
     <w:pPr>
-      <w:spacing w:after="140" w:line="276" w:lineRule="auto"/>
+      <w:spacing w:after="140" w:line="283" w:lineRule="auto"/>
     </w:pPr>
     <w:rPr>
-      <w:rFonts w:ascii="Aptos" w:hAnsi="Aptos"/>
+      <w:rFonts w:ascii="Carlito" w:hAnsi="Carlito" w:eastAsia="Carlito"/>
       <w:color w:val="16302B"/>
       <w:sz w:val="21"/>
     </w:rPr>
@@ -4887,6 +4965,11 @@
       </w:tabs>
       <w:spacing w:after="0" w:line="240" w:lineRule="auto"/>
     </w:pPr>
+    <w:rPr>
+      <w:rFonts w:ascii="Carlito" w:hAnsi="Carlito" w:eastAsia="Carlito"/>
+      <w:color w:val="16302B"/>
+      <w:sz w:val="18"/>
+    </w:rPr>
   </w:style>
   <w:style w:type="character" w:customStyle="1" w:styleId="FooterChar">
     <w:name w:val="Footer Char"/>
@@ -4906,11 +4989,11 @@
     <w:pPr>
       <w:keepNext/>
       <w:keepLines/>
-      <w:spacing w:before="240" w:after="120"/>
+      <w:spacing w:before="240" w:after="120" w:line="252" w:lineRule="auto"/>
       <w:outlineLvl w:val="0"/>
     </w:pPr>
     <w:rPr>
-      <w:rFonts w:asciiTheme="majorHAnsi" w:eastAsiaTheme="majorEastAsia" w:hAnsiTheme="majorHAnsi" w:cstheme="majorBidi" w:ascii="Aptos Display" w:hAnsi="Aptos Display"/>
+      <w:rFonts w:asciiTheme="majorHAnsi" w:eastAsiaTheme="majorEastAsia" w:hAnsiTheme="majorHAnsi" w:cstheme="majorBidi" w:ascii="Carlito" w:hAnsi="Carlito" w:eastAsia="Carlito"/>
       <w:b/>
       <w:bCs/>
       <w:color w:val="075E54"/>
@@ -4930,11 +5013,11 @@
     <w:pPr>
       <w:keepNext/>
       <w:keepLines/>
-      <w:spacing w:before="240" w:after="120"/>
+      <w:spacing w:before="240" w:after="120" w:line="252" w:lineRule="auto"/>
       <w:outlineLvl w:val="1"/>
     </w:pPr>
     <w:rPr>
-      <w:rFonts w:asciiTheme="majorHAnsi" w:eastAsiaTheme="majorEastAsia" w:hAnsiTheme="majorHAnsi" w:cstheme="majorBidi" w:ascii="Aptos Display" w:hAnsi="Aptos Display"/>
+      <w:rFonts w:asciiTheme="majorHAnsi" w:eastAsiaTheme="majorEastAsia" w:hAnsiTheme="majorHAnsi" w:cstheme="majorBidi" w:ascii="Carlito" w:hAnsi="Carlito" w:eastAsia="Carlito"/>
       <w:b/>
       <w:bCs/>
       <w:color w:val="075E54"/>
@@ -4954,11 +5037,11 @@
     <w:pPr>
       <w:keepNext/>
       <w:keepLines/>
-      <w:spacing w:before="240" w:after="120"/>
+      <w:spacing w:before="240" w:after="120" w:line="252" w:lineRule="auto"/>
       <w:outlineLvl w:val="2"/>
     </w:pPr>
     <w:rPr>
-      <w:rFonts w:asciiTheme="majorHAnsi" w:eastAsiaTheme="majorEastAsia" w:hAnsiTheme="majorHAnsi" w:cstheme="majorBidi" w:ascii="Aptos Display" w:hAnsi="Aptos Display"/>
+      <w:rFonts w:asciiTheme="majorHAnsi" w:eastAsiaTheme="majorEastAsia" w:hAnsiTheme="majorHAnsi" w:cstheme="majorBidi" w:ascii="Carlito" w:hAnsi="Carlito" w:eastAsia="Carlito"/>
       <w:b/>
       <w:bCs/>
       <w:color w:val="075E54"/>
@@ -5197,11 +5280,11 @@
       <w:pBdr>
         <w:bottom w:val="single" w:sz="8" w:space="4" w:color="4F81BD" w:themeColor="accent1"/>
       </w:pBdr>
-      <w:spacing w:after="120" w:line="240" w:lineRule="auto" w:before="240"/>
+      <w:spacing w:after="120" w:line="252" w:lineRule="auto" w:before="240"/>
       <w:contextualSpacing/>
     </w:pPr>
     <w:rPr>
-      <w:rFonts w:asciiTheme="majorHAnsi" w:eastAsiaTheme="majorEastAsia" w:hAnsiTheme="majorHAnsi" w:cstheme="majorBidi" w:ascii="Aptos Display" w:hAnsi="Aptos Display"/>
+      <w:rFonts w:asciiTheme="majorHAnsi" w:eastAsiaTheme="majorEastAsia" w:hAnsiTheme="majorHAnsi" w:cstheme="majorBidi" w:ascii="Carlito" w:hAnsi="Carlito" w:eastAsia="Carlito"/>
       <w:b/>
       <w:color w:val="075E54"/>
       <w:spacing w:val="5"/>
@@ -5380,8 +5463,14 @@
       <w:numPr>
         <w:numId w:val="1"/>
       </w:numPr>
+      <w:spacing w:line="276" w:lineRule="auto" w:after="40"/>
       <w:contextualSpacing/>
     </w:pPr>
+    <w:rPr>
+      <w:rFonts w:ascii="Carlito" w:hAnsi="Carlito" w:eastAsia="Carlito"/>
+      <w:color w:val="16302B"/>
+      <w:sz w:val="21"/>
+    </w:rPr>
   </w:style>
   <w:style w:type="paragraph" w:styleId="ListBullet2">
     <w:name w:val="List Bullet 2"/>
@@ -5419,8 +5508,14 @@
       <w:numPr>
         <w:numId w:val="5"/>
       </w:numPr>
+      <w:spacing w:line="276" w:lineRule="auto" w:after="40"/>
       <w:contextualSpacing/>
     </w:pPr>
+    <w:rPr>
+      <w:rFonts w:ascii="Carlito" w:hAnsi="Carlito" w:eastAsia="Carlito"/>
+      <w:color w:val="16302B"/>
+      <w:sz w:val="21"/>
+    </w:rPr>
   </w:style>
   <w:style w:type="paragraph" w:styleId="ListNumber2">
     <w:name w:val="List Number 2"/>
@@ -16543,7 +16638,7 @@
       <w:ind w:left="288"/>
     </w:pPr>
     <w:rPr>
-      <w:rFonts w:ascii="Consolas" w:hAnsi="Consolas"/>
+      <w:rFonts w:ascii="DejaVu Sans Mono" w:hAnsi="DejaVu Sans Mono" w:eastAsia="DejaVu Sans Mono"/>
       <w:sz w:val="17"/>
     </w:rPr>
   </w:style>

</xml_diff>

<commit_message>
Explain how each documentation feature helps
</commit_message>
<xml_diff>
--- a/deliverables/greenhouse-sentinel-handbook.docx
+++ b/deliverables/greenhouse-sentinel-handbook.docx
@@ -69,7 +69,7 @@
           <w:color w:val="075E54"/>
           <w:u w:val="single"/>
         </w:rPr>
-        <w:t>Start the product tour</w:t>
+        <w:t>Start the Product Tour</w:t>
       </w:r>
     </w:p>
     <w:p>
@@ -78,7 +78,7 @@
           <w:color w:val="075E54"/>
           <w:u w:val="single"/>
         </w:rPr>
-        <w:t>See how the repo works</w:t>
+        <w:t>See How the Repo Works</w:t>
       </w:r>
     </w:p>
     <w:p>
@@ -185,6 +185,11 @@
       </w:r>
     </w:p>
     <w:p>
+      <w:r>
+        <w:t>Each feature is implemented in the public repository, not merely described in the portfolio narrative.</w:t>
+      </w:r>
+    </w:p>
+    <w:p>
       <w:pPr>
         <w:pStyle w:val="ListBullet"/>
       </w:pPr>
@@ -192,24 +197,69 @@
         <w:rPr>
           <w:b/>
         </w:rPr>
-        <w:t>Single-source authoring:</w:t>
-      </w:r>
-      <w:r>
-        <w:t xml:space="preserve"> maintain content once in Markdown and generate the website, Word handbook, and PDF handbook together.</w:t>
-      </w:r>
-    </w:p>
-    <w:p>
-      <w:pPr>
-        <w:pStyle w:val="ListBullet"/>
-      </w:pPr>
+        <w:t>Single-Source Authoring.</w:t>
+      </w:r>
+      <w:r>
+        <w:t xml:space="preserve"> </w:t>
+      </w:r>
       <w:r>
         <w:rPr>
           <w:b/>
         </w:rPr>
-        <w:t>Explicit navigation:</w:t>
-      </w:r>
-      <w:r>
-        <w:t xml:space="preserve"> control page order and grouping in </w:t>
+        <w:t>Made with:</w:t>
+      </w:r>
+      <w:r>
+        <w:t xml:space="preserve"> one reviewed set of Markdown files under </w:t>
+      </w:r>
+      <w:r>
+        <w:rPr>
+          <w:rFonts w:ascii="DejaVu Sans Mono" w:hAnsi="DejaVu Sans Mono" w:eastAsia="DejaVu Sans Mono"/>
+        </w:rPr>
+        <w:t>docs/</w:t>
+      </w:r>
+      <w:r>
+        <w:t xml:space="preserve">. </w:t>
+      </w:r>
+      <w:r>
+        <w:rPr>
+          <w:b/>
+        </w:rPr>
+        <w:t>Why it helps:</w:t>
+      </w:r>
+      <w:r>
+        <w:t xml:space="preserve"> authors make a change once instead of reconciling separate website, Word, and PDF copies.</w:t>
+      </w:r>
+    </w:p>
+    <w:p>
+      <w:pPr>
+        <w:pStyle w:val="ListBullet"/>
+      </w:pPr>
+      <w:r>
+        <w:rPr>
+          <w:b/>
+        </w:rPr>
+        <w:t>Explicit Navigation.</w:t>
+      </w:r>
+      <w:r>
+        <w:t xml:space="preserve"> </w:t>
+      </w:r>
+      <w:r>
+        <w:rPr>
+          <w:b/>
+        </w:rPr>
+        <w:t>Made with:</w:t>
+      </w:r>
+      <w:r>
+        <w:t xml:space="preserve"> an ordered </w:t>
+      </w:r>
+      <w:r>
+        <w:rPr>
+          <w:rFonts w:ascii="DejaVu Sans Mono" w:hAnsi="DejaVu Sans Mono" w:eastAsia="DejaVu Sans Mono"/>
+        </w:rPr>
+        <w:t>nav</w:t>
+      </w:r>
+      <w:r>
+        <w:t xml:space="preserve"> list in </w:t>
       </w:r>
       <w:r>
         <w:rPr>
@@ -218,45 +268,58 @@
         <w:t>zensical.toml</w:t>
       </w:r>
       <w:r>
-        <w:t xml:space="preserve"> instead of relying on filenames.</w:t>
-      </w:r>
-    </w:p>
-    <w:p>
-      <w:pPr>
-        <w:pStyle w:val="ListBullet"/>
-      </w:pPr>
+        <w:t xml:space="preserve"> plus a check for unlisted pages. </w:t>
+      </w:r>
       <w:r>
         <w:rPr>
           <w:b/>
         </w:rPr>
-        <w:t>Stable cross-references:</w:t>
-      </w:r>
-      <w:r>
-        <w:t xml:space="preserve"> use deliberate anchors for important targets, as shown by </w:t>
+        <w:t>Why it helps:</w:t>
+      </w:r>
+      <w:r>
+        <w:t xml:space="preserve"> readers get a deliberate sequence, and reviewers can trace every published page to the configuration that includes it.</w:t>
+      </w:r>
+    </w:p>
+    <w:p>
+      <w:pPr>
+        <w:pStyle w:val="ListBullet"/>
+      </w:pPr>
+      <w:r>
+        <w:rPr>
+          <w:b/>
+        </w:rPr>
+        <w:t>Stable Cross-References.</w:t>
+      </w:r>
+      <w:r>
+        <w:t xml:space="preserve"> </w:t>
+      </w:r>
+      <w:r>
+        <w:rPr>
+          <w:b/>
+        </w:rPr>
+        <w:t>Made with:</w:t>
+      </w:r>
+      <w:r>
+        <w:t xml:space="preserve"> deliberate anchors on important targets, as shown by </w:t>
       </w:r>
       <w:r>
         <w:rPr>
           <w:color w:val="075E54"/>
           <w:u w:val="single"/>
         </w:rPr>
-        <w:t>Decision states</w:t>
-      </w:r>
-      <w:r>
-        <w:t>.</w:t>
-      </w:r>
-    </w:p>
-    <w:p>
-      <w:pPr>
-        <w:pStyle w:val="ListBullet"/>
-      </w:pPr>
+        <w:t>Decision States</w:t>
+      </w:r>
+      <w:r>
+        <w:t xml:space="preserve">, and automated fragment checks. </w:t>
+      </w:r>
       <w:r>
         <w:rPr>
           <w:b/>
         </w:rPr>
-        <w:t>Automated validation:</w:t>
-      </w:r>
-      <w:r>
-        <w:t xml:space="preserve"> detect missing navigation entries, files, internal links, anchors, headings, and image text before publication.</w:t>
+        <w:t>Why it helps:</w:t>
+      </w:r>
+      <w:r>
+        <w:t xml:space="preserve"> heading edits cannot silently strand important links.</w:t>
       </w:r>
     </w:p>
     <w:p>
@@ -267,38 +330,37 @@
         <w:rPr>
           <w:b/>
         </w:rPr>
-        <w:t>Continuous integration and publishing:</w:t>
-      </w:r>
-      <w:r>
-        <w:t xml:space="preserve"> run the same checks and builds for pull requests, then deploy approved changes through GitHub Actions.</w:t>
-      </w:r>
-    </w:p>
-    <w:p>
-      <w:pPr>
-        <w:pStyle w:val="ListBullet"/>
-      </w:pPr>
+        <w:t>Automated Validation.</w:t>
+      </w:r>
+      <w:r>
+        <w:t xml:space="preserve"> </w:t>
+      </w:r>
       <w:r>
         <w:rPr>
           <w:b/>
         </w:rPr>
-        <w:t>Accessible authoring:</w:t>
-      </w:r>
-      <w:r>
-        <w:t xml:space="preserve"> apply standards for headings, descriptive links, alternative text, tables, keyboard focus, readable sizing, zoom, and reduced motion.</w:t>
-      </w:r>
-    </w:p>
-    <w:p>
-      <w:pPr>
-        <w:pStyle w:val="ListBullet"/>
-      </w:pPr>
+        <w:t>Made with:</w:t>
+      </w:r>
+      <w:r>
+        <w:t xml:space="preserve"> </w:t>
+      </w:r>
+      <w:r>
+        <w:rPr>
+          <w:rFonts w:ascii="DejaVu Sans Mono" w:hAnsi="DejaVu Sans Mono" w:eastAsia="DejaVu Sans Mono"/>
+        </w:rPr>
+        <w:t>scripts/validate_docs.py</w:t>
+      </w:r>
+      <w:r>
+        <w:t xml:space="preserve">, which checks navigation, files, internal links, anchors, heading structure, and image text. </w:t>
+      </w:r>
       <w:r>
         <w:rPr>
           <w:b/>
         </w:rPr>
-        <w:t>Replaceable branding:</w:t>
-      </w:r>
-      <w:r>
-        <w:t xml:space="preserve"> change logos, colors, typography, and presentation rules without rewriting the Markdown source.</w:t>
+        <w:t>Why it helps:</w:t>
+      </w:r>
+      <w:r>
+        <w:t xml:space="preserve"> routine defects are found in seconds and resolved before publication rather than during manual review.</w:t>
       </w:r>
     </w:p>
     <w:p>
@@ -309,24 +371,156 @@
         <w:rPr>
           <w:b/>
         </w:rPr>
-        <w:t>Multi-format delivery:</w:t>
-      </w:r>
-      <w:r>
-        <w:t xml:space="preserve"> publish searchable HTML plus downloadable Word and PDF files for different reading needs.</w:t>
-      </w:r>
-    </w:p>
-    <w:p>
-      <w:pPr>
-        <w:pStyle w:val="ListBullet"/>
-      </w:pPr>
+        <w:t>Continuous Integration and Publishing.</w:t>
+      </w:r>
+      <w:r>
+        <w:t xml:space="preserve"> </w:t>
+      </w:r>
       <w:r>
         <w:rPr>
           <w:b/>
         </w:rPr>
-        <w:t>Self-documentation:</w:t>
-      </w:r>
-      <w:r>
-        <w:t xml:space="preserve"> explain the architecture, authoring process, automation, construction steps, and release checks inside the artifact itself.</w:t>
+        <w:t>Made with:</w:t>
+      </w:r>
+      <w:r>
+        <w:t xml:space="preserve"> a GitHub Actions workflow that repeats validation and generation from a clean copy of each proposed change. </w:t>
+      </w:r>
+      <w:r>
+        <w:rPr>
+          <w:b/>
+        </w:rPr>
+        <w:t>Why it helps:</w:t>
+      </w:r>
+      <w:r>
+        <w:t xml:space="preserve"> every release follows the same recorded process, which improves consistency, accuracy, and traceability.</w:t>
+      </w:r>
+    </w:p>
+    <w:p>
+      <w:pPr>
+        <w:pStyle w:val="ListBullet"/>
+      </w:pPr>
+      <w:r>
+        <w:rPr>
+          <w:b/>
+        </w:rPr>
+        <w:t>Accessible Authoring.</w:t>
+      </w:r>
+      <w:r>
+        <w:t xml:space="preserve"> </w:t>
+      </w:r>
+      <w:r>
+        <w:rPr>
+          <w:b/>
+        </w:rPr>
+        <w:t>Made with:</w:t>
+      </w:r>
+      <w:r>
+        <w:t xml:space="preserve"> source standards, validation rules, accessible theme overrides, and a release checklist. </w:t>
+      </w:r>
+      <w:r>
+        <w:rPr>
+          <w:b/>
+        </w:rPr>
+        <w:t>Why it helps:</w:t>
+      </w:r>
+      <w:r>
+        <w:t xml:space="preserve"> accessibility is addressed while content is written and reviewed instead of being treated as a late repair.</w:t>
+      </w:r>
+    </w:p>
+    <w:p>
+      <w:pPr>
+        <w:pStyle w:val="ListBullet"/>
+      </w:pPr>
+      <w:r>
+        <w:rPr>
+          <w:b/>
+        </w:rPr>
+        <w:t>Replaceable Branding.</w:t>
+      </w:r>
+      <w:r>
+        <w:t xml:space="preserve"> </w:t>
+      </w:r>
+      <w:r>
+        <w:rPr>
+          <w:b/>
+        </w:rPr>
+        <w:t>Made with:</w:t>
+      </w:r>
+      <w:r>
+        <w:t xml:space="preserve"> CSS variables, a separate logo asset, and publishing configuration outside the Markdown. </w:t>
+      </w:r>
+      <w:r>
+        <w:rPr>
+          <w:b/>
+        </w:rPr>
+        <w:t>Why it helps:</w:t>
+      </w:r>
+      <w:r>
+        <w:t xml:space="preserve"> an organization can change the visual identity without rewriting or forking the technical content.</w:t>
+      </w:r>
+    </w:p>
+    <w:p>
+      <w:pPr>
+        <w:pStyle w:val="ListBullet"/>
+      </w:pPr>
+      <w:r>
+        <w:rPr>
+          <w:b/>
+        </w:rPr>
+        <w:t>Multi-Format Delivery.</w:t>
+      </w:r>
+      <w:r>
+        <w:t xml:space="preserve"> </w:t>
+      </w:r>
+      <w:r>
+        <w:rPr>
+          <w:b/>
+        </w:rPr>
+        <w:t>Made with:</w:t>
+      </w:r>
+      <w:r>
+        <w:t xml:space="preserve"> Zensical for HTML, a Python export script for Word, and headless LibreOffice for PDF. </w:t>
+      </w:r>
+      <w:r>
+        <w:rPr>
+          <w:b/>
+        </w:rPr>
+        <w:t>Why it helps:</w:t>
+      </w:r>
+      <w:r>
+        <w:t xml:space="preserve"> teams serve web and portable-document readers without maintaining three competing sources.</w:t>
+      </w:r>
+    </w:p>
+    <w:p>
+      <w:pPr>
+        <w:pStyle w:val="ListBullet"/>
+      </w:pPr>
+      <w:r>
+        <w:rPr>
+          <w:b/>
+        </w:rPr>
+        <w:t>Self-Documentation.</w:t>
+      </w:r>
+      <w:r>
+        <w:t xml:space="preserve"> </w:t>
+      </w:r>
+      <w:r>
+        <w:rPr>
+          <w:b/>
+        </w:rPr>
+        <w:t>Made with:</w:t>
+      </w:r>
+      <w:r>
+        <w:t xml:space="preserve"> implementation notes, a complete build chapter, contributor guidance, and links to the actual configuration and scripts. </w:t>
+      </w:r>
+      <w:r>
+        <w:rPr>
+          <w:b/>
+        </w:rPr>
+        <w:t>Why it helps:</w:t>
+      </w:r>
+      <w:r>
+        <w:t xml:space="preserve"> another writer can inspect, explain, reproduce, or adapt the workflow without relying on undocumented setup knowledge.</w:t>
       </w:r>
     </w:p>
     <w:p>
@@ -338,10 +532,10 @@
           <w:color w:val="075E54"/>
           <w:u w:val="single"/>
         </w:rPr>
-        <w:t>How this repository works</w:t>
-      </w:r>
-      <w:r>
-        <w:t xml:space="preserve"> for an inspectable example of each feature.</w:t>
+        <w:t>How This Repository Works</w:t>
+      </w:r>
+      <w:r>
+        <w:t xml:space="preserve"> for a closer look at the implementation and benefit of each feature.</w:t>
       </w:r>
     </w:p>
     <w:p>
@@ -542,7 +736,7 @@
           <w:color w:val="075E54"/>
           <w:u w:val="single"/>
         </w:rPr>
-        <w:t>How this repository works</w:t>
+        <w:t>How This Repository Works</w:t>
       </w:r>
       <w:r>
         <w:t xml:space="preserve"> and </w:t>
@@ -552,7 +746,7 @@
           <w:color w:val="075E54"/>
           <w:u w:val="single"/>
         </w:rPr>
-        <w:t>Build it from scratch</w:t>
+        <w:t>Build It from Scratch</w:t>
       </w:r>
       <w:r>
         <w:t>.</w:t>
@@ -1587,7 +1781,7 @@
           <w:color w:val="075E54"/>
           <w:u w:val="single"/>
         </w:rPr>
-        <w:t>Build it from scratch</w:t>
+        <w:t>Build It from Scratch</w:t>
       </w:r>
       <w:r>
         <w:t>.</w:t>
@@ -2076,6 +2270,11 @@
       </w:r>
     </w:p>
     <w:p>
+      <w:r>
+        <w:t>Each example below identifies what readers can inspect, how the feature is produced, and why the implementation is useful.</w:t>
+      </w:r>
+    </w:p>
+    <w:p>
       <w:pPr>
         <w:pStyle w:val="ListBullet"/>
       </w:pPr>
@@ -2083,7 +2282,16 @@
         <w:rPr>
           <w:b/>
         </w:rPr>
-        <w:t>Cross-reference:</w:t>
+        <w:t>Cross-Reference.</w:t>
+      </w:r>
+      <w:r>
+        <w:t xml:space="preserve"> </w:t>
+      </w:r>
+      <w:r>
+        <w:rPr>
+          <w:b/>
+        </w:rPr>
+        <w:t>Made with:</w:t>
       </w:r>
       <w:r>
         <w:t xml:space="preserve"> the operating guide links to </w:t>
@@ -2095,21 +2303,16 @@
         <w:t>architecture.md#decision-states</w:t>
       </w:r>
       <w:r>
-        <w:t>. The explicit anchor is stable and validated.</w:t>
-      </w:r>
-    </w:p>
-    <w:p>
-      <w:pPr>
-        <w:pStyle w:val="ListBullet"/>
-      </w:pPr>
+        <w:t xml:space="preserve">, where a deliberate anchor marks the target. The validator resolves both the file and fragment. </w:t>
+      </w:r>
       <w:r>
         <w:rPr>
           <w:b/>
         </w:rPr>
-        <w:t>Descriptive link:</w:t>
-      </w:r>
-      <w:r>
-        <w:t xml:space="preserve"> the quick start names the troubleshooting symptom, which stays meaningful outside its surrounding sentence.</w:t>
+        <w:t>Why it helps:</w:t>
+      </w:r>
+      <w:r>
+        <w:t xml:space="preserve"> the link remains dependable when nearby headings are edited, and a failed target stops the release instead of surprising a reader.</w:t>
       </w:r>
     </w:p>
     <w:p>
@@ -2120,24 +2323,83 @@
         <w:rPr>
           <w:b/>
         </w:rPr>
-        <w:t>Semantic table:</w:t>
-      </w:r>
-      <w:r>
-        <w:t xml:space="preserve"> the architecture page uses a table only for repeated state, condition, and expectation fields. Exports preserve the header relationship.</w:t>
-      </w:r>
-    </w:p>
-    <w:p>
-      <w:pPr>
-        <w:pStyle w:val="ListBullet"/>
-      </w:pPr>
+        <w:t>Descriptive Link.</w:t>
+      </w:r>
+      <w:r>
+        <w:t xml:space="preserve"> </w:t>
+      </w:r>
       <w:r>
         <w:rPr>
           <w:b/>
         </w:rPr>
-        <w:t>Admonition:</w:t>
+        <w:t>Made with:</w:t>
+      </w:r>
+      <w:r>
+        <w:t xml:space="preserve"> the quick start names the troubleshooting symptom in the link text, and the validator rejects common context-free labels. </w:t>
+      </w:r>
+      <w:r>
+        <w:rPr>
+          <w:b/>
+        </w:rPr>
+        <w:t>Why it helps:</w:t>
+      </w:r>
+      <w:r>
+        <w:t xml:space="preserve"> readers, screen-reader users, and reviewers know the destination without having to reconstruct the surrounding sentence.</w:t>
+      </w:r>
+    </w:p>
+    <w:p>
+      <w:pPr>
+        <w:pStyle w:val="ListBullet"/>
+      </w:pPr>
+      <w:r>
+        <w:rPr>
+          <w:b/>
+        </w:rPr>
+        <w:t>Semantic Table.</w:t>
       </w:r>
       <w:r>
         <w:t xml:space="preserve"> </w:t>
+      </w:r>
+      <w:r>
+        <w:rPr>
+          <w:b/>
+        </w:rPr>
+        <w:t>Made with:</w:t>
+      </w:r>
+      <w:r>
+        <w:t xml:space="preserve"> the architecture page uses Markdown table syntax for repeated state, condition, and expectation fields. Zensical creates accessible HTML, and the export script creates a real Word table with a repeating header row. </w:t>
+      </w:r>
+      <w:r>
+        <w:rPr>
+          <w:b/>
+        </w:rPr>
+        <w:t>Why it helps:</w:t>
+      </w:r>
+      <w:r>
+        <w:t xml:space="preserve"> the relationship stays clear in the browser, Word, and PDF without maintaining format-specific tables.</w:t>
+      </w:r>
+    </w:p>
+    <w:p>
+      <w:pPr>
+        <w:pStyle w:val="ListBullet"/>
+      </w:pPr>
+      <w:r>
+        <w:rPr>
+          <w:b/>
+        </w:rPr>
+        <w:t>Admonition.</w:t>
+      </w:r>
+      <w:r>
+        <w:t xml:space="preserve"> </w:t>
+      </w:r>
+      <w:r>
+        <w:rPr>
+          <w:b/>
+        </w:rPr>
+        <w:t>Made with:</w:t>
+      </w:r>
+      <w:r>
+        <w:t xml:space="preserve"> a labeled </w:t>
       </w:r>
       <w:r>
         <w:rPr>
@@ -2146,21 +2408,16 @@
         <w:t>!!! info</w:t>
       </w:r>
       <w:r>
-        <w:t xml:space="preserve"> creates a visually distinct note while retaining a text label and readable source.</w:t>
-      </w:r>
-    </w:p>
-    <w:p>
-      <w:pPr>
-        <w:pStyle w:val="ListBullet"/>
-      </w:pPr>
+        <w:t xml:space="preserve"> block in Markdown and theme styling in the publishing layer. </w:t>
+      </w:r>
       <w:r>
         <w:rPr>
           <w:b/>
         </w:rPr>
-        <w:t>Code block:</w:t>
-      </w:r>
-      <w:r>
-        <w:t xml:space="preserve"> fenced blocks preserve commands and sample output. The site adds copy support, and the Word export applies a monospaced style.</w:t>
+        <w:t>Why it helps:</w:t>
+      </w:r>
+      <w:r>
+        <w:t xml:space="preserve"> important context stands out visually while retaining a readable text label and simple source that reviewers can understand.</w:t>
       </w:r>
     </w:p>
     <w:p>
@@ -2171,10 +2428,60 @@
         <w:rPr>
           <w:b/>
         </w:rPr>
-        <w:t>Explicit navigation:</w:t>
+        <w:t>Code Block.</w:t>
       </w:r>
       <w:r>
         <w:t xml:space="preserve"> </w:t>
+      </w:r>
+      <w:r>
+        <w:rPr>
+          <w:b/>
+        </w:rPr>
+        <w:t>Made with:</w:t>
+      </w:r>
+      <w:r>
+        <w:t xml:space="preserve"> fenced Markdown blocks, copy support in the site theme, and an explicit monospaced export style. </w:t>
+      </w:r>
+      <w:r>
+        <w:rPr>
+          <w:b/>
+        </w:rPr>
+        <w:t>Why it helps:</w:t>
+      </w:r>
+      <w:r>
+        <w:t xml:space="preserve"> commands and sample output preserve spacing across formats and are easier to copy without transcription errors.</w:t>
+      </w:r>
+    </w:p>
+    <w:p>
+      <w:pPr>
+        <w:pStyle w:val="ListBullet"/>
+      </w:pPr>
+      <w:r>
+        <w:rPr>
+          <w:b/>
+        </w:rPr>
+        <w:t>Explicit Navigation.</w:t>
+      </w:r>
+      <w:r>
+        <w:t xml:space="preserve"> </w:t>
+      </w:r>
+      <w:r>
+        <w:rPr>
+          <w:b/>
+        </w:rPr>
+        <w:t>Made with:</w:t>
+      </w:r>
+      <w:r>
+        <w:t xml:space="preserve"> the ordered </w:t>
+      </w:r>
+      <w:r>
+        <w:rPr>
+          <w:rFonts w:ascii="DejaVu Sans Mono" w:hAnsi="DejaVu Sans Mono" w:eastAsia="DejaVu Sans Mono"/>
+        </w:rPr>
+        <w:t>nav</w:t>
+      </w:r>
+      <w:r>
+        <w:t xml:space="preserve"> list in </w:t>
       </w:r>
       <w:r>
         <w:rPr>
@@ -2183,21 +2490,16 @@
         <w:t>zensical.toml</w:t>
       </w:r>
       <w:r>
-        <w:t xml:space="preserve"> controls order and labels. The validator detects both missing targets and unlisted pages.</w:t>
-      </w:r>
-    </w:p>
-    <w:p>
-      <w:pPr>
-        <w:pStyle w:val="ListBullet"/>
-      </w:pPr>
+        <w:t xml:space="preserve"> and validation that detects missing targets and maintained pages left out of navigation. </w:t>
+      </w:r>
       <w:r>
         <w:rPr>
           <w:b/>
         </w:rPr>
-        <w:t>Brand tokens:</w:t>
-      </w:r>
-      <w:r>
-        <w:t xml:space="preserve"> CSS variables change presentation globally while Markdown meaning and portable outputs remain intact.</w:t>
+        <w:t>Why it helps:</w:t>
+      </w:r>
+      <w:r>
+        <w:t xml:space="preserve"> information architecture is intentional, reviewable, and traceable instead of depending on filenames or renderer guesses.</w:t>
       </w:r>
     </w:p>
     <w:p>
@@ -2208,10 +2510,142 @@
         <w:rPr>
           <w:b/>
         </w:rPr>
-        <w:t>Multi-format publishing:</w:t>
-      </w:r>
-      <w:r>
-        <w:t xml:space="preserve"> the export script reads the same navigation order as the site, so the handbook is not a separately maintained copy.</w:t>
+        <w:t>Brand Tokens.</w:t>
+      </w:r>
+      <w:r>
+        <w:t xml:space="preserve"> </w:t>
+      </w:r>
+      <w:r>
+        <w:rPr>
+          <w:b/>
+        </w:rPr>
+        <w:t>Made with:</w:t>
+      </w:r>
+      <w:r>
+        <w:t xml:space="preserve"> purpose-based CSS variables and a separate logo asset outside the Markdown source. </w:t>
+      </w:r>
+      <w:r>
+        <w:rPr>
+          <w:b/>
+        </w:rPr>
+        <w:t>Why it helps:</w:t>
+      </w:r>
+      <w:r>
+        <w:t xml:space="preserve"> a team can rebrand the site quickly and consistently without risking changes to the technical meaning or portable documents.</w:t>
+      </w:r>
+    </w:p>
+    <w:p>
+      <w:pPr>
+        <w:pStyle w:val="ListBullet"/>
+      </w:pPr>
+      <w:r>
+        <w:rPr>
+          <w:b/>
+        </w:rPr>
+        <w:t>Automated Validation.</w:t>
+      </w:r>
+      <w:r>
+        <w:t xml:space="preserve"> </w:t>
+      </w:r>
+      <w:r>
+        <w:rPr>
+          <w:b/>
+        </w:rPr>
+        <w:t>Made with:</w:t>
+      </w:r>
+      <w:r>
+        <w:t xml:space="preserve"> a renderer-independent Python script that inspects navigation, headings, images, local files, links, and anchors before the build. </w:t>
+      </w:r>
+      <w:r>
+        <w:rPr>
+          <w:b/>
+        </w:rPr>
+        <w:t>Why it helps:</w:t>
+      </w:r>
+      <w:r>
+        <w:t xml:space="preserve"> repeatable checks finish quickly, free reviewers for judgment-heavy work, and leave an objective pass-or-fail record with each change.</w:t>
+      </w:r>
+    </w:p>
+    <w:p>
+      <w:pPr>
+        <w:pStyle w:val="ListBullet"/>
+      </w:pPr>
+      <w:r>
+        <w:rPr>
+          <w:b/>
+        </w:rPr>
+        <w:t>Continuous Integration.</w:t>
+      </w:r>
+      <w:r>
+        <w:t xml:space="preserve"> </w:t>
+      </w:r>
+      <w:r>
+        <w:rPr>
+          <w:b/>
+        </w:rPr>
+        <w:t>Made with:</w:t>
+      </w:r>
+      <w:r>
+        <w:t xml:space="preserve"> </w:t>
+      </w:r>
+      <w:r>
+        <w:rPr>
+          <w:rFonts w:ascii="DejaVu Sans Mono" w:hAnsi="DejaVu Sans Mono" w:eastAsia="DejaVu Sans Mono"/>
+        </w:rPr>
+        <w:t>.github/workflows/docs.yml</w:t>
+      </w:r>
+      <w:r>
+        <w:t xml:space="preserve">, which runs the same validation and publishing sequence for pull requests and accepted changes. </w:t>
+      </w:r>
+      <w:r>
+        <w:rPr>
+          <w:b/>
+        </w:rPr>
+        <w:t>Why it helps:</w:t>
+      </w:r>
+      <w:r>
+        <w:t xml:space="preserve"> the workflow catches environment-specific failures, proves which version was tested, and creates a traceable release history.</w:t>
+      </w:r>
+    </w:p>
+    <w:p>
+      <w:pPr>
+        <w:pStyle w:val="ListBullet"/>
+      </w:pPr>
+      <w:r>
+        <w:rPr>
+          <w:b/>
+        </w:rPr>
+        <w:t>Multi-Format Publishing.</w:t>
+      </w:r>
+      <w:r>
+        <w:t xml:space="preserve"> </w:t>
+      </w:r>
+      <w:r>
+        <w:rPr>
+          <w:b/>
+        </w:rPr>
+        <w:t>Made with:</w:t>
+      </w:r>
+      <w:r>
+        <w:t xml:space="preserve"> one navigation order, Zensical for the site, </w:t>
+      </w:r>
+      <w:r>
+        <w:rPr>
+          <w:rFonts w:ascii="DejaVu Sans Mono" w:hAnsi="DejaVu Sans Mono" w:eastAsia="DejaVu Sans Mono"/>
+        </w:rPr>
+        <w:t>scripts/export_handbook.py</w:t>
+      </w:r>
+      <w:r>
+        <w:t xml:space="preserve"> for Word, and headless LibreOffice for PDF. </w:t>
+      </w:r>
+      <w:r>
+        <w:rPr>
+          <w:b/>
+        </w:rPr>
+        <w:t>Why it helps:</w:t>
+      </w:r>
+      <w:r>
+        <w:t xml:space="preserve"> the website, Word handbook, and PDF stay synchronized while authors maintain only one source.</w:t>
       </w:r>
     </w:p>
     <w:p>

</xml_diff>

<commit_message>
Organize feature explanations as a semantic table
</commit_message>
<xml_diff>
--- a/deliverables/greenhouse-sentinel-handbook.docx
+++ b/deliverables/greenhouse-sentinel-handbook.docx
@@ -2271,383 +2271,490 @@
     </w:p>
     <w:p>
       <w:r>
-        <w:t>Each example below identifies what readers can inspect, how the feature is produced, and why the implementation is useful.</w:t>
-      </w:r>
-    </w:p>
-    <w:p>
-      <w:pPr>
-        <w:pStyle w:val="ListBullet"/>
-      </w:pPr>
-      <w:r>
-        <w:rPr>
-          <w:b/>
-        </w:rPr>
-        <w:t>Cross-Reference.</w:t>
-      </w:r>
-      <w:r>
-        <w:t xml:space="preserve"> </w:t>
-      </w:r>
-      <w:r>
-        <w:rPr>
-          <w:b/>
-        </w:rPr>
-        <w:t>Made with:</w:t>
-      </w:r>
-      <w:r>
-        <w:t xml:space="preserve"> the operating guide links to </w:t>
-      </w:r>
-      <w:r>
-        <w:rPr>
-          <w:rFonts w:ascii="DejaVu Sans Mono" w:hAnsi="DejaVu Sans Mono" w:eastAsia="DejaVu Sans Mono"/>
-        </w:rPr>
-        <w:t>architecture.md#decision-states</w:t>
-      </w:r>
-      <w:r>
-        <w:t xml:space="preserve">, where a deliberate anchor marks the target. The validator resolves both the file and fragment. </w:t>
-      </w:r>
-      <w:r>
-        <w:rPr>
-          <w:b/>
-        </w:rPr>
-        <w:t>Why it helps:</w:t>
-      </w:r>
-      <w:r>
-        <w:t xml:space="preserve"> the link remains dependable when nearby headings are edited, and a failed target stops the release instead of surprising a reader.</w:t>
-      </w:r>
-    </w:p>
-    <w:p>
-      <w:pPr>
-        <w:pStyle w:val="ListBullet"/>
-      </w:pPr>
-      <w:r>
-        <w:rPr>
-          <w:b/>
-        </w:rPr>
-        <w:t>Descriptive Link.</w:t>
-      </w:r>
-      <w:r>
-        <w:t xml:space="preserve"> </w:t>
-      </w:r>
-      <w:r>
-        <w:rPr>
-          <w:b/>
-        </w:rPr>
-        <w:t>Made with:</w:t>
-      </w:r>
-      <w:r>
-        <w:t xml:space="preserve"> the quick start names the troubleshooting symptom in the link text, and the validator rejects common context-free labels. </w:t>
-      </w:r>
-      <w:r>
-        <w:rPr>
-          <w:b/>
-        </w:rPr>
-        <w:t>Why it helps:</w:t>
-      </w:r>
-      <w:r>
-        <w:t xml:space="preserve"> readers, screen-reader users, and reviewers know the destination without having to reconstruct the surrounding sentence.</w:t>
-      </w:r>
-    </w:p>
-    <w:p>
-      <w:pPr>
-        <w:pStyle w:val="ListBullet"/>
-      </w:pPr>
-      <w:r>
-        <w:rPr>
-          <w:b/>
-        </w:rPr>
-        <w:t>Semantic Table.</w:t>
-      </w:r>
-      <w:r>
-        <w:t xml:space="preserve"> </w:t>
-      </w:r>
-      <w:r>
-        <w:rPr>
-          <w:b/>
-        </w:rPr>
-        <w:t>Made with:</w:t>
-      </w:r>
-      <w:r>
-        <w:t xml:space="preserve"> the architecture page uses Markdown table syntax for repeated state, condition, and expectation fields. Zensical creates accessible HTML, and the export script creates a real Word table with a repeating header row. </w:t>
-      </w:r>
-      <w:r>
-        <w:rPr>
-          <w:b/>
-        </w:rPr>
-        <w:t>Why it helps:</w:t>
-      </w:r>
-      <w:r>
-        <w:t xml:space="preserve"> the relationship stays clear in the browser, Word, and PDF without maintaining format-specific tables.</w:t>
-      </w:r>
-    </w:p>
-    <w:p>
-      <w:pPr>
-        <w:pStyle w:val="ListBullet"/>
-      </w:pPr>
-      <w:r>
-        <w:rPr>
-          <w:b/>
-        </w:rPr>
-        <w:t>Admonition.</w:t>
-      </w:r>
-      <w:r>
-        <w:t xml:space="preserve"> </w:t>
-      </w:r>
-      <w:r>
-        <w:rPr>
-          <w:b/>
-        </w:rPr>
-        <w:t>Made with:</w:t>
-      </w:r>
-      <w:r>
-        <w:t xml:space="preserve"> a labeled </w:t>
-      </w:r>
-      <w:r>
-        <w:rPr>
-          <w:rFonts w:ascii="DejaVu Sans Mono" w:hAnsi="DejaVu Sans Mono" w:eastAsia="DejaVu Sans Mono"/>
-        </w:rPr>
-        <w:t>!!! info</w:t>
-      </w:r>
-      <w:r>
-        <w:t xml:space="preserve"> block in Markdown and theme styling in the publishing layer. </w:t>
-      </w:r>
-      <w:r>
-        <w:rPr>
-          <w:b/>
-        </w:rPr>
-        <w:t>Why it helps:</w:t>
-      </w:r>
-      <w:r>
-        <w:t xml:space="preserve"> important context stands out visually while retaining a readable text label and simple source that reviewers can understand.</w:t>
-      </w:r>
-    </w:p>
-    <w:p>
-      <w:pPr>
-        <w:pStyle w:val="ListBullet"/>
-      </w:pPr>
-      <w:r>
-        <w:rPr>
-          <w:b/>
-        </w:rPr>
-        <w:t>Code Block.</w:t>
-      </w:r>
-      <w:r>
-        <w:t xml:space="preserve"> </w:t>
-      </w:r>
-      <w:r>
-        <w:rPr>
-          <w:b/>
-        </w:rPr>
-        <w:t>Made with:</w:t>
-      </w:r>
-      <w:r>
-        <w:t xml:space="preserve"> fenced Markdown blocks, copy support in the site theme, and an explicit monospaced export style. </w:t>
-      </w:r>
-      <w:r>
-        <w:rPr>
-          <w:b/>
-        </w:rPr>
-        <w:t>Why it helps:</w:t>
-      </w:r>
-      <w:r>
-        <w:t xml:space="preserve"> commands and sample output preserve spacing across formats and are easier to copy without transcription errors.</w:t>
-      </w:r>
-    </w:p>
-    <w:p>
-      <w:pPr>
-        <w:pStyle w:val="ListBullet"/>
-      </w:pPr>
-      <w:r>
-        <w:rPr>
-          <w:b/>
-        </w:rPr>
-        <w:t>Explicit Navigation.</w:t>
-      </w:r>
-      <w:r>
-        <w:t xml:space="preserve"> </w:t>
-      </w:r>
-      <w:r>
-        <w:rPr>
-          <w:b/>
-        </w:rPr>
-        <w:t>Made with:</w:t>
-      </w:r>
-      <w:r>
-        <w:t xml:space="preserve"> the ordered </w:t>
-      </w:r>
-      <w:r>
-        <w:rPr>
-          <w:rFonts w:ascii="DejaVu Sans Mono" w:hAnsi="DejaVu Sans Mono" w:eastAsia="DejaVu Sans Mono"/>
-        </w:rPr>
-        <w:t>nav</w:t>
-      </w:r>
-      <w:r>
-        <w:t xml:space="preserve"> list in </w:t>
-      </w:r>
-      <w:r>
-        <w:rPr>
-          <w:rFonts w:ascii="DejaVu Sans Mono" w:hAnsi="DejaVu Sans Mono" w:eastAsia="DejaVu Sans Mono"/>
-        </w:rPr>
-        <w:t>zensical.toml</w:t>
-      </w:r>
-      <w:r>
-        <w:t xml:space="preserve"> and validation that detects missing targets and maintained pages left out of navigation. </w:t>
-      </w:r>
-      <w:r>
-        <w:rPr>
-          <w:b/>
-        </w:rPr>
-        <w:t>Why it helps:</w:t>
-      </w:r>
-      <w:r>
-        <w:t xml:space="preserve"> information architecture is intentional, reviewable, and traceable instead of depending on filenames or renderer guesses.</w:t>
-      </w:r>
-    </w:p>
-    <w:p>
-      <w:pPr>
-        <w:pStyle w:val="ListBullet"/>
-      </w:pPr>
-      <w:r>
-        <w:rPr>
-          <w:b/>
-        </w:rPr>
-        <w:t>Brand Tokens.</w:t>
-      </w:r>
-      <w:r>
-        <w:t xml:space="preserve"> </w:t>
-      </w:r>
-      <w:r>
-        <w:rPr>
-          <w:b/>
-        </w:rPr>
-        <w:t>Made with:</w:t>
-      </w:r>
-      <w:r>
-        <w:t xml:space="preserve"> purpose-based CSS variables and a separate logo asset outside the Markdown source. </w:t>
-      </w:r>
-      <w:r>
-        <w:rPr>
-          <w:b/>
-        </w:rPr>
-        <w:t>Why it helps:</w:t>
-      </w:r>
-      <w:r>
-        <w:t xml:space="preserve"> a team can rebrand the site quickly and consistently without risking changes to the technical meaning or portable documents.</w:t>
-      </w:r>
-    </w:p>
-    <w:p>
-      <w:pPr>
-        <w:pStyle w:val="ListBullet"/>
-      </w:pPr>
-      <w:r>
-        <w:rPr>
-          <w:b/>
-        </w:rPr>
-        <w:t>Automated Validation.</w:t>
-      </w:r>
-      <w:r>
-        <w:t xml:space="preserve"> </w:t>
-      </w:r>
-      <w:r>
-        <w:rPr>
-          <w:b/>
-        </w:rPr>
-        <w:t>Made with:</w:t>
-      </w:r>
-      <w:r>
-        <w:t xml:space="preserve"> a renderer-independent Python script that inspects navigation, headings, images, local files, links, and anchors before the build. </w:t>
-      </w:r>
-      <w:r>
-        <w:rPr>
-          <w:b/>
-        </w:rPr>
-        <w:t>Why it helps:</w:t>
-      </w:r>
-      <w:r>
-        <w:t xml:space="preserve"> repeatable checks finish quickly, free reviewers for judgment-heavy work, and leave an objective pass-or-fail record with each change.</w:t>
-      </w:r>
-    </w:p>
-    <w:p>
-      <w:pPr>
-        <w:pStyle w:val="ListBullet"/>
-      </w:pPr>
-      <w:r>
-        <w:rPr>
-          <w:b/>
-        </w:rPr>
-        <w:t>Continuous Integration.</w:t>
-      </w:r>
-      <w:r>
-        <w:t xml:space="preserve"> </w:t>
-      </w:r>
-      <w:r>
-        <w:rPr>
-          <w:b/>
-        </w:rPr>
-        <w:t>Made with:</w:t>
-      </w:r>
-      <w:r>
-        <w:t xml:space="preserve"> </w:t>
-      </w:r>
-      <w:r>
-        <w:rPr>
-          <w:rFonts w:ascii="DejaVu Sans Mono" w:hAnsi="DejaVu Sans Mono" w:eastAsia="DejaVu Sans Mono"/>
-        </w:rPr>
-        <w:t>.github/workflows/docs.yml</w:t>
-      </w:r>
-      <w:r>
-        <w:t xml:space="preserve">, which runs the same validation and publishing sequence for pull requests and accepted changes. </w:t>
-      </w:r>
-      <w:r>
-        <w:rPr>
-          <w:b/>
-        </w:rPr>
-        <w:t>Why it helps:</w:t>
-      </w:r>
-      <w:r>
-        <w:t xml:space="preserve"> the workflow catches environment-specific failures, proves which version was tested, and creates a traceable release history.</w:t>
-      </w:r>
-    </w:p>
-    <w:p>
-      <w:pPr>
-        <w:pStyle w:val="ListBullet"/>
-      </w:pPr>
-      <w:r>
-        <w:rPr>
-          <w:b/>
-        </w:rPr>
-        <w:t>Multi-Format Publishing.</w:t>
-      </w:r>
-      <w:r>
-        <w:t xml:space="preserve"> </w:t>
-      </w:r>
-      <w:r>
-        <w:rPr>
-          <w:b/>
-        </w:rPr>
-        <w:t>Made with:</w:t>
-      </w:r>
-      <w:r>
-        <w:t xml:space="preserve"> one navigation order, Zensical for the site, </w:t>
-      </w:r>
-      <w:r>
-        <w:rPr>
-          <w:rFonts w:ascii="DejaVu Sans Mono" w:hAnsi="DejaVu Sans Mono" w:eastAsia="DejaVu Sans Mono"/>
-        </w:rPr>
-        <w:t>scripts/export_handbook.py</w:t>
-      </w:r>
-      <w:r>
-        <w:t xml:space="preserve"> for Word, and headless LibreOffice for PDF. </w:t>
-      </w:r>
-      <w:r>
-        <w:rPr>
-          <w:b/>
-        </w:rPr>
-        <w:t>Why it helps:</w:t>
-      </w:r>
-      <w:r>
-        <w:t xml:space="preserve"> the website, Word handbook, and PDF stay synchronized while authors maintain only one source.</w:t>
-      </w:r>
-    </w:p>
+        <w:t>The repeated fields make these examples a semantic table: each row identifies a feature, its implementation, and its practical value.</w:t>
+      </w:r>
+    </w:p>
+    <w:tbl>
+      <w:tblPr>
+        <w:tblW w:type="auto" w:w="0"/>
+        <w:tblLayout w:type="fixed"/>
+        <w:tblLook w:firstColumn="1" w:firstRow="1" w:lastColumn="0" w:lastRow="0" w:noHBand="0" w:noVBand="1" w:val="04A0"/>
+      </w:tblPr>
+      <w:tblGrid>
+        <w:gridCol w:w="3216"/>
+        <w:gridCol w:w="3216"/>
+        <w:gridCol w:w="3216"/>
+      </w:tblGrid>
+      <w:tr>
+        <w:trPr>
+          <w:tblHeader w:val="true"/>
+        </w:trPr>
+        <w:tc>
+          <w:tcPr>
+            <w:tcW w:type="dxa" w:w="3120"/>
+            <w:shd w:fill="075E54"/>
+          </w:tcPr>
+          <w:p>
+            <w:pPr>
+              <w:spacing w:line="276" w:lineRule="auto" w:after="40"/>
+            </w:pPr>
+            <w:r>
+              <w:rPr>
+                <w:b/>
+                <w:color w:val="FFFFFF"/>
+              </w:rPr>
+              <w:t>Feature</w:t>
+            </w:r>
+          </w:p>
+        </w:tc>
+        <w:tc>
+          <w:tcPr>
+            <w:tcW w:type="dxa" w:w="3120"/>
+            <w:shd w:fill="075E54"/>
+          </w:tcPr>
+          <w:p>
+            <w:pPr>
+              <w:spacing w:line="276" w:lineRule="auto" w:after="40"/>
+            </w:pPr>
+            <w:r>
+              <w:rPr>
+                <w:b/>
+                <w:color w:val="FFFFFF"/>
+              </w:rPr>
+              <w:t>Made with</w:t>
+            </w:r>
+          </w:p>
+        </w:tc>
+        <w:tc>
+          <w:tcPr>
+            <w:tcW w:type="dxa" w:w="3120"/>
+            <w:shd w:fill="075E54"/>
+          </w:tcPr>
+          <w:p>
+            <w:pPr>
+              <w:spacing w:line="276" w:lineRule="auto" w:after="40"/>
+            </w:pPr>
+            <w:r>
+              <w:rPr>
+                <w:b/>
+                <w:color w:val="FFFFFF"/>
+              </w:rPr>
+              <w:t>Why it helps</w:t>
+            </w:r>
+          </w:p>
+        </w:tc>
+      </w:tr>
+      <w:tr>
+        <w:tc>
+          <w:tcPr>
+            <w:tcW w:type="dxa" w:w="3120"/>
+          </w:tcPr>
+          <w:p>
+            <w:pPr>
+              <w:spacing w:line="276" w:lineRule="auto" w:after="40"/>
+            </w:pPr>
+            <w:r>
+              <w:t>Cross-Reference</w:t>
+            </w:r>
+          </w:p>
+        </w:tc>
+        <w:tc>
+          <w:tcPr>
+            <w:tcW w:type="dxa" w:w="3120"/>
+          </w:tcPr>
+          <w:p>
+            <w:pPr>
+              <w:spacing w:line="276" w:lineRule="auto" w:after="40"/>
+            </w:pPr>
+            <w:r>
+              <w:t>A deliberate `decision-states` anchor plus validation of the source file and fragment</w:t>
+            </w:r>
+          </w:p>
+        </w:tc>
+        <w:tc>
+          <w:tcPr>
+            <w:tcW w:type="dxa" w:w="3120"/>
+          </w:tcPr>
+          <w:p>
+            <w:pPr>
+              <w:spacing w:line="276" w:lineRule="auto" w:after="40"/>
+            </w:pPr>
+            <w:r>
+              <w:t>Important links survive nearby heading edits, and broken targets stop the release</w:t>
+            </w:r>
+          </w:p>
+        </w:tc>
+      </w:tr>
+      <w:tr>
+        <w:tc>
+          <w:tcPr>
+            <w:tcW w:type="dxa" w:w="3120"/>
+          </w:tcPr>
+          <w:p>
+            <w:pPr>
+              <w:spacing w:line="276" w:lineRule="auto" w:after="40"/>
+            </w:pPr>
+            <w:r>
+              <w:t>Descriptive Link</w:t>
+            </w:r>
+          </w:p>
+        </w:tc>
+        <w:tc>
+          <w:tcPr>
+            <w:tcW w:type="dxa" w:w="3120"/>
+          </w:tcPr>
+          <w:p>
+            <w:pPr>
+              <w:spacing w:line="276" w:lineRule="auto" w:after="40"/>
+            </w:pPr>
+            <w:r>
+              <w:t>Task-specific link text plus a validator that rejects common context-free labels</w:t>
+            </w:r>
+          </w:p>
+        </w:tc>
+        <w:tc>
+          <w:tcPr>
+            <w:tcW w:type="dxa" w:w="3120"/>
+          </w:tcPr>
+          <w:p>
+            <w:pPr>
+              <w:spacing w:line="276" w:lineRule="auto" w:after="40"/>
+            </w:pPr>
+            <w:r>
+              <w:t>Readers and screen-reader users can understand the destination out of context</w:t>
+            </w:r>
+          </w:p>
+        </w:tc>
+      </w:tr>
+      <w:tr>
+        <w:tc>
+          <w:tcPr>
+            <w:tcW w:type="dxa" w:w="3120"/>
+          </w:tcPr>
+          <w:p>
+            <w:pPr>
+              <w:spacing w:line="276" w:lineRule="auto" w:after="40"/>
+            </w:pPr>
+            <w:r>
+              <w:t>Semantic Table</w:t>
+            </w:r>
+          </w:p>
+        </w:tc>
+        <w:tc>
+          <w:tcPr>
+            <w:tcW w:type="dxa" w:w="3120"/>
+          </w:tcPr>
+          <w:p>
+            <w:pPr>
+              <w:spacing w:line="276" w:lineRule="auto" w:after="40"/>
+            </w:pPr>
+            <w:r>
+              <w:t>Markdown table syntax, accessible HTML, and real Word tables with repeating header rows</w:t>
+            </w:r>
+          </w:p>
+        </w:tc>
+        <w:tc>
+          <w:tcPr>
+            <w:tcW w:type="dxa" w:w="3120"/>
+          </w:tcPr>
+          <w:p>
+            <w:pPr>
+              <w:spacing w:line="276" w:lineRule="auto" w:after="40"/>
+            </w:pPr>
+            <w:r>
+              <w:t>Relationships remain clear in HTML, Word, and PDF without separate copies</w:t>
+            </w:r>
+          </w:p>
+        </w:tc>
+      </w:tr>
+      <w:tr>
+        <w:tc>
+          <w:tcPr>
+            <w:tcW w:type="dxa" w:w="3120"/>
+          </w:tcPr>
+          <w:p>
+            <w:pPr>
+              <w:spacing w:line="276" w:lineRule="auto" w:after="40"/>
+            </w:pPr>
+            <w:r>
+              <w:t>Admonition</w:t>
+            </w:r>
+          </w:p>
+        </w:tc>
+        <w:tc>
+          <w:tcPr>
+            <w:tcW w:type="dxa" w:w="3120"/>
+          </w:tcPr>
+          <w:p>
+            <w:pPr>
+              <w:spacing w:line="276" w:lineRule="auto" w:after="40"/>
+            </w:pPr>
+            <w:r>
+              <w:t>A labeled `!!! info` block plus styling in the publishing layer</w:t>
+            </w:r>
+          </w:p>
+        </w:tc>
+        <w:tc>
+          <w:tcPr>
+            <w:tcW w:type="dxa" w:w="3120"/>
+          </w:tcPr>
+          <w:p>
+            <w:pPr>
+              <w:spacing w:line="276" w:lineRule="auto" w:after="40"/>
+            </w:pPr>
+            <w:r>
+              <w:t>Important context stands out while the source stays readable and reviewable</w:t>
+            </w:r>
+          </w:p>
+        </w:tc>
+      </w:tr>
+      <w:tr>
+        <w:tc>
+          <w:tcPr>
+            <w:tcW w:type="dxa" w:w="3120"/>
+          </w:tcPr>
+          <w:p>
+            <w:pPr>
+              <w:spacing w:line="276" w:lineRule="auto" w:after="40"/>
+            </w:pPr>
+            <w:r>
+              <w:t>Code Block</w:t>
+            </w:r>
+          </w:p>
+        </w:tc>
+        <w:tc>
+          <w:tcPr>
+            <w:tcW w:type="dxa" w:w="3120"/>
+          </w:tcPr>
+          <w:p>
+            <w:pPr>
+              <w:spacing w:line="276" w:lineRule="auto" w:after="40"/>
+            </w:pPr>
+            <w:r>
+              <w:t>Fenced Markdown, site copy support, and an explicit monospaced export style</w:t>
+            </w:r>
+          </w:p>
+        </w:tc>
+        <w:tc>
+          <w:tcPr>
+            <w:tcW w:type="dxa" w:w="3120"/>
+          </w:tcPr>
+          <w:p>
+            <w:pPr>
+              <w:spacing w:line="276" w:lineRule="auto" w:after="40"/>
+            </w:pPr>
+            <w:r>
+              <w:t>Commands retain spacing and can be copied with fewer transcription errors</w:t>
+            </w:r>
+          </w:p>
+        </w:tc>
+      </w:tr>
+      <w:tr>
+        <w:tc>
+          <w:tcPr>
+            <w:tcW w:type="dxa" w:w="3120"/>
+          </w:tcPr>
+          <w:p>
+            <w:pPr>
+              <w:spacing w:line="276" w:lineRule="auto" w:after="40"/>
+            </w:pPr>
+            <w:r>
+              <w:t>Explicit Navigation</w:t>
+            </w:r>
+          </w:p>
+        </w:tc>
+        <w:tc>
+          <w:tcPr>
+            <w:tcW w:type="dxa" w:w="3120"/>
+          </w:tcPr>
+          <w:p>
+            <w:pPr>
+              <w:spacing w:line="276" w:lineRule="auto" w:after="40"/>
+            </w:pPr>
+            <w:r>
+              <w:t>The ordered `nav` list in `zensical.toml` plus checks for missing and unlisted pages</w:t>
+            </w:r>
+          </w:p>
+        </w:tc>
+        <w:tc>
+          <w:tcPr>
+            <w:tcW w:type="dxa" w:w="3120"/>
+          </w:tcPr>
+          <w:p>
+            <w:pPr>
+              <w:spacing w:line="276" w:lineRule="auto" w:after="40"/>
+            </w:pPr>
+            <w:r>
+              <w:t>Page order is intentional, reviewable, and traceable instead of inferred from filenames</w:t>
+            </w:r>
+          </w:p>
+        </w:tc>
+      </w:tr>
+      <w:tr>
+        <w:tc>
+          <w:tcPr>
+            <w:tcW w:type="dxa" w:w="3120"/>
+          </w:tcPr>
+          <w:p>
+            <w:pPr>
+              <w:spacing w:line="276" w:lineRule="auto" w:after="40"/>
+            </w:pPr>
+            <w:r>
+              <w:t>Brand Tokens</w:t>
+            </w:r>
+          </w:p>
+        </w:tc>
+        <w:tc>
+          <w:tcPr>
+            <w:tcW w:type="dxa" w:w="3120"/>
+          </w:tcPr>
+          <w:p>
+            <w:pPr>
+              <w:spacing w:line="276" w:lineRule="auto" w:after="40"/>
+            </w:pPr>
+            <w:r>
+              <w:t>Purpose-based CSS variables and a separate logo asset outside the Markdown</w:t>
+            </w:r>
+          </w:p>
+        </w:tc>
+        <w:tc>
+          <w:tcPr>
+            <w:tcW w:type="dxa" w:w="3120"/>
+          </w:tcPr>
+          <w:p>
+            <w:pPr>
+              <w:spacing w:line="276" w:lineRule="auto" w:after="40"/>
+            </w:pPr>
+            <w:r>
+              <w:t>Teams can rebrand consistently without changing technical meaning</w:t>
+            </w:r>
+          </w:p>
+        </w:tc>
+      </w:tr>
+      <w:tr>
+        <w:tc>
+          <w:tcPr>
+            <w:tcW w:type="dxa" w:w="3120"/>
+          </w:tcPr>
+          <w:p>
+            <w:pPr>
+              <w:spacing w:line="276" w:lineRule="auto" w:after="40"/>
+            </w:pPr>
+            <w:r>
+              <w:t>Automated Validation</w:t>
+            </w:r>
+          </w:p>
+        </w:tc>
+        <w:tc>
+          <w:tcPr>
+            <w:tcW w:type="dxa" w:w="3120"/>
+          </w:tcPr>
+          <w:p>
+            <w:pPr>
+              <w:spacing w:line="276" w:lineRule="auto" w:after="40"/>
+            </w:pPr>
+            <w:r>
+              <w:t>A renderer-independent Python script that checks navigation, structure, images, files, links, and anchors</w:t>
+            </w:r>
+          </w:p>
+        </w:tc>
+        <w:tc>
+          <w:tcPr>
+            <w:tcW w:type="dxa" w:w="3120"/>
+          </w:tcPr>
+          <w:p>
+            <w:pPr>
+              <w:spacing w:line="276" w:lineRule="auto" w:after="40"/>
+            </w:pPr>
+            <w:r>
+              <w:t>Fast, repeatable checks free reviewers for judgment-heavy work and leave pass-or-fail evidence</w:t>
+            </w:r>
+          </w:p>
+        </w:tc>
+      </w:tr>
+      <w:tr>
+        <w:tc>
+          <w:tcPr>
+            <w:tcW w:type="dxa" w:w="3120"/>
+          </w:tcPr>
+          <w:p>
+            <w:pPr>
+              <w:spacing w:line="276" w:lineRule="auto" w:after="40"/>
+            </w:pPr>
+            <w:r>
+              <w:t>Continuous Integration</w:t>
+            </w:r>
+          </w:p>
+        </w:tc>
+        <w:tc>
+          <w:tcPr>
+            <w:tcW w:type="dxa" w:w="3120"/>
+          </w:tcPr>
+          <w:p>
+            <w:pPr>
+              <w:spacing w:line="276" w:lineRule="auto" w:after="40"/>
+            </w:pPr>
+            <w:r>
+              <w:t>`.github/workflows/docs.yml`, which repeats validation and publishing for proposed and accepted changes</w:t>
+            </w:r>
+          </w:p>
+        </w:tc>
+        <w:tc>
+          <w:tcPr>
+            <w:tcW w:type="dxa" w:w="3120"/>
+          </w:tcPr>
+          <w:p>
+            <w:pPr>
+              <w:spacing w:line="276" w:lineRule="auto" w:after="40"/>
+            </w:pPr>
+            <w:r>
+              <w:t>The workflow catches environment failures and records exactly which version passed</w:t>
+            </w:r>
+          </w:p>
+        </w:tc>
+      </w:tr>
+      <w:tr>
+        <w:tc>
+          <w:tcPr>
+            <w:tcW w:type="dxa" w:w="3120"/>
+          </w:tcPr>
+          <w:p>
+            <w:pPr>
+              <w:spacing w:line="276" w:lineRule="auto" w:after="40"/>
+            </w:pPr>
+            <w:r>
+              <w:t>Multi-Format Publishing</w:t>
+            </w:r>
+          </w:p>
+        </w:tc>
+        <w:tc>
+          <w:tcPr>
+            <w:tcW w:type="dxa" w:w="3120"/>
+          </w:tcPr>
+          <w:p>
+            <w:pPr>
+              <w:spacing w:line="276" w:lineRule="auto" w:after="40"/>
+            </w:pPr>
+            <w:r>
+              <w:t>One navigation order, Zensical for HTML, a Python Word export, and LibreOffice PDF conversion</w:t>
+            </w:r>
+          </w:p>
+        </w:tc>
+        <w:tc>
+          <w:tcPr>
+            <w:tcW w:type="dxa" w:w="3120"/>
+          </w:tcPr>
+          <w:p>
+            <w:pPr>
+              <w:spacing w:line="276" w:lineRule="auto" w:after="40"/>
+            </w:pPr>
+            <w:r>
+              <w:t>The website, Word handbook, and PDF stay synchronized from one maintained source</w:t>
+            </w:r>
+          </w:p>
+        </w:tc>
+      </w:tr>
+    </w:tbl>
     <w:p>
       <w:pPr>
         <w:pStyle w:val="Heading2"/>

</xml_diff>

<commit_message>
Improve feature tables and portable output spacing
</commit_message>
<xml_diff>
--- a/deliverables/greenhouse-sentinel-handbook.docx
+++ b/deliverables/greenhouse-sentinel-handbook.docx
@@ -187,1201 +187,6 @@
     <w:p>
       <w:r>
         <w:t>Each feature is implemented in the public repository, not merely described in the portfolio narrative.</w:t>
-      </w:r>
-    </w:p>
-    <w:p>
-      <w:pPr>
-        <w:pStyle w:val="ListBullet"/>
-      </w:pPr>
-      <w:r>
-        <w:rPr>
-          <w:b/>
-        </w:rPr>
-        <w:t>Single-Source Authoring.</w:t>
-      </w:r>
-      <w:r>
-        <w:t xml:space="preserve"> </w:t>
-      </w:r>
-      <w:r>
-        <w:rPr>
-          <w:b/>
-        </w:rPr>
-        <w:t>Made with:</w:t>
-      </w:r>
-      <w:r>
-        <w:t xml:space="preserve"> one reviewed set of Markdown files under </w:t>
-      </w:r>
-      <w:r>
-        <w:rPr>
-          <w:rFonts w:ascii="DejaVu Sans Mono" w:hAnsi="DejaVu Sans Mono" w:eastAsia="DejaVu Sans Mono"/>
-        </w:rPr>
-        <w:t>docs/</w:t>
-      </w:r>
-      <w:r>
-        <w:t xml:space="preserve">. </w:t>
-      </w:r>
-      <w:r>
-        <w:rPr>
-          <w:b/>
-        </w:rPr>
-        <w:t>Why it helps:</w:t>
-      </w:r>
-      <w:r>
-        <w:t xml:space="preserve"> authors make a change once instead of reconciling separate website, Word, and PDF copies.</w:t>
-      </w:r>
-    </w:p>
-    <w:p>
-      <w:pPr>
-        <w:pStyle w:val="ListBullet"/>
-      </w:pPr>
-      <w:r>
-        <w:rPr>
-          <w:b/>
-        </w:rPr>
-        <w:t>Explicit Navigation.</w:t>
-      </w:r>
-      <w:r>
-        <w:t xml:space="preserve"> </w:t>
-      </w:r>
-      <w:r>
-        <w:rPr>
-          <w:b/>
-        </w:rPr>
-        <w:t>Made with:</w:t>
-      </w:r>
-      <w:r>
-        <w:t xml:space="preserve"> an ordered </w:t>
-      </w:r>
-      <w:r>
-        <w:rPr>
-          <w:rFonts w:ascii="DejaVu Sans Mono" w:hAnsi="DejaVu Sans Mono" w:eastAsia="DejaVu Sans Mono"/>
-        </w:rPr>
-        <w:t>nav</w:t>
-      </w:r>
-      <w:r>
-        <w:t xml:space="preserve"> list in </w:t>
-      </w:r>
-      <w:r>
-        <w:rPr>
-          <w:rFonts w:ascii="DejaVu Sans Mono" w:hAnsi="DejaVu Sans Mono" w:eastAsia="DejaVu Sans Mono"/>
-        </w:rPr>
-        <w:t>zensical.toml</w:t>
-      </w:r>
-      <w:r>
-        <w:t xml:space="preserve"> plus a check for unlisted pages. </w:t>
-      </w:r>
-      <w:r>
-        <w:rPr>
-          <w:b/>
-        </w:rPr>
-        <w:t>Why it helps:</w:t>
-      </w:r>
-      <w:r>
-        <w:t xml:space="preserve"> readers get a deliberate sequence, and reviewers can trace every published page to the configuration that includes it.</w:t>
-      </w:r>
-    </w:p>
-    <w:p>
-      <w:pPr>
-        <w:pStyle w:val="ListBullet"/>
-      </w:pPr>
-      <w:r>
-        <w:rPr>
-          <w:b/>
-        </w:rPr>
-        <w:t>Stable Cross-References.</w:t>
-      </w:r>
-      <w:r>
-        <w:t xml:space="preserve"> </w:t>
-      </w:r>
-      <w:r>
-        <w:rPr>
-          <w:b/>
-        </w:rPr>
-        <w:t>Made with:</w:t>
-      </w:r>
-      <w:r>
-        <w:t xml:space="preserve"> deliberate anchors on important targets, as shown by </w:t>
-      </w:r>
-      <w:r>
-        <w:rPr>
-          <w:color w:val="075E54"/>
-          <w:u w:val="single"/>
-        </w:rPr>
-        <w:t>Decision States</w:t>
-      </w:r>
-      <w:r>
-        <w:t xml:space="preserve">, and automated fragment checks. </w:t>
-      </w:r>
-      <w:r>
-        <w:rPr>
-          <w:b/>
-        </w:rPr>
-        <w:t>Why it helps:</w:t>
-      </w:r>
-      <w:r>
-        <w:t xml:space="preserve"> heading edits cannot silently strand important links.</w:t>
-      </w:r>
-    </w:p>
-    <w:p>
-      <w:pPr>
-        <w:pStyle w:val="ListBullet"/>
-      </w:pPr>
-      <w:r>
-        <w:rPr>
-          <w:b/>
-        </w:rPr>
-        <w:t>Automated Validation.</w:t>
-      </w:r>
-      <w:r>
-        <w:t xml:space="preserve"> </w:t>
-      </w:r>
-      <w:r>
-        <w:rPr>
-          <w:b/>
-        </w:rPr>
-        <w:t>Made with:</w:t>
-      </w:r>
-      <w:r>
-        <w:t xml:space="preserve"> </w:t>
-      </w:r>
-      <w:r>
-        <w:rPr>
-          <w:rFonts w:ascii="DejaVu Sans Mono" w:hAnsi="DejaVu Sans Mono" w:eastAsia="DejaVu Sans Mono"/>
-        </w:rPr>
-        <w:t>scripts/validate_docs.py</w:t>
-      </w:r>
-      <w:r>
-        <w:t xml:space="preserve">, which checks navigation, files, internal links, anchors, heading structure, and image text. </w:t>
-      </w:r>
-      <w:r>
-        <w:rPr>
-          <w:b/>
-        </w:rPr>
-        <w:t>Why it helps:</w:t>
-      </w:r>
-      <w:r>
-        <w:t xml:space="preserve"> routine defects are found in seconds and resolved before publication rather than during manual review.</w:t>
-      </w:r>
-    </w:p>
-    <w:p>
-      <w:pPr>
-        <w:pStyle w:val="ListBullet"/>
-      </w:pPr>
-      <w:r>
-        <w:rPr>
-          <w:b/>
-        </w:rPr>
-        <w:t>Continuous Integration and Publishing.</w:t>
-      </w:r>
-      <w:r>
-        <w:t xml:space="preserve"> </w:t>
-      </w:r>
-      <w:r>
-        <w:rPr>
-          <w:b/>
-        </w:rPr>
-        <w:t>Made with:</w:t>
-      </w:r>
-      <w:r>
-        <w:t xml:space="preserve"> a GitHub Actions workflow that repeats validation and generation from a clean copy of each proposed change. </w:t>
-      </w:r>
-      <w:r>
-        <w:rPr>
-          <w:b/>
-        </w:rPr>
-        <w:t>Why it helps:</w:t>
-      </w:r>
-      <w:r>
-        <w:t xml:space="preserve"> every release follows the same recorded process, which improves consistency, accuracy, and traceability.</w:t>
-      </w:r>
-    </w:p>
-    <w:p>
-      <w:pPr>
-        <w:pStyle w:val="ListBullet"/>
-      </w:pPr>
-      <w:r>
-        <w:rPr>
-          <w:b/>
-        </w:rPr>
-        <w:t>Accessible Authoring.</w:t>
-      </w:r>
-      <w:r>
-        <w:t xml:space="preserve"> </w:t>
-      </w:r>
-      <w:r>
-        <w:rPr>
-          <w:b/>
-        </w:rPr>
-        <w:t>Made with:</w:t>
-      </w:r>
-      <w:r>
-        <w:t xml:space="preserve"> source standards, validation rules, accessible theme overrides, and a release checklist. </w:t>
-      </w:r>
-      <w:r>
-        <w:rPr>
-          <w:b/>
-        </w:rPr>
-        <w:t>Why it helps:</w:t>
-      </w:r>
-      <w:r>
-        <w:t xml:space="preserve"> accessibility is addressed while content is written and reviewed instead of being treated as a late repair.</w:t>
-      </w:r>
-    </w:p>
-    <w:p>
-      <w:pPr>
-        <w:pStyle w:val="ListBullet"/>
-      </w:pPr>
-      <w:r>
-        <w:rPr>
-          <w:b/>
-        </w:rPr>
-        <w:t>Replaceable Branding.</w:t>
-      </w:r>
-      <w:r>
-        <w:t xml:space="preserve"> </w:t>
-      </w:r>
-      <w:r>
-        <w:rPr>
-          <w:b/>
-        </w:rPr>
-        <w:t>Made with:</w:t>
-      </w:r>
-      <w:r>
-        <w:t xml:space="preserve"> CSS variables, a separate logo asset, and publishing configuration outside the Markdown. </w:t>
-      </w:r>
-      <w:r>
-        <w:rPr>
-          <w:b/>
-        </w:rPr>
-        <w:t>Why it helps:</w:t>
-      </w:r>
-      <w:r>
-        <w:t xml:space="preserve"> an organization can change the visual identity without rewriting or forking the technical content.</w:t>
-      </w:r>
-    </w:p>
-    <w:p>
-      <w:pPr>
-        <w:pStyle w:val="ListBullet"/>
-      </w:pPr>
-      <w:r>
-        <w:rPr>
-          <w:b/>
-        </w:rPr>
-        <w:t>Multi-Format Delivery.</w:t>
-      </w:r>
-      <w:r>
-        <w:t xml:space="preserve"> </w:t>
-      </w:r>
-      <w:r>
-        <w:rPr>
-          <w:b/>
-        </w:rPr>
-        <w:t>Made with:</w:t>
-      </w:r>
-      <w:r>
-        <w:t xml:space="preserve"> Zensical for HTML, a Python export script for Word, and headless LibreOffice for PDF. </w:t>
-      </w:r>
-      <w:r>
-        <w:rPr>
-          <w:b/>
-        </w:rPr>
-        <w:t>Why it helps:</w:t>
-      </w:r>
-      <w:r>
-        <w:t xml:space="preserve"> teams serve web and portable-document readers without maintaining three competing sources.</w:t>
-      </w:r>
-    </w:p>
-    <w:p>
-      <w:pPr>
-        <w:pStyle w:val="ListBullet"/>
-      </w:pPr>
-      <w:r>
-        <w:rPr>
-          <w:b/>
-        </w:rPr>
-        <w:t>Self-Documentation.</w:t>
-      </w:r>
-      <w:r>
-        <w:t xml:space="preserve"> </w:t>
-      </w:r>
-      <w:r>
-        <w:rPr>
-          <w:b/>
-        </w:rPr>
-        <w:t>Made with:</w:t>
-      </w:r>
-      <w:r>
-        <w:t xml:space="preserve"> implementation notes, a complete build chapter, contributor guidance, and links to the actual configuration and scripts. </w:t>
-      </w:r>
-      <w:r>
-        <w:rPr>
-          <w:b/>
-        </w:rPr>
-        <w:t>Why it helps:</w:t>
-      </w:r>
-      <w:r>
-        <w:t xml:space="preserve"> another writer can inspect, explain, reproduce, or adapt the workflow without relying on undocumented setup knowledge.</w:t>
-      </w:r>
-    </w:p>
-    <w:p>
-      <w:r>
-        <w:t xml:space="preserve">See </w:t>
-      </w:r>
-      <w:r>
-        <w:rPr>
-          <w:color w:val="075E54"/>
-          <w:u w:val="single"/>
-        </w:rPr>
-        <w:t>How This Repository Works</w:t>
-      </w:r>
-      <w:r>
-        <w:t xml:space="preserve"> for a closer look at the implementation and benefit of each feature.</w:t>
-      </w:r>
-    </w:p>
-    <w:p>
-      <w:pPr>
-        <w:pStyle w:val="Heading2"/>
-      </w:pPr>
-      <w:r>
-        <w:t>Architecture at a Glance</w:t>
-      </w:r>
-    </w:p>
-    <w:p>
-      <w:pPr>
-        <w:pStyle w:val="Code"/>
-      </w:pPr>
-      <w:r>
-        <w:t>One reviewed Markdown source</w:t>
-      </w:r>
-    </w:p>
-    <w:p>
-      <w:pPr>
-        <w:pStyle w:val="Code"/>
-      </w:pPr>
-      <w:r>
-        <w:t xml:space="preserve">          |</w:t>
-      </w:r>
-    </w:p>
-    <w:p>
-      <w:pPr>
-        <w:pStyle w:val="Code"/>
-      </w:pPr>
-      <w:r>
-        <w:t xml:space="preserve">          +--&gt; validation --&gt; pull-request and release gates</w:t>
-      </w:r>
-    </w:p>
-    <w:p>
-      <w:pPr>
-        <w:pStyle w:val="Code"/>
-      </w:pPr>
-      <w:r>
-        <w:t xml:space="preserve">          |</w:t>
-      </w:r>
-    </w:p>
-    <w:p>
-      <w:pPr>
-        <w:pStyle w:val="Code"/>
-      </w:pPr>
-      <w:r>
-        <w:t xml:space="preserve">          +--&gt; Zensical --&gt; searchable HTML site</w:t>
-      </w:r>
-    </w:p>
-    <w:p>
-      <w:pPr>
-        <w:pStyle w:val="Code"/>
-      </w:pPr>
-      <w:r>
-        <w:t xml:space="preserve">          |</w:t>
-      </w:r>
-    </w:p>
-    <w:p>
-      <w:pPr>
-        <w:pStyle w:val="Code"/>
-      </w:pPr>
-      <w:r>
-        <w:t xml:space="preserve">          +--&gt; export script --&gt; Word handbook --&gt; PDF handbook</w:t>
-      </w:r>
-    </w:p>
-    <w:p>
-      <w:pPr>
-        <w:pStyle w:val="Code"/>
-      </w:pPr>
-      <w:r/>
-    </w:p>
-    <w:p>
-      <w:pPr>
-        <w:pStyle w:val="Code"/>
-      </w:pPr>
-      <w:r>
-        <w:t>Brand tokens change presentation without changing source meaning.</w:t>
-      </w:r>
-    </w:p>
-    <w:p>
-      <w:r>
-        <w:t>The renderer can change while the release requirements remain stable. Explicit navigation, valid links and anchors, accessible structure, reproducible builds, and reviewable changes remain required.</w:t>
-      </w:r>
-    </w:p>
-    <w:p>
-      <w:pPr>
-        <w:pStyle w:val="Heading2"/>
-      </w:pPr>
-      <w:r>
-        <w:t>The Fictional Product in 30 Seconds</w:t>
-      </w:r>
-    </w:p>
-    <w:p>
-      <w:r>
-        <w:t xml:space="preserve">Greenhouse Sentinel samples temperature, humidity, and soil moisture every 60 seconds. A rule engine assigns the greenhouse a state: </w:t>
-      </w:r>
-      <w:r>
-        <w:rPr>
-          <w:b/>
-        </w:rPr>
-        <w:t>normal</w:t>
-      </w:r>
-      <w:r>
-        <w:t xml:space="preserve">, </w:t>
-      </w:r>
-      <w:r>
-        <w:rPr>
-          <w:b/>
-        </w:rPr>
-        <w:t>watch</w:t>
-      </w:r>
-      <w:r>
-        <w:t xml:space="preserve">, or </w:t>
-      </w:r>
-      <w:r>
-        <w:rPr>
-          <w:b/>
-        </w:rPr>
-        <w:t>act</w:t>
-      </w:r>
-      <w:r>
-        <w:t>. The operator dashboard explains the reading and links each alert to a documented response.</w:t>
-      </w:r>
-    </w:p>
-    <w:p>
-      <w:r>
-        <w:t>Greenhouse Sentinel does not exist. Its behavior, data, and interface are intentionally simple and invented. The repository exists to demonstrate documentation architecture, authoring, validation, CI, publishing, and multi-format delivery without confidential information.</w:t>
-      </w:r>
-    </w:p>
-    <w:p>
-      <w:pPr>
-        <w:pStyle w:val="Heading2"/>
-      </w:pPr>
-      <w:r>
-        <w:t>What Is Included</w:t>
-      </w:r>
-    </w:p>
-    <w:p>
-      <w:pPr>
-        <w:pStyle w:val="ListBullet"/>
-      </w:pPr>
-      <w:r>
-        <w:rPr>
-          <w:b/>
-        </w:rPr>
-        <w:t>Product documentation</w:t>
-      </w:r>
-      <w:r>
-        <w:t xml:space="preserve"> proves the workflow can support task-based technical content. Start with the </w:t>
-      </w:r>
-      <w:r>
-        <w:rPr>
-          <w:color w:val="075E54"/>
-          <w:u w:val="single"/>
-        </w:rPr>
-        <w:t>quick start</w:t>
-      </w:r>
-      <w:r>
-        <w:t xml:space="preserve">, </w:t>
-      </w:r>
-      <w:r>
-        <w:rPr>
-          <w:color w:val="075E54"/>
-          <w:u w:val="single"/>
-        </w:rPr>
-        <w:t>operating guide</w:t>
-      </w:r>
-      <w:r>
-        <w:t xml:space="preserve">, and </w:t>
-      </w:r>
-      <w:r>
-        <w:rPr>
-          <w:color w:val="075E54"/>
-          <w:u w:val="single"/>
-        </w:rPr>
-        <w:t>architecture</w:t>
-      </w:r>
-      <w:r>
-        <w:t>.</w:t>
-      </w:r>
-    </w:p>
-    <w:p>
-      <w:pPr>
-        <w:pStyle w:val="ListBullet"/>
-      </w:pPr>
-      <w:r>
-        <w:rPr>
-          <w:b/>
-        </w:rPr>
-        <w:t>Repository documentation</w:t>
-      </w:r>
-      <w:r>
-        <w:t xml:space="preserve"> reveals how the example is assembled and governed. Read </w:t>
-      </w:r>
-      <w:r>
-        <w:rPr>
-          <w:color w:val="075E54"/>
-          <w:u w:val="single"/>
-        </w:rPr>
-        <w:t>How This Repository Works</w:t>
-      </w:r>
-      <w:r>
-        <w:t xml:space="preserve"> and </w:t>
-      </w:r>
-      <w:r>
-        <w:rPr>
-          <w:color w:val="075E54"/>
-          <w:u w:val="single"/>
-        </w:rPr>
-        <w:t>Build It from Scratch</w:t>
-      </w:r>
-      <w:r>
-        <w:t>.</w:t>
-      </w:r>
-    </w:p>
-    <w:p>
-      <w:pPr>
-        <w:pStyle w:val="ListBullet"/>
-      </w:pPr>
-      <w:r>
-        <w:rPr>
-          <w:b/>
-        </w:rPr>
-        <w:t>Contributor guidance</w:t>
-      </w:r>
-      <w:r>
-        <w:t xml:space="preserve"> makes quality expectations explicit and repeatable. Review the </w:t>
-      </w:r>
-      <w:r>
-        <w:rPr>
-          <w:color w:val="075E54"/>
-          <w:u w:val="single"/>
-        </w:rPr>
-        <w:t>writing guide</w:t>
-      </w:r>
-      <w:r>
-        <w:t xml:space="preserve">, </w:t>
-      </w:r>
-      <w:r>
-        <w:rPr>
-          <w:color w:val="075E54"/>
-          <w:u w:val="single"/>
-        </w:rPr>
-        <w:t>accessibility standard</w:t>
-      </w:r>
-      <w:r>
-        <w:t xml:space="preserve">, and </w:t>
-      </w:r>
-      <w:r>
-        <w:rPr>
-          <w:color w:val="075E54"/>
-          <w:u w:val="single"/>
-        </w:rPr>
-        <w:t>release checklist</w:t>
-      </w:r>
-      <w:r>
-        <w:t>.</w:t>
-      </w:r>
-    </w:p>
-    <w:p>
-      <w:pPr>
-        <w:pStyle w:val="ListBullet"/>
-      </w:pPr>
-      <w:r>
-        <w:rPr>
-          <w:b/>
-        </w:rPr>
-        <w:t>Generated deliverables</w:t>
-      </w:r>
-      <w:r>
-        <w:t xml:space="preserve"> prove that one reviewed source can support several channels. Use the Word and PDF download buttons above to inspect the portable versions.</w:t>
-      </w:r>
-    </w:p>
-    <w:p>
-      <w:pPr>
-        <w:pStyle w:val="Heading2"/>
-      </w:pPr>
-      <w:r>
-        <w:t>Public Portfolio Scope</w:t>
-      </w:r>
-    </w:p>
-    <w:p>
-      <w:r>
-        <w:t>All product names, specifications, incidents, commands, and workflows in this demonstration are invented. The repository contains no Peraton-specific, customer, proprietary, export-controlled, or classified information. “ThreatBoard-style” describes the general docs-as-code pattern demonstrated by this sample, not copied content or branding.</w:t>
-      </w:r>
-    </w:p>
-    <w:p>
-      <w:r>
-        <w:t xml:space="preserve">Katie Kearns created this sample as a technical-writing and documentation-systems portfolio project. The code and documentation are available under the </w:t>
-      </w:r>
-      <w:r>
-        <w:rPr>
-          <w:color w:val="075E54"/>
-          <w:u w:val="single"/>
-        </w:rPr>
-        <w:t>MIT License</w:t>
-      </w:r>
-      <w:r>
-        <w:t>.</w:t>
-      </w:r>
-    </w:p>
-    <w:p>
-      <w:r>
-        <w:br w:type="page"/>
-      </w:r>
-    </w:p>
-    <w:p>
-      <w:pPr>
-        <w:pStyle w:val="Heading1"/>
-      </w:pPr>
-      <w:r>
-        <w:t>Quick Start</w:t>
-      </w:r>
-    </w:p>
-    <w:p>
-      <w:r>
-        <w:t>This walkthrough connects a fictional Sentinel hub and confirms that its three sensors are reporting. No hardware is required. The commands are illustrative.</w:t>
-      </w:r>
-    </w:p>
-    <w:p>
-      <w:pPr>
-        <w:pStyle w:val="Heading2"/>
-      </w:pPr>
-      <w:r>
-        <w:t>Before You Begin</w:t>
-      </w:r>
-    </w:p>
-    <w:p>
-      <w:r>
-        <w:t>You need a Sentinel hub, one temperature and humidity probe, one soil probe, and access to the greenhouse Wi-Fi network.</w:t>
-      </w:r>
-    </w:p>
-    <w:p>
-      <w:pPr>
-        <w:pStyle w:val="Heading2"/>
-      </w:pPr>
-      <w:r>
-        <w:t>Connect and Verify</w:t>
-      </w:r>
-    </w:p>
-    <w:p>
-      <w:pPr>
-        <w:pStyle w:val="ListNumber"/>
-        <w:numPr>
-          <w:ilvl w:val="0"/>
-          <w:numId w:val="11"/>
-        </w:numPr>
-        <w:ind w:left="576" w:hanging="360"/>
-      </w:pPr>
-      <w:r>
-        <w:t>Place the hub above the irrigation line and away from direct spray.</w:t>
-      </w:r>
-    </w:p>
-    <w:p>
-      <w:pPr>
-        <w:pStyle w:val="ListNumber"/>
-        <w:ind w:left="576" w:hanging="360"/>
-      </w:pPr>
-      <w:r>
-        <w:t>Connect both probes before applying power.</w:t>
-      </w:r>
-    </w:p>
-    <w:p>
-      <w:pPr>
-        <w:pStyle w:val="ListNumber"/>
-        <w:ind w:left="576" w:hanging="360"/>
-      </w:pPr>
-      <w:r>
-        <w:t xml:space="preserve">Join the temporary network named </w:t>
-      </w:r>
-      <w:r>
-        <w:rPr>
-          <w:rFonts w:ascii="DejaVu Sans Mono" w:hAnsi="DejaVu Sans Mono" w:eastAsia="DejaVu Sans Mono"/>
-        </w:rPr>
-        <w:t>sentinel-setup</w:t>
-      </w:r>
-      <w:r>
-        <w:t>.</w:t>
-      </w:r>
-    </w:p>
-    <w:p>
-      <w:pPr>
-        <w:pStyle w:val="ListNumber"/>
-        <w:ind w:left="576" w:hanging="360"/>
-      </w:pPr>
-      <w:r>
-        <w:t xml:space="preserve">Open </w:t>
-      </w:r>
-      <w:r>
-        <w:rPr>
-          <w:rFonts w:ascii="DejaVu Sans Mono" w:hAnsi="DejaVu Sans Mono" w:eastAsia="DejaVu Sans Mono"/>
-        </w:rPr>
-        <w:t>http://sentinel.local</w:t>
-      </w:r>
-      <w:r>
-        <w:t xml:space="preserve"> and choose the greenhouse network.</w:t>
-      </w:r>
-    </w:p>
-    <w:p>
-      <w:pPr>
-        <w:pStyle w:val="ListNumber"/>
-        <w:ind w:left="576" w:hanging="360"/>
-      </w:pPr>
-      <w:r>
-        <w:t xml:space="preserve">Select </w:t>
-      </w:r>
-      <w:r>
-        <w:rPr>
-          <w:b/>
-        </w:rPr>
-        <w:t>Run sensor check</w:t>
-      </w:r>
-      <w:r>
-        <w:t>.</w:t>
-      </w:r>
-    </w:p>
-    <w:p>
-      <w:r>
-        <w:t>A successful check reports all three readings and changes the hub indicator from amber to green.</w:t>
-      </w:r>
-    </w:p>
-    <w:p>
-      <w:pPr>
-        <w:pStyle w:val="Code"/>
-      </w:pPr>
-      <w:r>
-        <w:t>temperature   24.1 C   ready</w:t>
-      </w:r>
-    </w:p>
-    <w:p>
-      <w:pPr>
-        <w:pStyle w:val="Code"/>
-      </w:pPr>
-      <w:r>
-        <w:t>humidity      58 %     ready</w:t>
-      </w:r>
-    </w:p>
-    <w:p>
-      <w:pPr>
-        <w:pStyle w:val="Code"/>
-      </w:pPr>
-      <w:r>
-        <w:t>soil          41 %     ready</w:t>
-      </w:r>
-    </w:p>
-    <w:p>
-      <w:pPr>
-        <w:pStyle w:val="Heading2"/>
-      </w:pPr>
-      <w:r>
-        <w:t>Understand the First Result</w:t>
-      </w:r>
-    </w:p>
-    <w:p>
-      <w:r>
-        <w:t xml:space="preserve">The initial state should be </w:t>
-      </w:r>
-      <w:r>
-        <w:rPr>
-          <w:b/>
-        </w:rPr>
-        <w:t>normal</w:t>
-      </w:r>
-      <w:r>
-        <w:t xml:space="preserve">. The controller waits for three consecutive samples before changing state, which prevents a single noisy reading from creating an alert. See </w:t>
-      </w:r>
-      <w:r>
-        <w:rPr>
-          <w:color w:val="075E54"/>
-          <w:u w:val="single"/>
-        </w:rPr>
-        <w:t>Decision states</w:t>
-      </w:r>
-      <w:r>
-        <w:t xml:space="preserve"> for the complete rule.</w:t>
-      </w:r>
-    </w:p>
-    <w:p>
-      <w:r>
-        <w:t xml:space="preserve">If a sensor remains unavailable, follow </w:t>
-      </w:r>
-      <w:r>
-        <w:rPr>
-          <w:color w:val="075E54"/>
-          <w:u w:val="single"/>
-        </w:rPr>
-        <w:t>A sensor reports no data</w:t>
-      </w:r>
-      <w:r>
-        <w:t>.</w:t>
-      </w:r>
-    </w:p>
-    <w:p>
-      <w:r>
-        <w:t>The link text names the reader's problem instead of saying “click here.” The validator rejects common context-free labels and verifies the stable troubleshooting anchor. This makes the reference clearer in the page, a screen reader's links list, Word, and PDF.</w:t>
-      </w:r>
-    </w:p>
-    <w:p>
-      <w:pPr>
-        <w:pStyle w:val="Heading2"/>
-      </w:pPr>
-      <w:r>
-        <w:t>Next Step</w:t>
-      </w:r>
-    </w:p>
-    <w:p>
-      <w:r>
-        <w:t xml:space="preserve">Continue to the </w:t>
-      </w:r>
-      <w:r>
-        <w:rPr>
-          <w:color w:val="075E54"/>
-          <w:u w:val="single"/>
-        </w:rPr>
-        <w:t>daily operating routine</w:t>
-      </w:r>
-      <w:r>
-        <w:t>.</w:t>
-      </w:r>
-    </w:p>
-    <w:p>
-      <w:r>
-        <w:br w:type="page"/>
-      </w:r>
-    </w:p>
-    <w:p>
-      <w:pPr>
-        <w:pStyle w:val="Heading1"/>
-      </w:pPr>
-      <w:r>
-        <w:t>Operating Guide</w:t>
-      </w:r>
-    </w:p>
-    <w:p>
-      <w:r>
-        <w:t>The operating routine is designed for a volunteer who checks the greenhouse at opening and closing.</w:t>
-      </w:r>
-    </w:p>
-    <w:p>
-      <w:pPr>
-        <w:pStyle w:val="Heading2"/>
-      </w:pPr>
-      <w:r>
-        <w:t>Daily Check</w:t>
-      </w:r>
-    </w:p>
-    <w:p>
-      <w:pPr>
-        <w:pStyle w:val="ListNumber"/>
-        <w:numPr>
-          <w:ilvl w:val="0"/>
-          <w:numId w:val="12"/>
-        </w:numPr>
-        <w:ind w:left="576" w:hanging="360"/>
-      </w:pPr>
-      <w:r>
-        <w:t>Confirm the dashboard timestamp is less than two minutes old.</w:t>
-      </w:r>
-    </w:p>
-    <w:p>
-      <w:pPr>
-        <w:pStyle w:val="ListNumber"/>
-        <w:ind w:left="576" w:hanging="360"/>
-      </w:pPr>
-      <w:r>
-        <w:t>Review the current state and its explanation.</w:t>
-      </w:r>
-    </w:p>
-    <w:p>
-      <w:pPr>
-        <w:pStyle w:val="ListNumber"/>
-        <w:ind w:left="576" w:hanging="360"/>
-      </w:pPr>
-      <w:r>
-        <w:t>Compare soil moisture across the three most recent samples.</w:t>
-      </w:r>
-    </w:p>
-    <w:p>
-      <w:pPr>
-        <w:pStyle w:val="ListNumber"/>
-        <w:ind w:left="576" w:hanging="360"/>
-      </w:pPr>
-      <w:r>
-        <w:t>Acknowledge any completed response.</w:t>
-      </w:r>
-    </w:p>
-    <w:p>
-      <w:pPr>
-        <w:pStyle w:val="ListNumber"/>
-        <w:ind w:left="576" w:hanging="360"/>
-      </w:pPr>
-      <w:r>
-        <w:t>Record an observation only when local conditions differ from the sensor data.</w:t>
-      </w:r>
-    </w:p>
-    <w:p>
-      <w:pPr>
-        <w:pStyle w:val="Heading2"/>
-      </w:pPr>
-      <w:r>
-        <w:t>Respond to a State</w:t>
-      </w:r>
-    </w:p>
-    <w:p>
-      <w:pPr>
-        <w:pStyle w:val="Heading3"/>
-      </w:pPr>
-      <w:r>
-        <w:t>Normal</w:t>
-      </w:r>
-    </w:p>
-    <w:p>
-      <w:r>
-        <w:t>No intervention is required. Continue the scheduled check.</w:t>
-      </w:r>
-    </w:p>
-    <w:p>
-      <w:pPr>
-        <w:pStyle w:val="Heading3"/>
-      </w:pPr>
-      <w:r>
-        <w:t>Watch</w:t>
-      </w:r>
-    </w:p>
-    <w:p>
-      <w:r>
-        <w:t>Inspect the greenhouse within 30 minutes. Confirm the sensor is unobstructed and compare the reading with a handheld instrument when one is available.</w:t>
-      </w:r>
-    </w:p>
-    <w:p>
-      <w:pPr>
-        <w:pStyle w:val="Heading3"/>
-      </w:pPr>
-      <w:r>
-        <w:t>Act</w:t>
-      </w:r>
-    </w:p>
-    <w:p>
-      <w:r>
-        <w:t>Follow the response displayed with the alert. Ventilate for high temperature, inspect irrigation for low soil moisture, or check airflow for sustained high humidity. Never bypass a physical safety control.</w:t>
-      </w:r>
-    </w:p>
-    <w:p>
-      <w:pPr>
-        <w:pStyle w:val="Heading2"/>
-      </w:pPr>
-      <w:r>
-        <w:t>Acknowledge an Alert</w:t>
-      </w:r>
-    </w:p>
-    <w:p>
-      <w:r>
-        <w:t>Acknowledgement records that a person saw the alert. It does not change the sensor reading or decision state. Add a short note that states what you observed and what you did.</w:t>
-      </w:r>
-    </w:p>
-    <w:p>
-      <w:r>
-        <w:t xml:space="preserve">Good: </w:t>
-      </w:r>
-      <w:r>
-        <w:rPr>
-          <w:rFonts w:ascii="DejaVu Sans Mono" w:hAnsi="DejaVu Sans Mono" w:eastAsia="DejaVu Sans Mono"/>
-        </w:rPr>
-        <w:t>Opened roof vent; temperature fell to 27 C within 12 minutes.</w:t>
-      </w:r>
-    </w:p>
-    <w:p>
-      <w:r>
-        <w:t xml:space="preserve">Avoid: </w:t>
-      </w:r>
-      <w:r>
-        <w:rPr>
-          <w:rFonts w:ascii="DejaVu Sans Mono" w:hAnsi="DejaVu Sans Mono" w:eastAsia="DejaVu Sans Mono"/>
-        </w:rPr>
-        <w:t>Fixed.</w:t>
-      </w:r>
-    </w:p>
-    <w:p>
-      <w:r>
-        <w:t xml:space="preserve">For the system behavior behind these states, see </w:t>
-      </w:r>
-      <w:r>
-        <w:rPr>
-          <w:color w:val="075E54"/>
-          <w:u w:val="single"/>
-        </w:rPr>
-        <w:t>Decision states</w:t>
-      </w:r>
-      <w:r>
-        <w:t>.</w:t>
-      </w:r>
-    </w:p>
-    <w:p>
-      <w:r>
-        <w:t xml:space="preserve">This source link points to </w:t>
-      </w:r>
-      <w:r>
-        <w:rPr>
-          <w:rFonts w:ascii="DejaVu Sans Mono" w:hAnsi="DejaVu Sans Mono" w:eastAsia="DejaVu Sans Mono"/>
-        </w:rPr>
-        <w:t>architecture.md#decision-states</w:t>
-      </w:r>
-      <w:r>
-        <w:t xml:space="preserve">. The file path keeps the link useful in GitHub and other Markdown tools. Zensical rewrites it for the published site. The destination has an explicit </w:t>
-      </w:r>
-      <w:r>
-        <w:rPr>
-          <w:rFonts w:ascii="DejaVu Sans Mono" w:hAnsi="DejaVu Sans Mono" w:eastAsia="DejaVu Sans Mono"/>
-        </w:rPr>
-        <w:t>decision-states</w:t>
-      </w:r>
-      <w:r>
-        <w:t xml:space="preserve"> anchor, so minor heading edits do not break the reference. The independent validator confirms that both the file and anchor exist before publication.</w:t>
-      </w:r>
-    </w:p>
-    <w:p>
-      <w:r>
-        <w:br w:type="page"/>
-      </w:r>
-    </w:p>
-    <w:p>
-      <w:pPr>
-        <w:pStyle w:val="Heading1"/>
-      </w:pPr>
-      <w:r>
-        <w:t>Architecture</w:t>
-      </w:r>
-    </w:p>
-    <w:p>
-      <w:r>
-        <w:t>Greenhouse Sentinel separates measurement, evaluation, presentation, and response guidance so each part can be tested and explained independently.</w:t>
-      </w:r>
-    </w:p>
-    <w:p>
-      <w:pPr>
-        <w:pStyle w:val="Heading2"/>
-      </w:pPr>
-      <w:r>
-        <w:t>System Boundary</w:t>
-      </w:r>
-    </w:p>
-    <w:p>
-      <w:r>
-        <w:t>The hub receives local sensor readings and produces a recommendation. It does not operate pumps, vents, heaters, locks, or other physical equipment. A person remains responsible for any physical action.</w:t>
-      </w:r>
-    </w:p>
-    <w:p>
-      <w:pPr>
-        <w:pStyle w:val="Code"/>
-      </w:pPr>
-      <w:r>
-        <w:t>Sensors -&gt; sample normalizer -&gt; rule engine -&gt; local event store -&gt; dashboard</w:t>
-      </w:r>
-    </w:p>
-    <w:p>
-      <w:pPr>
-        <w:pStyle w:val="Code"/>
-      </w:pPr>
-      <w:r>
-        <w:t xml:space="preserve">                                  |</w:t>
-      </w:r>
-    </w:p>
-    <w:p>
-      <w:pPr>
-        <w:pStyle w:val="Code"/>
-      </w:pPr>
-      <w:r>
-        <w:t xml:space="preserve">                                  +-&gt; response guidance</w:t>
-      </w:r>
-    </w:p>
-    <w:p>
-      <w:pPr>
-        <w:pStyle w:val="Heading2"/>
-      </w:pPr>
-      <w:r>
-        <w:t>Components</w:t>
-      </w:r>
-    </w:p>
-    <w:p>
-      <w:pPr>
-        <w:pStyle w:val="ListBullet"/>
-      </w:pPr>
-      <w:r>
-        <w:rPr>
-          <w:b/>
-        </w:rPr>
-        <w:t>Sample normalizer:</w:t>
-      </w:r>
-      <w:r>
-        <w:t xml:space="preserve"> converts each supported sensor value to a consistent unit and marks stale data.</w:t>
-      </w:r>
-    </w:p>
-    <w:p>
-      <w:pPr>
-        <w:pStyle w:val="ListBullet"/>
-      </w:pPr>
-      <w:r>
-        <w:rPr>
-          <w:b/>
-        </w:rPr>
-        <w:t>Rule engine:</w:t>
-      </w:r>
-      <w:r>
-        <w:t xml:space="preserve"> evaluates the most recent valid samples against versioned thresholds.</w:t>
-      </w:r>
-    </w:p>
-    <w:p>
-      <w:pPr>
-        <w:pStyle w:val="ListBullet"/>
-      </w:pPr>
-      <w:r>
-        <w:rPr>
-          <w:b/>
-        </w:rPr>
-        <w:t>Event store:</w:t>
-      </w:r>
-      <w:r>
-        <w:t xml:space="preserve"> retains 30 days of readings, state changes, and acknowledgements on the hub.</w:t>
-      </w:r>
-    </w:p>
-    <w:p>
-      <w:pPr>
-        <w:pStyle w:val="ListBullet"/>
-      </w:pPr>
-      <w:r>
-        <w:rPr>
-          <w:b/>
-        </w:rPr>
-        <w:t>Dashboard:</w:t>
-      </w:r>
-      <w:r>
-        <w:t xml:space="preserve"> presents current conditions, recent trends, and the reason for the current state.</w:t>
-      </w:r>
-    </w:p>
-    <w:p>
-      <w:pPr>
-        <w:pStyle w:val="Heading2"/>
-      </w:pPr>
-      <w:r>
-        <w:t>Decision States</w:t>
-      </w:r>
-    </w:p>
-    <w:p>
-      <w:r>
-        <w:t>The engine assigns one of three states after three consecutive samples meet the same condition.</w:t>
       </w:r>
     </w:p>
     <w:tbl>
@@ -1401,12 +206,1611 @@
         </w:trPr>
         <w:tc>
           <w:tcPr>
-            <w:tcW w:type="dxa" w:w="3120"/>
+            <w:tcW w:type="dxa" w:w="2088"/>
             <w:shd w:fill="075E54"/>
+            <w:tcMar>
+              <w:top w:w="90" w:type="dxa"/>
+              <w:start w:w="120" w:type="dxa"/>
+              <w:bottom w:w="90" w:type="dxa"/>
+              <w:end w:w="120" w:type="dxa"/>
+            </w:tcMar>
           </w:tcPr>
           <w:p>
             <w:pPr>
-              <w:spacing w:line="276" w:lineRule="auto" w:after="40"/>
+              <w:spacing w:line="276" w:lineRule="auto" w:after="0"/>
+            </w:pPr>
+            <w:r>
+              <w:rPr>
+                <w:b/>
+                <w:color w:val="FFFFFF"/>
+              </w:rPr>
+              <w:t>Feature</w:t>
+            </w:r>
+          </w:p>
+        </w:tc>
+        <w:tc>
+          <w:tcPr>
+            <w:tcW w:type="dxa" w:w="3672"/>
+            <w:shd w:fill="075E54"/>
+            <w:tcMar>
+              <w:top w:w="90" w:type="dxa"/>
+              <w:start w:w="120" w:type="dxa"/>
+              <w:bottom w:w="90" w:type="dxa"/>
+              <w:end w:w="120" w:type="dxa"/>
+            </w:tcMar>
+          </w:tcPr>
+          <w:p>
+            <w:pPr>
+              <w:spacing w:line="276" w:lineRule="auto" w:after="0"/>
+            </w:pPr>
+            <w:r>
+              <w:rPr>
+                <w:b/>
+                <w:color w:val="FFFFFF"/>
+              </w:rPr>
+              <w:t>Made With</w:t>
+            </w:r>
+          </w:p>
+        </w:tc>
+        <w:tc>
+          <w:tcPr>
+            <w:tcW w:type="dxa" w:w="3600"/>
+            <w:shd w:fill="075E54"/>
+            <w:tcMar>
+              <w:top w:w="90" w:type="dxa"/>
+              <w:start w:w="120" w:type="dxa"/>
+              <w:bottom w:w="90" w:type="dxa"/>
+              <w:end w:w="120" w:type="dxa"/>
+            </w:tcMar>
+          </w:tcPr>
+          <w:p>
+            <w:pPr>
+              <w:spacing w:line="276" w:lineRule="auto" w:after="0"/>
+            </w:pPr>
+            <w:r>
+              <w:rPr>
+                <w:b/>
+                <w:color w:val="FFFFFF"/>
+              </w:rPr>
+              <w:t>Why It Helps</w:t>
+            </w:r>
+          </w:p>
+        </w:tc>
+      </w:tr>
+      <w:tr>
+        <w:tc>
+          <w:tcPr>
+            <w:tcW w:type="dxa" w:w="2088"/>
+            <w:tcMar>
+              <w:top w:w="90" w:type="dxa"/>
+              <w:start w:w="120" w:type="dxa"/>
+              <w:bottom w:w="90" w:type="dxa"/>
+              <w:end w:w="120" w:type="dxa"/>
+            </w:tcMar>
+          </w:tcPr>
+          <w:p>
+            <w:pPr>
+              <w:spacing w:line="276" w:lineRule="auto" w:after="0"/>
+            </w:pPr>
+            <w:r/>
+            <w:r>
+              <w:t>Single-Source Authoring</w:t>
+            </w:r>
+          </w:p>
+        </w:tc>
+        <w:tc>
+          <w:tcPr>
+            <w:tcW w:type="dxa" w:w="3672"/>
+            <w:tcMar>
+              <w:top w:w="90" w:type="dxa"/>
+              <w:start w:w="120" w:type="dxa"/>
+              <w:bottom w:w="90" w:type="dxa"/>
+              <w:end w:w="120" w:type="dxa"/>
+            </w:tcMar>
+          </w:tcPr>
+          <w:p>
+            <w:pPr>
+              <w:spacing w:line="276" w:lineRule="auto" w:after="0"/>
+            </w:pPr>
+            <w:r/>
+            <w:r>
+              <w:t xml:space="preserve">One reviewed set of Markdown files under </w:t>
+            </w:r>
+            <w:r>
+              <w:rPr>
+                <w:rFonts w:ascii="DejaVu Sans Mono" w:hAnsi="DejaVu Sans Mono" w:eastAsia="DejaVu Sans Mono"/>
+              </w:rPr>
+              <w:t>docs/</w:t>
+            </w:r>
+          </w:p>
+        </w:tc>
+        <w:tc>
+          <w:tcPr>
+            <w:tcW w:type="dxa" w:w="3600"/>
+            <w:tcMar>
+              <w:top w:w="90" w:type="dxa"/>
+              <w:start w:w="120" w:type="dxa"/>
+              <w:bottom w:w="90" w:type="dxa"/>
+              <w:end w:w="120" w:type="dxa"/>
+            </w:tcMar>
+          </w:tcPr>
+          <w:p>
+            <w:pPr>
+              <w:spacing w:line="276" w:lineRule="auto" w:after="0"/>
+            </w:pPr>
+            <w:r/>
+            <w:r>
+              <w:t>Authors change content once instead of reconciling separate website, Word, and PDF copies</w:t>
+            </w:r>
+          </w:p>
+        </w:tc>
+      </w:tr>
+      <w:tr>
+        <w:tc>
+          <w:tcPr>
+            <w:tcW w:type="dxa" w:w="2088"/>
+            <w:tcMar>
+              <w:top w:w="90" w:type="dxa"/>
+              <w:start w:w="120" w:type="dxa"/>
+              <w:bottom w:w="90" w:type="dxa"/>
+              <w:end w:w="120" w:type="dxa"/>
+            </w:tcMar>
+          </w:tcPr>
+          <w:p>
+            <w:pPr>
+              <w:spacing w:line="276" w:lineRule="auto" w:after="0"/>
+            </w:pPr>
+            <w:r/>
+            <w:r>
+              <w:t>Explicit Navigation</w:t>
+            </w:r>
+          </w:p>
+        </w:tc>
+        <w:tc>
+          <w:tcPr>
+            <w:tcW w:type="dxa" w:w="3672"/>
+            <w:tcMar>
+              <w:top w:w="90" w:type="dxa"/>
+              <w:start w:w="120" w:type="dxa"/>
+              <w:bottom w:w="90" w:type="dxa"/>
+              <w:end w:w="120" w:type="dxa"/>
+            </w:tcMar>
+          </w:tcPr>
+          <w:p>
+            <w:pPr>
+              <w:spacing w:line="276" w:lineRule="auto" w:after="0"/>
+            </w:pPr>
+            <w:r/>
+            <w:r>
+              <w:t xml:space="preserve">An ordered </w:t>
+            </w:r>
+            <w:r>
+              <w:rPr>
+                <w:rFonts w:ascii="DejaVu Sans Mono" w:hAnsi="DejaVu Sans Mono" w:eastAsia="DejaVu Sans Mono"/>
+              </w:rPr>
+              <w:t>nav</w:t>
+            </w:r>
+            <w:r>
+              <w:t xml:space="preserve"> list in </w:t>
+            </w:r>
+            <w:r>
+              <w:rPr>
+                <w:rFonts w:ascii="DejaVu Sans Mono" w:hAnsi="DejaVu Sans Mono" w:eastAsia="DejaVu Sans Mono"/>
+              </w:rPr>
+              <w:t>zensical.toml</w:t>
+            </w:r>
+            <w:r>
+              <w:t xml:space="preserve"> plus a check for unlisted pages</w:t>
+            </w:r>
+          </w:p>
+        </w:tc>
+        <w:tc>
+          <w:tcPr>
+            <w:tcW w:type="dxa" w:w="3600"/>
+            <w:tcMar>
+              <w:top w:w="90" w:type="dxa"/>
+              <w:start w:w="120" w:type="dxa"/>
+              <w:bottom w:w="90" w:type="dxa"/>
+              <w:end w:w="120" w:type="dxa"/>
+            </w:tcMar>
+          </w:tcPr>
+          <w:p>
+            <w:pPr>
+              <w:spacing w:line="276" w:lineRule="auto" w:after="0"/>
+            </w:pPr>
+            <w:r/>
+            <w:r>
+              <w:t>Readers get a deliberate sequence, and reviewers can trace every published page to its configuration</w:t>
+            </w:r>
+          </w:p>
+        </w:tc>
+      </w:tr>
+      <w:tr>
+        <w:tc>
+          <w:tcPr>
+            <w:tcW w:type="dxa" w:w="2088"/>
+            <w:tcMar>
+              <w:top w:w="90" w:type="dxa"/>
+              <w:start w:w="120" w:type="dxa"/>
+              <w:bottom w:w="90" w:type="dxa"/>
+              <w:end w:w="120" w:type="dxa"/>
+            </w:tcMar>
+          </w:tcPr>
+          <w:p>
+            <w:pPr>
+              <w:spacing w:line="276" w:lineRule="auto" w:after="0"/>
+            </w:pPr>
+            <w:r/>
+            <w:r>
+              <w:t>Stable Cross-References</w:t>
+            </w:r>
+          </w:p>
+        </w:tc>
+        <w:tc>
+          <w:tcPr>
+            <w:tcW w:type="dxa" w:w="3672"/>
+            <w:tcMar>
+              <w:top w:w="90" w:type="dxa"/>
+              <w:start w:w="120" w:type="dxa"/>
+              <w:bottom w:w="90" w:type="dxa"/>
+              <w:end w:w="120" w:type="dxa"/>
+            </w:tcMar>
+          </w:tcPr>
+          <w:p>
+            <w:pPr>
+              <w:spacing w:line="276" w:lineRule="auto" w:after="0"/>
+            </w:pPr>
+            <w:r/>
+            <w:r>
+              <w:t xml:space="preserve">Deliberate anchors on important targets, as shown by </w:t>
+            </w:r>
+            <w:r>
+              <w:rPr>
+                <w:color w:val="075E54"/>
+                <w:u w:val="single"/>
+              </w:rPr>
+              <w:t>Decision States</w:t>
+            </w:r>
+            <w:r>
+              <w:t>, plus automated fragment checks</w:t>
+            </w:r>
+          </w:p>
+        </w:tc>
+        <w:tc>
+          <w:tcPr>
+            <w:tcW w:type="dxa" w:w="3600"/>
+            <w:tcMar>
+              <w:top w:w="90" w:type="dxa"/>
+              <w:start w:w="120" w:type="dxa"/>
+              <w:bottom w:w="90" w:type="dxa"/>
+              <w:end w:w="120" w:type="dxa"/>
+            </w:tcMar>
+          </w:tcPr>
+          <w:p>
+            <w:pPr>
+              <w:spacing w:line="276" w:lineRule="auto" w:after="0"/>
+            </w:pPr>
+            <w:r/>
+            <w:r>
+              <w:t>Heading edits cannot silently strand important links</w:t>
+            </w:r>
+          </w:p>
+        </w:tc>
+      </w:tr>
+      <w:tr>
+        <w:tc>
+          <w:tcPr>
+            <w:tcW w:type="dxa" w:w="2088"/>
+            <w:tcMar>
+              <w:top w:w="90" w:type="dxa"/>
+              <w:start w:w="120" w:type="dxa"/>
+              <w:bottom w:w="90" w:type="dxa"/>
+              <w:end w:w="120" w:type="dxa"/>
+            </w:tcMar>
+          </w:tcPr>
+          <w:p>
+            <w:pPr>
+              <w:spacing w:line="276" w:lineRule="auto" w:after="0"/>
+            </w:pPr>
+            <w:r/>
+            <w:r>
+              <w:t>Automated Validation</w:t>
+            </w:r>
+          </w:p>
+        </w:tc>
+        <w:tc>
+          <w:tcPr>
+            <w:tcW w:type="dxa" w:w="3672"/>
+            <w:tcMar>
+              <w:top w:w="90" w:type="dxa"/>
+              <w:start w:w="120" w:type="dxa"/>
+              <w:bottom w:w="90" w:type="dxa"/>
+              <w:end w:w="120" w:type="dxa"/>
+            </w:tcMar>
+          </w:tcPr>
+          <w:p>
+            <w:pPr>
+              <w:spacing w:line="276" w:lineRule="auto" w:after="0"/>
+            </w:pPr>
+            <w:r/>
+            <w:r>
+              <w:rPr>
+                <w:rFonts w:ascii="DejaVu Sans Mono" w:hAnsi="DejaVu Sans Mono" w:eastAsia="DejaVu Sans Mono"/>
+              </w:rPr>
+              <w:t>scripts/validate_docs.py</w:t>
+            </w:r>
+            <w:r>
+              <w:t>, which checks navigation, files, links, anchors, heading structure, and image text</w:t>
+            </w:r>
+          </w:p>
+        </w:tc>
+        <w:tc>
+          <w:tcPr>
+            <w:tcW w:type="dxa" w:w="3600"/>
+            <w:tcMar>
+              <w:top w:w="90" w:type="dxa"/>
+              <w:start w:w="120" w:type="dxa"/>
+              <w:bottom w:w="90" w:type="dxa"/>
+              <w:end w:w="120" w:type="dxa"/>
+            </w:tcMar>
+          </w:tcPr>
+          <w:p>
+            <w:pPr>
+              <w:spacing w:line="276" w:lineRule="auto" w:after="0"/>
+            </w:pPr>
+            <w:r/>
+            <w:r>
+              <w:t>Routine defects are found in seconds and resolved before publication</w:t>
+            </w:r>
+          </w:p>
+        </w:tc>
+      </w:tr>
+      <w:tr>
+        <w:tc>
+          <w:tcPr>
+            <w:tcW w:type="dxa" w:w="2088"/>
+            <w:tcMar>
+              <w:top w:w="90" w:type="dxa"/>
+              <w:start w:w="120" w:type="dxa"/>
+              <w:bottom w:w="90" w:type="dxa"/>
+              <w:end w:w="120" w:type="dxa"/>
+            </w:tcMar>
+          </w:tcPr>
+          <w:p>
+            <w:pPr>
+              <w:spacing w:line="276" w:lineRule="auto" w:after="0"/>
+            </w:pPr>
+            <w:r/>
+            <w:r>
+              <w:t>Continuous Integration and Publishing</w:t>
+            </w:r>
+          </w:p>
+        </w:tc>
+        <w:tc>
+          <w:tcPr>
+            <w:tcW w:type="dxa" w:w="3672"/>
+            <w:tcMar>
+              <w:top w:w="90" w:type="dxa"/>
+              <w:start w:w="120" w:type="dxa"/>
+              <w:bottom w:w="90" w:type="dxa"/>
+              <w:end w:w="120" w:type="dxa"/>
+            </w:tcMar>
+          </w:tcPr>
+          <w:p>
+            <w:pPr>
+              <w:spacing w:line="276" w:lineRule="auto" w:after="0"/>
+            </w:pPr>
+            <w:r/>
+            <w:r>
+              <w:t>A GitHub Actions workflow that repeats validation and generation from a clean copy of each proposed change</w:t>
+            </w:r>
+          </w:p>
+        </w:tc>
+        <w:tc>
+          <w:tcPr>
+            <w:tcW w:type="dxa" w:w="3600"/>
+            <w:tcMar>
+              <w:top w:w="90" w:type="dxa"/>
+              <w:start w:w="120" w:type="dxa"/>
+              <w:bottom w:w="90" w:type="dxa"/>
+              <w:end w:w="120" w:type="dxa"/>
+            </w:tcMar>
+          </w:tcPr>
+          <w:p>
+            <w:pPr>
+              <w:spacing w:line="276" w:lineRule="auto" w:after="0"/>
+            </w:pPr>
+            <w:r/>
+            <w:r>
+              <w:t>Every release follows the same recorded process, improving consistency, accuracy, and traceability</w:t>
+            </w:r>
+          </w:p>
+        </w:tc>
+      </w:tr>
+      <w:tr>
+        <w:tc>
+          <w:tcPr>
+            <w:tcW w:type="dxa" w:w="2088"/>
+            <w:tcMar>
+              <w:top w:w="90" w:type="dxa"/>
+              <w:start w:w="120" w:type="dxa"/>
+              <w:bottom w:w="90" w:type="dxa"/>
+              <w:end w:w="120" w:type="dxa"/>
+            </w:tcMar>
+          </w:tcPr>
+          <w:p>
+            <w:pPr>
+              <w:spacing w:line="276" w:lineRule="auto" w:after="0"/>
+            </w:pPr>
+            <w:r/>
+            <w:r>
+              <w:t>Accessible Authoring</w:t>
+            </w:r>
+          </w:p>
+        </w:tc>
+        <w:tc>
+          <w:tcPr>
+            <w:tcW w:type="dxa" w:w="3672"/>
+            <w:tcMar>
+              <w:top w:w="90" w:type="dxa"/>
+              <w:start w:w="120" w:type="dxa"/>
+              <w:bottom w:w="90" w:type="dxa"/>
+              <w:end w:w="120" w:type="dxa"/>
+            </w:tcMar>
+          </w:tcPr>
+          <w:p>
+            <w:pPr>
+              <w:spacing w:line="276" w:lineRule="auto" w:after="0"/>
+            </w:pPr>
+            <w:r/>
+            <w:r>
+              <w:t>Source standards, validation rules, accessible theme overrides, and a release checklist</w:t>
+            </w:r>
+          </w:p>
+        </w:tc>
+        <w:tc>
+          <w:tcPr>
+            <w:tcW w:type="dxa" w:w="3600"/>
+            <w:tcMar>
+              <w:top w:w="90" w:type="dxa"/>
+              <w:start w:w="120" w:type="dxa"/>
+              <w:bottom w:w="90" w:type="dxa"/>
+              <w:end w:w="120" w:type="dxa"/>
+            </w:tcMar>
+          </w:tcPr>
+          <w:p>
+            <w:pPr>
+              <w:spacing w:line="276" w:lineRule="auto" w:after="0"/>
+            </w:pPr>
+            <w:r/>
+            <w:r>
+              <w:t>Accessibility is addressed while content is written and reviewed instead of as a late repair</w:t>
+            </w:r>
+          </w:p>
+        </w:tc>
+      </w:tr>
+      <w:tr>
+        <w:tc>
+          <w:tcPr>
+            <w:tcW w:type="dxa" w:w="2088"/>
+            <w:tcMar>
+              <w:top w:w="90" w:type="dxa"/>
+              <w:start w:w="120" w:type="dxa"/>
+              <w:bottom w:w="90" w:type="dxa"/>
+              <w:end w:w="120" w:type="dxa"/>
+            </w:tcMar>
+          </w:tcPr>
+          <w:p>
+            <w:pPr>
+              <w:spacing w:line="276" w:lineRule="auto" w:after="0"/>
+            </w:pPr>
+            <w:r/>
+            <w:r>
+              <w:t>Replaceable Branding</w:t>
+            </w:r>
+          </w:p>
+        </w:tc>
+        <w:tc>
+          <w:tcPr>
+            <w:tcW w:type="dxa" w:w="3672"/>
+            <w:tcMar>
+              <w:top w:w="90" w:type="dxa"/>
+              <w:start w:w="120" w:type="dxa"/>
+              <w:bottom w:w="90" w:type="dxa"/>
+              <w:end w:w="120" w:type="dxa"/>
+            </w:tcMar>
+          </w:tcPr>
+          <w:p>
+            <w:pPr>
+              <w:spacing w:line="276" w:lineRule="auto" w:after="0"/>
+            </w:pPr>
+            <w:r/>
+            <w:r>
+              <w:t>CSS variables, a separate logo asset, and publishing configuration outside the Markdown</w:t>
+            </w:r>
+          </w:p>
+        </w:tc>
+        <w:tc>
+          <w:tcPr>
+            <w:tcW w:type="dxa" w:w="3600"/>
+            <w:tcMar>
+              <w:top w:w="90" w:type="dxa"/>
+              <w:start w:w="120" w:type="dxa"/>
+              <w:bottom w:w="90" w:type="dxa"/>
+              <w:end w:w="120" w:type="dxa"/>
+            </w:tcMar>
+          </w:tcPr>
+          <w:p>
+            <w:pPr>
+              <w:spacing w:line="276" w:lineRule="auto" w:after="0"/>
+            </w:pPr>
+            <w:r/>
+            <w:r>
+              <w:t>An organization can change the visual identity without rewriting or forking technical content</w:t>
+            </w:r>
+          </w:p>
+        </w:tc>
+      </w:tr>
+      <w:tr>
+        <w:tc>
+          <w:tcPr>
+            <w:tcW w:type="dxa" w:w="2088"/>
+            <w:tcMar>
+              <w:top w:w="90" w:type="dxa"/>
+              <w:start w:w="120" w:type="dxa"/>
+              <w:bottom w:w="90" w:type="dxa"/>
+              <w:end w:w="120" w:type="dxa"/>
+            </w:tcMar>
+          </w:tcPr>
+          <w:p>
+            <w:pPr>
+              <w:spacing w:line="276" w:lineRule="auto" w:after="0"/>
+            </w:pPr>
+            <w:r/>
+            <w:r>
+              <w:t>Multi-Format Delivery</w:t>
+            </w:r>
+          </w:p>
+        </w:tc>
+        <w:tc>
+          <w:tcPr>
+            <w:tcW w:type="dxa" w:w="3672"/>
+            <w:tcMar>
+              <w:top w:w="90" w:type="dxa"/>
+              <w:start w:w="120" w:type="dxa"/>
+              <w:bottom w:w="90" w:type="dxa"/>
+              <w:end w:w="120" w:type="dxa"/>
+            </w:tcMar>
+          </w:tcPr>
+          <w:p>
+            <w:pPr>
+              <w:spacing w:line="276" w:lineRule="auto" w:after="0"/>
+            </w:pPr>
+            <w:r/>
+            <w:r>
+              <w:t>Zensical for HTML, a Python export script for Word, and headless LibreOffice for PDF</w:t>
+            </w:r>
+          </w:p>
+        </w:tc>
+        <w:tc>
+          <w:tcPr>
+            <w:tcW w:type="dxa" w:w="3600"/>
+            <w:tcMar>
+              <w:top w:w="90" w:type="dxa"/>
+              <w:start w:w="120" w:type="dxa"/>
+              <w:bottom w:w="90" w:type="dxa"/>
+              <w:end w:w="120" w:type="dxa"/>
+            </w:tcMar>
+          </w:tcPr>
+          <w:p>
+            <w:pPr>
+              <w:spacing w:line="276" w:lineRule="auto" w:after="0"/>
+            </w:pPr>
+            <w:r/>
+            <w:r>
+              <w:t>Teams serve web and portable-document readers without maintaining three competing sources</w:t>
+            </w:r>
+          </w:p>
+        </w:tc>
+      </w:tr>
+      <w:tr>
+        <w:tc>
+          <w:tcPr>
+            <w:tcW w:type="dxa" w:w="2088"/>
+            <w:tcMar>
+              <w:top w:w="90" w:type="dxa"/>
+              <w:start w:w="120" w:type="dxa"/>
+              <w:bottom w:w="90" w:type="dxa"/>
+              <w:end w:w="120" w:type="dxa"/>
+            </w:tcMar>
+          </w:tcPr>
+          <w:p>
+            <w:pPr>
+              <w:spacing w:line="276" w:lineRule="auto" w:after="0"/>
+            </w:pPr>
+            <w:r/>
+            <w:r>
+              <w:t>Self-Documentation</w:t>
+            </w:r>
+          </w:p>
+        </w:tc>
+        <w:tc>
+          <w:tcPr>
+            <w:tcW w:type="dxa" w:w="3672"/>
+            <w:tcMar>
+              <w:top w:w="90" w:type="dxa"/>
+              <w:start w:w="120" w:type="dxa"/>
+              <w:bottom w:w="90" w:type="dxa"/>
+              <w:end w:w="120" w:type="dxa"/>
+            </w:tcMar>
+          </w:tcPr>
+          <w:p>
+            <w:pPr>
+              <w:spacing w:line="276" w:lineRule="auto" w:after="0"/>
+            </w:pPr>
+            <w:r/>
+            <w:r>
+              <w:t>Implementation notes, a complete build chapter, contributor guidance, and links to the actual configuration and scripts</w:t>
+            </w:r>
+          </w:p>
+        </w:tc>
+        <w:tc>
+          <w:tcPr>
+            <w:tcW w:type="dxa" w:w="3600"/>
+            <w:tcMar>
+              <w:top w:w="90" w:type="dxa"/>
+              <w:start w:w="120" w:type="dxa"/>
+              <w:bottom w:w="90" w:type="dxa"/>
+              <w:end w:w="120" w:type="dxa"/>
+            </w:tcMar>
+          </w:tcPr>
+          <w:p>
+            <w:pPr>
+              <w:spacing w:line="276" w:lineRule="auto" w:after="0"/>
+            </w:pPr>
+            <w:r/>
+            <w:r>
+              <w:t>Another writer can inspect, explain, reproduce, or adapt the workflow without undocumented setup knowledge</w:t>
+            </w:r>
+          </w:p>
+        </w:tc>
+      </w:tr>
+    </w:tbl>
+    <w:p>
+      <w:pPr>
+        <w:spacing w:before="160"/>
+      </w:pPr>
+      <w:r>
+        <w:t xml:space="preserve">See </w:t>
+      </w:r>
+      <w:r>
+        <w:rPr>
+          <w:color w:val="075E54"/>
+          <w:u w:val="single"/>
+        </w:rPr>
+        <w:t>How This Repository Works</w:t>
+      </w:r>
+      <w:r>
+        <w:t xml:space="preserve"> for a closer look at the implementation and benefit of each feature.</w:t>
+      </w:r>
+    </w:p>
+    <w:p>
+      <w:pPr>
+        <w:pStyle w:val="Heading2"/>
+      </w:pPr>
+      <w:r>
+        <w:t>Architecture at a Glance</w:t>
+      </w:r>
+    </w:p>
+    <w:p>
+      <w:pPr>
+        <w:pStyle w:val="Code"/>
+      </w:pPr>
+      <w:r>
+        <w:t>One reviewed Markdown source</w:t>
+      </w:r>
+    </w:p>
+    <w:p>
+      <w:pPr>
+        <w:pStyle w:val="Code"/>
+      </w:pPr>
+      <w:r>
+        <w:t xml:space="preserve">          |</w:t>
+      </w:r>
+    </w:p>
+    <w:p>
+      <w:pPr>
+        <w:pStyle w:val="Code"/>
+      </w:pPr>
+      <w:r>
+        <w:t xml:space="preserve">          +--&gt; validation --&gt; pull-request and release gates</w:t>
+      </w:r>
+    </w:p>
+    <w:p>
+      <w:pPr>
+        <w:pStyle w:val="Code"/>
+      </w:pPr>
+      <w:r>
+        <w:t xml:space="preserve">          |</w:t>
+      </w:r>
+    </w:p>
+    <w:p>
+      <w:pPr>
+        <w:pStyle w:val="Code"/>
+      </w:pPr>
+      <w:r>
+        <w:t xml:space="preserve">          +--&gt; Zensical --&gt; searchable HTML site</w:t>
+      </w:r>
+    </w:p>
+    <w:p>
+      <w:pPr>
+        <w:pStyle w:val="Code"/>
+      </w:pPr>
+      <w:r>
+        <w:t xml:space="preserve">          |</w:t>
+      </w:r>
+    </w:p>
+    <w:p>
+      <w:pPr>
+        <w:pStyle w:val="Code"/>
+      </w:pPr>
+      <w:r>
+        <w:t xml:space="preserve">          +--&gt; export script --&gt; Word handbook --&gt; PDF handbook</w:t>
+      </w:r>
+    </w:p>
+    <w:p>
+      <w:pPr>
+        <w:pStyle w:val="Code"/>
+      </w:pPr>
+      <w:r/>
+    </w:p>
+    <w:p>
+      <w:pPr>
+        <w:pStyle w:val="Code"/>
+      </w:pPr>
+      <w:r>
+        <w:t>Brand tokens change presentation without changing source meaning.</w:t>
+      </w:r>
+    </w:p>
+    <w:p>
+      <w:r>
+        <w:t>The renderer can change while the release requirements remain stable. Explicit navigation, valid links and anchors, accessible structure, reproducible builds, and reviewable changes remain required.</w:t>
+      </w:r>
+    </w:p>
+    <w:p>
+      <w:pPr>
+        <w:pStyle w:val="Heading2"/>
+      </w:pPr>
+      <w:r>
+        <w:t>The Fictional Product in 30 Seconds</w:t>
+      </w:r>
+    </w:p>
+    <w:p>
+      <w:r>
+        <w:t xml:space="preserve">Greenhouse Sentinel samples temperature, humidity, and soil moisture every 60 seconds. A rule engine assigns the greenhouse a state: </w:t>
+      </w:r>
+      <w:r>
+        <w:rPr>
+          <w:b/>
+        </w:rPr>
+        <w:t>normal</w:t>
+      </w:r>
+      <w:r>
+        <w:t xml:space="preserve">, </w:t>
+      </w:r>
+      <w:r>
+        <w:rPr>
+          <w:b/>
+        </w:rPr>
+        <w:t>watch</w:t>
+      </w:r>
+      <w:r>
+        <w:t xml:space="preserve">, or </w:t>
+      </w:r>
+      <w:r>
+        <w:rPr>
+          <w:b/>
+        </w:rPr>
+        <w:t>act</w:t>
+      </w:r>
+      <w:r>
+        <w:t>. The operator dashboard explains the reading and links each alert to a documented response.</w:t>
+      </w:r>
+    </w:p>
+    <w:p>
+      <w:pPr>
+        <w:pStyle w:val="Callout"/>
+        <w:shd w:fill="E8F2F0"/>
+        <w:pBdr>
+          <w:left w:val="single" w:sz="18" w:space="8" w:color="B45309"/>
+        </w:pBdr>
+      </w:pPr>
+      <w:r>
+        <w:rPr>
+          <w:b/>
+          <w:color w:val="075E54"/>
+        </w:rPr>
+        <w:t xml:space="preserve">Portfolio disclosure. </w:t>
+      </w:r>
+      <w:r>
+        <w:t>Greenhouse Sentinel does not exist. Its behavior, data, and interface are intentionally simple and invented. The repository exists to demonstrate documentation architecture, authoring, validation, CI, publishing, and multi-format delivery without confidential information.</w:t>
+      </w:r>
+    </w:p>
+    <w:p>
+      <w:pPr>
+        <w:pStyle w:val="Heading2"/>
+      </w:pPr>
+      <w:r>
+        <w:t>What Is Included</w:t>
+      </w:r>
+    </w:p>
+    <w:p>
+      <w:pPr>
+        <w:pStyle w:val="ListBullet"/>
+      </w:pPr>
+      <w:r>
+        <w:rPr>
+          <w:b/>
+        </w:rPr>
+        <w:t>Product documentation</w:t>
+      </w:r>
+      <w:r>
+        <w:t xml:space="preserve"> proves the workflow can support task-based technical content. Start with the </w:t>
+      </w:r>
+      <w:r>
+        <w:rPr>
+          <w:color w:val="075E54"/>
+          <w:u w:val="single"/>
+        </w:rPr>
+        <w:t>quick start</w:t>
+      </w:r>
+      <w:r>
+        <w:t xml:space="preserve">, </w:t>
+      </w:r>
+      <w:r>
+        <w:rPr>
+          <w:color w:val="075E54"/>
+          <w:u w:val="single"/>
+        </w:rPr>
+        <w:t>operating guide</w:t>
+      </w:r>
+      <w:r>
+        <w:t xml:space="preserve">, and </w:t>
+      </w:r>
+      <w:r>
+        <w:rPr>
+          <w:color w:val="075E54"/>
+          <w:u w:val="single"/>
+        </w:rPr>
+        <w:t>architecture</w:t>
+      </w:r>
+      <w:r>
+        <w:t>.</w:t>
+      </w:r>
+    </w:p>
+    <w:p>
+      <w:pPr>
+        <w:pStyle w:val="ListBullet"/>
+      </w:pPr>
+      <w:r>
+        <w:rPr>
+          <w:b/>
+        </w:rPr>
+        <w:t>Repository documentation</w:t>
+      </w:r>
+      <w:r>
+        <w:t xml:space="preserve"> reveals how the example is assembled and governed. Read </w:t>
+      </w:r>
+      <w:r>
+        <w:rPr>
+          <w:color w:val="075E54"/>
+          <w:u w:val="single"/>
+        </w:rPr>
+        <w:t>How This Repository Works</w:t>
+      </w:r>
+      <w:r>
+        <w:t xml:space="preserve"> and </w:t>
+      </w:r>
+      <w:r>
+        <w:rPr>
+          <w:color w:val="075E54"/>
+          <w:u w:val="single"/>
+        </w:rPr>
+        <w:t>Build It from Scratch</w:t>
+      </w:r>
+      <w:r>
+        <w:t>.</w:t>
+      </w:r>
+    </w:p>
+    <w:p>
+      <w:pPr>
+        <w:pStyle w:val="ListBullet"/>
+      </w:pPr>
+      <w:r>
+        <w:rPr>
+          <w:b/>
+        </w:rPr>
+        <w:t>Contributor guidance</w:t>
+      </w:r>
+      <w:r>
+        <w:t xml:space="preserve"> makes quality expectations explicit and repeatable. Review the </w:t>
+      </w:r>
+      <w:r>
+        <w:rPr>
+          <w:color w:val="075E54"/>
+          <w:u w:val="single"/>
+        </w:rPr>
+        <w:t>writing guide</w:t>
+      </w:r>
+      <w:r>
+        <w:t xml:space="preserve">, </w:t>
+      </w:r>
+      <w:r>
+        <w:rPr>
+          <w:color w:val="075E54"/>
+          <w:u w:val="single"/>
+        </w:rPr>
+        <w:t>accessibility standard</w:t>
+      </w:r>
+      <w:r>
+        <w:t xml:space="preserve">, and </w:t>
+      </w:r>
+      <w:r>
+        <w:rPr>
+          <w:color w:val="075E54"/>
+          <w:u w:val="single"/>
+        </w:rPr>
+        <w:t>release checklist</w:t>
+      </w:r>
+      <w:r>
+        <w:t>.</w:t>
+      </w:r>
+    </w:p>
+    <w:p>
+      <w:pPr>
+        <w:pStyle w:val="ListBullet"/>
+      </w:pPr>
+      <w:r>
+        <w:rPr>
+          <w:b/>
+        </w:rPr>
+        <w:t>Generated deliverables</w:t>
+      </w:r>
+      <w:r>
+        <w:t xml:space="preserve"> prove that one reviewed source can support several channels. Use the Word and PDF download buttons above to inspect the portable versions.</w:t>
+      </w:r>
+    </w:p>
+    <w:p>
+      <w:pPr>
+        <w:pStyle w:val="Heading2"/>
+      </w:pPr>
+      <w:r>
+        <w:t>Public Portfolio Scope</w:t>
+      </w:r>
+    </w:p>
+    <w:p>
+      <w:r>
+        <w:t>All product names, specifications, incidents, commands, and workflows in this demonstration are invented. The repository contains no Peraton-specific, customer, proprietary, export-controlled, or classified information. “ThreatBoard-style” describes the general docs-as-code pattern demonstrated by this sample, not copied content or branding.</w:t>
+      </w:r>
+    </w:p>
+    <w:p>
+      <w:r>
+        <w:t xml:space="preserve">Katie Kearns created this sample as a technical-writing and documentation-systems portfolio project. The code and documentation are available under the </w:t>
+      </w:r>
+      <w:r>
+        <w:rPr>
+          <w:color w:val="075E54"/>
+          <w:u w:val="single"/>
+        </w:rPr>
+        <w:t>MIT License</w:t>
+      </w:r>
+      <w:r>
+        <w:t>.</w:t>
+      </w:r>
+    </w:p>
+    <w:p>
+      <w:r>
+        <w:br w:type="page"/>
+      </w:r>
+    </w:p>
+    <w:p>
+      <w:pPr>
+        <w:pStyle w:val="Heading1"/>
+      </w:pPr>
+      <w:r>
+        <w:t>Quick Start</w:t>
+      </w:r>
+    </w:p>
+    <w:p>
+      <w:r>
+        <w:t>This walkthrough connects a fictional Sentinel hub and confirms that its three sensors are reporting. No hardware is required. The commands are illustrative.</w:t>
+      </w:r>
+    </w:p>
+    <w:p>
+      <w:pPr>
+        <w:pStyle w:val="Heading2"/>
+      </w:pPr>
+      <w:r>
+        <w:t>Before You Begin</w:t>
+      </w:r>
+    </w:p>
+    <w:p>
+      <w:r>
+        <w:t>You need a Sentinel hub, one temperature and humidity probe, one soil probe, and access to the greenhouse Wi-Fi network.</w:t>
+      </w:r>
+    </w:p>
+    <w:p>
+      <w:pPr>
+        <w:pStyle w:val="Heading2"/>
+      </w:pPr>
+      <w:r>
+        <w:t>Connect and Verify</w:t>
+      </w:r>
+    </w:p>
+    <w:p>
+      <w:pPr>
+        <w:pStyle w:val="ListNumber"/>
+        <w:numPr>
+          <w:ilvl w:val="0"/>
+          <w:numId w:val="11"/>
+        </w:numPr>
+        <w:ind w:left="576" w:hanging="360"/>
+      </w:pPr>
+      <w:r>
+        <w:t>Place the hub above the irrigation line and away from direct spray.</w:t>
+      </w:r>
+    </w:p>
+    <w:p>
+      <w:pPr>
+        <w:pStyle w:val="ListNumber"/>
+        <w:ind w:left="576" w:hanging="360"/>
+      </w:pPr>
+      <w:r>
+        <w:t>Connect both probes before applying power.</w:t>
+      </w:r>
+    </w:p>
+    <w:p>
+      <w:pPr>
+        <w:pStyle w:val="ListNumber"/>
+        <w:ind w:left="576" w:hanging="360"/>
+      </w:pPr>
+      <w:r>
+        <w:t xml:space="preserve">Join the temporary network named </w:t>
+      </w:r>
+      <w:r>
+        <w:rPr>
+          <w:rFonts w:ascii="DejaVu Sans Mono" w:hAnsi="DejaVu Sans Mono" w:eastAsia="DejaVu Sans Mono"/>
+        </w:rPr>
+        <w:t>sentinel-setup</w:t>
+      </w:r>
+      <w:r>
+        <w:t>.</w:t>
+      </w:r>
+    </w:p>
+    <w:p>
+      <w:pPr>
+        <w:pStyle w:val="ListNumber"/>
+        <w:ind w:left="576" w:hanging="360"/>
+      </w:pPr>
+      <w:r>
+        <w:t xml:space="preserve">Open </w:t>
+      </w:r>
+      <w:r>
+        <w:rPr>
+          <w:rFonts w:ascii="DejaVu Sans Mono" w:hAnsi="DejaVu Sans Mono" w:eastAsia="DejaVu Sans Mono"/>
+        </w:rPr>
+        <w:t>http://sentinel.local</w:t>
+      </w:r>
+      <w:r>
+        <w:t xml:space="preserve"> and choose the greenhouse network.</w:t>
+      </w:r>
+    </w:p>
+    <w:p>
+      <w:pPr>
+        <w:pStyle w:val="ListNumber"/>
+        <w:ind w:left="576" w:hanging="360"/>
+      </w:pPr>
+      <w:r>
+        <w:t xml:space="preserve">Select </w:t>
+      </w:r>
+      <w:r>
+        <w:rPr>
+          <w:b/>
+        </w:rPr>
+        <w:t>Run sensor check</w:t>
+      </w:r>
+      <w:r>
+        <w:t>.</w:t>
+      </w:r>
+    </w:p>
+    <w:p>
+      <w:r>
+        <w:t>A successful check reports all three readings and changes the hub indicator from amber to green.</w:t>
+      </w:r>
+    </w:p>
+    <w:p>
+      <w:pPr>
+        <w:pStyle w:val="Code"/>
+      </w:pPr>
+      <w:r>
+        <w:t>temperature   24.1 C   ready</w:t>
+      </w:r>
+    </w:p>
+    <w:p>
+      <w:pPr>
+        <w:pStyle w:val="Code"/>
+      </w:pPr>
+      <w:r>
+        <w:t>humidity      58 %     ready</w:t>
+      </w:r>
+    </w:p>
+    <w:p>
+      <w:pPr>
+        <w:pStyle w:val="Code"/>
+      </w:pPr>
+      <w:r>
+        <w:t>soil          41 %     ready</w:t>
+      </w:r>
+    </w:p>
+    <w:p>
+      <w:pPr>
+        <w:pStyle w:val="Heading2"/>
+      </w:pPr>
+      <w:r>
+        <w:t>Understand the First Result</w:t>
+      </w:r>
+    </w:p>
+    <w:p>
+      <w:r>
+        <w:t xml:space="preserve">The initial state should be </w:t>
+      </w:r>
+      <w:r>
+        <w:rPr>
+          <w:b/>
+        </w:rPr>
+        <w:t>normal</w:t>
+      </w:r>
+      <w:r>
+        <w:t xml:space="preserve">. The controller waits for three consecutive samples before changing state, which prevents a single noisy reading from creating an alert. See </w:t>
+      </w:r>
+      <w:r>
+        <w:rPr>
+          <w:color w:val="075E54"/>
+          <w:u w:val="single"/>
+        </w:rPr>
+        <w:t>Decision states</w:t>
+      </w:r>
+      <w:r>
+        <w:t xml:space="preserve"> for the complete rule.</w:t>
+      </w:r>
+    </w:p>
+    <w:p>
+      <w:r>
+        <w:t xml:space="preserve">If a sensor remains unavailable, follow </w:t>
+      </w:r>
+      <w:r>
+        <w:rPr>
+          <w:color w:val="075E54"/>
+          <w:u w:val="single"/>
+        </w:rPr>
+        <w:t>A sensor reports no data</w:t>
+      </w:r>
+      <w:r>
+        <w:t>.</w:t>
+      </w:r>
+    </w:p>
+    <w:p>
+      <w:pPr>
+        <w:pStyle w:val="Callout"/>
+        <w:shd w:fill="E8F2F0"/>
+        <w:pBdr>
+          <w:left w:val="single" w:sz="18" w:space="8" w:color="B45309"/>
+        </w:pBdr>
+      </w:pPr>
+      <w:r>
+        <w:rPr>
+          <w:b/>
+          <w:color w:val="075E54"/>
+        </w:rPr>
+        <w:t xml:space="preserve">Feature in action: task-oriented linking. </w:t>
+      </w:r>
+      <w:r>
+        <w:t>The link text names the reader's problem instead of saying “click here.” The validator rejects common context-free labels and verifies the stable troubleshooting anchor. This makes the reference clearer in the page, a screen reader's links list, Word, and PDF.</w:t>
+      </w:r>
+    </w:p>
+    <w:p>
+      <w:pPr>
+        <w:pStyle w:val="Heading2"/>
+      </w:pPr>
+      <w:r>
+        <w:t>Next Step</w:t>
+      </w:r>
+    </w:p>
+    <w:p>
+      <w:r>
+        <w:t xml:space="preserve">Continue to the </w:t>
+      </w:r>
+      <w:r>
+        <w:rPr>
+          <w:color w:val="075E54"/>
+          <w:u w:val="single"/>
+        </w:rPr>
+        <w:t>daily operating routine</w:t>
+      </w:r>
+      <w:r>
+        <w:t>.</w:t>
+      </w:r>
+    </w:p>
+    <w:p>
+      <w:r>
+        <w:br w:type="page"/>
+      </w:r>
+    </w:p>
+    <w:p>
+      <w:pPr>
+        <w:pStyle w:val="Heading1"/>
+      </w:pPr>
+      <w:r>
+        <w:t>Operating Guide</w:t>
+      </w:r>
+    </w:p>
+    <w:p>
+      <w:r>
+        <w:t>The operating routine is designed for a volunteer who checks the greenhouse at opening and closing.</w:t>
+      </w:r>
+    </w:p>
+    <w:p>
+      <w:pPr>
+        <w:pStyle w:val="Heading2"/>
+      </w:pPr>
+      <w:r>
+        <w:t>Daily Check</w:t>
+      </w:r>
+    </w:p>
+    <w:p>
+      <w:pPr>
+        <w:pStyle w:val="ListNumber"/>
+        <w:numPr>
+          <w:ilvl w:val="0"/>
+          <w:numId w:val="12"/>
+        </w:numPr>
+        <w:ind w:left="576" w:hanging="360"/>
+      </w:pPr>
+      <w:r>
+        <w:t>Confirm the dashboard timestamp is less than two minutes old.</w:t>
+      </w:r>
+    </w:p>
+    <w:p>
+      <w:pPr>
+        <w:pStyle w:val="ListNumber"/>
+        <w:ind w:left="576" w:hanging="360"/>
+      </w:pPr>
+      <w:r>
+        <w:t>Review the current state and its explanation.</w:t>
+      </w:r>
+    </w:p>
+    <w:p>
+      <w:pPr>
+        <w:pStyle w:val="ListNumber"/>
+        <w:ind w:left="576" w:hanging="360"/>
+      </w:pPr>
+      <w:r>
+        <w:t>Compare soil moisture across the three most recent samples.</w:t>
+      </w:r>
+    </w:p>
+    <w:p>
+      <w:pPr>
+        <w:pStyle w:val="ListNumber"/>
+        <w:ind w:left="576" w:hanging="360"/>
+      </w:pPr>
+      <w:r>
+        <w:t>Acknowledge any completed response.</w:t>
+      </w:r>
+    </w:p>
+    <w:p>
+      <w:pPr>
+        <w:pStyle w:val="ListNumber"/>
+        <w:ind w:left="576" w:hanging="360"/>
+      </w:pPr>
+      <w:r>
+        <w:t>Record an observation only when local conditions differ from the sensor data.</w:t>
+      </w:r>
+    </w:p>
+    <w:p>
+      <w:pPr>
+        <w:pStyle w:val="Heading2"/>
+      </w:pPr>
+      <w:r>
+        <w:t>Respond to a State</w:t>
+      </w:r>
+    </w:p>
+    <w:p>
+      <w:pPr>
+        <w:pStyle w:val="Heading3"/>
+      </w:pPr>
+      <w:r>
+        <w:t>Normal</w:t>
+      </w:r>
+    </w:p>
+    <w:p>
+      <w:r>
+        <w:t>No intervention is required. Continue the scheduled check.</w:t>
+      </w:r>
+    </w:p>
+    <w:p>
+      <w:pPr>
+        <w:pStyle w:val="Heading3"/>
+      </w:pPr>
+      <w:r>
+        <w:t>Watch</w:t>
+      </w:r>
+    </w:p>
+    <w:p>
+      <w:r>
+        <w:t>Inspect the greenhouse within 30 minutes. Confirm the sensor is unobstructed and compare the reading with a handheld instrument when one is available.</w:t>
+      </w:r>
+    </w:p>
+    <w:p>
+      <w:pPr>
+        <w:pStyle w:val="Heading3"/>
+      </w:pPr>
+      <w:r>
+        <w:t>Act</w:t>
+      </w:r>
+    </w:p>
+    <w:p>
+      <w:r>
+        <w:t>Follow the response displayed with the alert. Ventilate for high temperature, inspect irrigation for low soil moisture, or check airflow for sustained high humidity. Never bypass a physical safety control.</w:t>
+      </w:r>
+    </w:p>
+    <w:p>
+      <w:pPr>
+        <w:pStyle w:val="Heading2"/>
+      </w:pPr>
+      <w:r>
+        <w:t>Acknowledge an Alert</w:t>
+      </w:r>
+    </w:p>
+    <w:p>
+      <w:r>
+        <w:t>Acknowledgement records that a person saw the alert. It does not change the sensor reading or decision state. Add a short note that states what you observed and what you did.</w:t>
+      </w:r>
+    </w:p>
+    <w:p>
+      <w:r>
+        <w:t xml:space="preserve">Good: </w:t>
+      </w:r>
+      <w:r>
+        <w:rPr>
+          <w:rFonts w:ascii="DejaVu Sans Mono" w:hAnsi="DejaVu Sans Mono" w:eastAsia="DejaVu Sans Mono"/>
+        </w:rPr>
+        <w:t>Opened roof vent; temperature fell to 27 C within 12 minutes.</w:t>
+      </w:r>
+    </w:p>
+    <w:p>
+      <w:r>
+        <w:t xml:space="preserve">Avoid: </w:t>
+      </w:r>
+      <w:r>
+        <w:rPr>
+          <w:rFonts w:ascii="DejaVu Sans Mono" w:hAnsi="DejaVu Sans Mono" w:eastAsia="DejaVu Sans Mono"/>
+        </w:rPr>
+        <w:t>Fixed.</w:t>
+      </w:r>
+    </w:p>
+    <w:p>
+      <w:r>
+        <w:t xml:space="preserve">For the system behavior behind these states, see </w:t>
+      </w:r>
+      <w:r>
+        <w:rPr>
+          <w:color w:val="075E54"/>
+          <w:u w:val="single"/>
+        </w:rPr>
+        <w:t>Decision states</w:t>
+      </w:r>
+      <w:r>
+        <w:t>.</w:t>
+      </w:r>
+    </w:p>
+    <w:p>
+      <w:pPr>
+        <w:pStyle w:val="Callout"/>
+        <w:shd w:fill="E8F2F0"/>
+        <w:pBdr>
+          <w:left w:val="single" w:sz="18" w:space="8" w:color="B45309"/>
+        </w:pBdr>
+      </w:pPr>
+      <w:r>
+        <w:rPr>
+          <w:b/>
+          <w:color w:val="075E54"/>
+        </w:rPr>
+        <w:t xml:space="preserve">Feature in action: stable cross-reference. </w:t>
+      </w:r>
+      <w:r>
+        <w:t xml:space="preserve">This source link points to </w:t>
+      </w:r>
+      <w:r>
+        <w:rPr>
+          <w:rFonts w:ascii="DejaVu Sans Mono" w:hAnsi="DejaVu Sans Mono" w:eastAsia="DejaVu Sans Mono"/>
+        </w:rPr>
+        <w:t>architecture.md#decision-states</w:t>
+      </w:r>
+      <w:r>
+        <w:t xml:space="preserve">. The file path keeps the link useful in GitHub and other Markdown tools. Zensical rewrites it for the published site. The destination has an explicit </w:t>
+      </w:r>
+      <w:r>
+        <w:rPr>
+          <w:rFonts w:ascii="DejaVu Sans Mono" w:hAnsi="DejaVu Sans Mono" w:eastAsia="DejaVu Sans Mono"/>
+        </w:rPr>
+        <w:t>decision-states</w:t>
+      </w:r>
+      <w:r>
+        <w:t xml:space="preserve"> anchor, so minor heading edits do not break the reference. The independent validator confirms that both the file and anchor exist before publication.</w:t>
+      </w:r>
+    </w:p>
+    <w:p>
+      <w:r>
+        <w:br w:type="page"/>
+      </w:r>
+    </w:p>
+    <w:p>
+      <w:pPr>
+        <w:pStyle w:val="Heading1"/>
+      </w:pPr>
+      <w:r>
+        <w:t>Architecture</w:t>
+      </w:r>
+    </w:p>
+    <w:p>
+      <w:r>
+        <w:t>Greenhouse Sentinel separates measurement, evaluation, presentation, and response guidance so each part can be tested and explained independently.</w:t>
+      </w:r>
+    </w:p>
+    <w:p>
+      <w:pPr>
+        <w:pStyle w:val="Heading2"/>
+      </w:pPr>
+      <w:r>
+        <w:t>System Boundary</w:t>
+      </w:r>
+    </w:p>
+    <w:p>
+      <w:r>
+        <w:t>The hub receives local sensor readings and produces a recommendation. It does not operate pumps, vents, heaters, locks, or other physical equipment. A person remains responsible for any physical action.</w:t>
+      </w:r>
+    </w:p>
+    <w:p>
+      <w:pPr>
+        <w:pStyle w:val="Code"/>
+      </w:pPr>
+      <w:r>
+        <w:t>Sensors -&gt; sample normalizer -&gt; rule engine -&gt; local event store -&gt; dashboard</w:t>
+      </w:r>
+    </w:p>
+    <w:p>
+      <w:pPr>
+        <w:pStyle w:val="Code"/>
+      </w:pPr>
+      <w:r>
+        <w:t xml:space="preserve">                                  |</w:t>
+      </w:r>
+    </w:p>
+    <w:p>
+      <w:pPr>
+        <w:pStyle w:val="Code"/>
+      </w:pPr>
+      <w:r>
+        <w:t xml:space="preserve">                                  +-&gt; response guidance</w:t>
+      </w:r>
+    </w:p>
+    <w:p>
+      <w:pPr>
+        <w:pStyle w:val="Heading2"/>
+      </w:pPr>
+      <w:r>
+        <w:t>Components</w:t>
+      </w:r>
+    </w:p>
+    <w:p>
+      <w:pPr>
+        <w:pStyle w:val="ListBullet"/>
+      </w:pPr>
+      <w:r>
+        <w:rPr>
+          <w:b/>
+        </w:rPr>
+        <w:t>Sample normalizer:</w:t>
+      </w:r>
+      <w:r>
+        <w:t xml:space="preserve"> converts each supported sensor value to a consistent unit and marks stale data.</w:t>
+      </w:r>
+    </w:p>
+    <w:p>
+      <w:pPr>
+        <w:pStyle w:val="ListBullet"/>
+      </w:pPr>
+      <w:r>
+        <w:rPr>
+          <w:b/>
+        </w:rPr>
+        <w:t>Rule engine:</w:t>
+      </w:r>
+      <w:r>
+        <w:t xml:space="preserve"> evaluates the most recent valid samples against versioned thresholds.</w:t>
+      </w:r>
+    </w:p>
+    <w:p>
+      <w:pPr>
+        <w:pStyle w:val="ListBullet"/>
+      </w:pPr>
+      <w:r>
+        <w:rPr>
+          <w:b/>
+        </w:rPr>
+        <w:t>Event store:</w:t>
+      </w:r>
+      <w:r>
+        <w:t xml:space="preserve"> retains 30 days of readings, state changes, and acknowledgements on the hub.</w:t>
+      </w:r>
+    </w:p>
+    <w:p>
+      <w:pPr>
+        <w:pStyle w:val="ListBullet"/>
+      </w:pPr>
+      <w:r>
+        <w:rPr>
+          <w:b/>
+        </w:rPr>
+        <w:t>Dashboard:</w:t>
+      </w:r>
+      <w:r>
+        <w:t xml:space="preserve"> presents current conditions, recent trends, and the reason for the current state.</w:t>
+      </w:r>
+    </w:p>
+    <w:p>
+      <w:pPr>
+        <w:pStyle w:val="Heading2"/>
+      </w:pPr>
+      <w:r>
+        <w:t>Decision States</w:t>
+      </w:r>
+    </w:p>
+    <w:p>
+      <w:r>
+        <w:t>The engine assigns one of three states after three consecutive samples meet the same condition.</w:t>
+      </w:r>
+    </w:p>
+    <w:tbl>
+      <w:tblPr>
+        <w:tblW w:type="auto" w:w="0"/>
+        <w:tblLayout w:type="fixed"/>
+        <w:tblLook w:firstColumn="1" w:firstRow="1" w:lastColumn="0" w:lastRow="0" w:noHBand="0" w:noVBand="1" w:val="04A0"/>
+      </w:tblPr>
+      <w:tblGrid>
+        <w:gridCol w:w="3216"/>
+        <w:gridCol w:w="3216"/>
+        <w:gridCol w:w="3216"/>
+      </w:tblGrid>
+      <w:tr>
+        <w:trPr>
+          <w:tblHeader w:val="true"/>
+        </w:trPr>
+        <w:tc>
+          <w:tcPr>
+            <w:tcW w:type="dxa" w:w="1440"/>
+            <w:shd w:fill="075E54"/>
+            <w:tcMar>
+              <w:top w:w="90" w:type="dxa"/>
+              <w:start w:w="120" w:type="dxa"/>
+              <w:bottom w:w="90" w:type="dxa"/>
+              <w:end w:w="120" w:type="dxa"/>
+            </w:tcMar>
+          </w:tcPr>
+          <w:p>
+            <w:pPr>
+              <w:spacing w:line="276" w:lineRule="auto" w:after="0"/>
             </w:pPr>
             <w:r>
               <w:rPr>
@@ -1419,12 +1823,18 @@
         </w:tc>
         <w:tc>
           <w:tcPr>
-            <w:tcW w:type="dxa" w:w="3120"/>
+            <w:tcW w:type="dxa" w:w="4032"/>
             <w:shd w:fill="075E54"/>
+            <w:tcMar>
+              <w:top w:w="90" w:type="dxa"/>
+              <w:start w:w="120" w:type="dxa"/>
+              <w:bottom w:w="90" w:type="dxa"/>
+              <w:end w:w="120" w:type="dxa"/>
+            </w:tcMar>
           </w:tcPr>
           <w:p>
             <w:pPr>
-              <w:spacing w:line="276" w:lineRule="auto" w:after="40"/>
+              <w:spacing w:line="276" w:lineRule="auto" w:after="0"/>
             </w:pPr>
             <w:r>
               <w:rPr>
@@ -1437,12 +1847,18 @@
         </w:tc>
         <w:tc>
           <w:tcPr>
-            <w:tcW w:type="dxa" w:w="3120"/>
+            <w:tcW w:type="dxa" w:w="3888"/>
             <w:shd w:fill="075E54"/>
+            <w:tcMar>
+              <w:top w:w="90" w:type="dxa"/>
+              <w:start w:w="120" w:type="dxa"/>
+              <w:bottom w:w="90" w:type="dxa"/>
+              <w:end w:w="120" w:type="dxa"/>
+            </w:tcMar>
           </w:tcPr>
           <w:p>
             <w:pPr>
-              <w:spacing w:line="276" w:lineRule="auto" w:after="40"/>
+              <w:spacing w:line="276" w:lineRule="auto" w:after="0"/>
             </w:pPr>
             <w:r>
               <w:rPr>
@@ -1457,12 +1873,19 @@
       <w:tr>
         <w:tc>
           <w:tcPr>
-            <w:tcW w:type="dxa" w:w="3120"/>
+            <w:tcW w:type="dxa" w:w="1440"/>
+            <w:tcMar>
+              <w:top w:w="90" w:type="dxa"/>
+              <w:start w:w="120" w:type="dxa"/>
+              <w:bottom w:w="90" w:type="dxa"/>
+              <w:end w:w="120" w:type="dxa"/>
+            </w:tcMar>
           </w:tcPr>
           <w:p>
             <w:pPr>
-              <w:spacing w:line="276" w:lineRule="auto" w:after="40"/>
+              <w:spacing w:line="276" w:lineRule="auto" w:after="0"/>
             </w:pPr>
+            <w:r/>
             <w:r>
               <w:t>Normal</w:t>
             </w:r>
@@ -1470,12 +1893,19 @@
         </w:tc>
         <w:tc>
           <w:tcPr>
-            <w:tcW w:type="dxa" w:w="3120"/>
+            <w:tcW w:type="dxa" w:w="4032"/>
+            <w:tcMar>
+              <w:top w:w="90" w:type="dxa"/>
+              <w:start w:w="120" w:type="dxa"/>
+              <w:bottom w:w="90" w:type="dxa"/>
+              <w:end w:w="120" w:type="dxa"/>
+            </w:tcMar>
           </w:tcPr>
           <w:p>
             <w:pPr>
-              <w:spacing w:line="276" w:lineRule="auto" w:after="40"/>
+              <w:spacing w:line="276" w:lineRule="auto" w:after="0"/>
             </w:pPr>
+            <w:r/>
             <w:r>
               <w:t>All readings are inside target ranges</w:t>
             </w:r>
@@ -1483,12 +1913,19 @@
         </w:tc>
         <w:tc>
           <w:tcPr>
-            <w:tcW w:type="dxa" w:w="3120"/>
+            <w:tcW w:type="dxa" w:w="3888"/>
+            <w:tcMar>
+              <w:top w:w="90" w:type="dxa"/>
+              <w:start w:w="120" w:type="dxa"/>
+              <w:bottom w:w="90" w:type="dxa"/>
+              <w:end w:w="120" w:type="dxa"/>
+            </w:tcMar>
           </w:tcPr>
           <w:p>
             <w:pPr>
-              <w:spacing w:line="276" w:lineRule="auto" w:after="40"/>
+              <w:spacing w:line="276" w:lineRule="auto" w:after="0"/>
             </w:pPr>
+            <w:r/>
             <w:r>
               <w:t>Continue scheduled checks</w:t>
             </w:r>
@@ -1498,12 +1935,19 @@
       <w:tr>
         <w:tc>
           <w:tcPr>
-            <w:tcW w:type="dxa" w:w="3120"/>
+            <w:tcW w:type="dxa" w:w="1440"/>
+            <w:tcMar>
+              <w:top w:w="90" w:type="dxa"/>
+              <w:start w:w="120" w:type="dxa"/>
+              <w:bottom w:w="90" w:type="dxa"/>
+              <w:end w:w="120" w:type="dxa"/>
+            </w:tcMar>
           </w:tcPr>
           <w:p>
             <w:pPr>
-              <w:spacing w:line="276" w:lineRule="auto" w:after="40"/>
+              <w:spacing w:line="276" w:lineRule="auto" w:after="0"/>
             </w:pPr>
+            <w:r/>
             <w:r>
               <w:t>Watch</w:t>
             </w:r>
@@ -1511,12 +1955,19 @@
         </w:tc>
         <w:tc>
           <w:tcPr>
-            <w:tcW w:type="dxa" w:w="3120"/>
+            <w:tcW w:type="dxa" w:w="4032"/>
+            <w:tcMar>
+              <w:top w:w="90" w:type="dxa"/>
+              <w:start w:w="120" w:type="dxa"/>
+              <w:bottom w:w="90" w:type="dxa"/>
+              <w:end w:w="120" w:type="dxa"/>
+            </w:tcMar>
           </w:tcPr>
           <w:p>
             <w:pPr>
-              <w:spacing w:line="276" w:lineRule="auto" w:after="40"/>
+              <w:spacing w:line="276" w:lineRule="auto" w:after="0"/>
             </w:pPr>
+            <w:r/>
             <w:r>
               <w:t>One reading is near a threshold</w:t>
             </w:r>
@@ -1524,12 +1975,19 @@
         </w:tc>
         <w:tc>
           <w:tcPr>
-            <w:tcW w:type="dxa" w:w="3120"/>
+            <w:tcW w:type="dxa" w:w="3888"/>
+            <w:tcMar>
+              <w:top w:w="90" w:type="dxa"/>
+              <w:start w:w="120" w:type="dxa"/>
+              <w:bottom w:w="90" w:type="dxa"/>
+              <w:end w:w="120" w:type="dxa"/>
+            </w:tcMar>
           </w:tcPr>
           <w:p>
             <w:pPr>
-              <w:spacing w:line="276" w:lineRule="auto" w:after="40"/>
+              <w:spacing w:line="276" w:lineRule="auto" w:after="0"/>
             </w:pPr>
+            <w:r/>
             <w:r>
               <w:t>Inspect within 30 minutes</w:t>
             </w:r>
@@ -1539,12 +1997,19 @@
       <w:tr>
         <w:tc>
           <w:tcPr>
-            <w:tcW w:type="dxa" w:w="3120"/>
+            <w:tcW w:type="dxa" w:w="1440"/>
+            <w:tcMar>
+              <w:top w:w="90" w:type="dxa"/>
+              <w:start w:w="120" w:type="dxa"/>
+              <w:bottom w:w="90" w:type="dxa"/>
+              <w:end w:w="120" w:type="dxa"/>
+            </w:tcMar>
           </w:tcPr>
           <w:p>
             <w:pPr>
-              <w:spacing w:line="276" w:lineRule="auto" w:after="40"/>
+              <w:spacing w:line="276" w:lineRule="auto" w:after="0"/>
             </w:pPr>
+            <w:r/>
             <w:r>
               <w:t>Act</w:t>
             </w:r>
@@ -1552,12 +2017,19 @@
         </w:tc>
         <w:tc>
           <w:tcPr>
-            <w:tcW w:type="dxa" w:w="3120"/>
+            <w:tcW w:type="dxa" w:w="4032"/>
+            <w:tcMar>
+              <w:top w:w="90" w:type="dxa"/>
+              <w:start w:w="120" w:type="dxa"/>
+              <w:bottom w:w="90" w:type="dxa"/>
+              <w:end w:w="120" w:type="dxa"/>
+            </w:tcMar>
           </w:tcPr>
           <w:p>
             <w:pPr>
-              <w:spacing w:line="276" w:lineRule="auto" w:after="40"/>
+              <w:spacing w:line="276" w:lineRule="auto" w:after="0"/>
             </w:pPr>
+            <w:r/>
             <w:r>
               <w:t>One reading exceeds a threshold</w:t>
             </w:r>
@@ -1565,12 +2037,19 @@
         </w:tc>
         <w:tc>
           <w:tcPr>
-            <w:tcW w:type="dxa" w:w="3120"/>
+            <w:tcW w:type="dxa" w:w="3888"/>
+            <w:tcMar>
+              <w:top w:w="90" w:type="dxa"/>
+              <w:start w:w="120" w:type="dxa"/>
+              <w:bottom w:w="90" w:type="dxa"/>
+              <w:end w:w="120" w:type="dxa"/>
+            </w:tcMar>
           </w:tcPr>
           <w:p>
             <w:pPr>
-              <w:spacing w:line="276" w:lineRule="auto" w:after="40"/>
+              <w:spacing w:line="276" w:lineRule="auto" w:after="0"/>
             </w:pPr>
+            <w:r/>
             <w:r>
               <w:t>Follow the displayed response</w:t>
             </w:r>
@@ -1579,6 +2058,21 @@
       </w:tr>
     </w:tbl>
     <w:p>
+      <w:pPr>
+        <w:pStyle w:val="Callout"/>
+        <w:shd w:fill="E8F2F0"/>
+        <w:pBdr>
+          <w:left w:val="single" w:sz="18" w:space="8" w:color="B45309"/>
+        </w:pBdr>
+        <w:spacing w:before="160"/>
+      </w:pPr>
+      <w:r>
+        <w:rPr>
+          <w:b/>
+          <w:color w:val="075E54"/>
+        </w:rPr>
+        <w:t xml:space="preserve">Feature in action: portable table. </w:t>
+      </w:r>
       <w:r>
         <w:t>This is a semantic Markdown table because the content has repeated, comparable fields. Zensical renders it responsively. The export script maps it to a real Word table with a header row. Ordinary explanatory prose remains outside tables for readability and accessibility.</w:t>
       </w:r>
@@ -1750,6 +2244,20 @@
       </w:r>
     </w:p>
     <w:p>
+      <w:pPr>
+        <w:pStyle w:val="Callout"/>
+        <w:shd w:fill="E8F2F0"/>
+        <w:pBdr>
+          <w:left w:val="single" w:sz="18" w:space="8" w:color="B45309"/>
+        </w:pBdr>
+      </w:pPr>
+      <w:r>
+        <w:rPr>
+          <w:b/>
+          <w:color w:val="075E54"/>
+        </w:rPr>
+        <w:t xml:space="preserve">Warning. </w:t>
+      </w:r>
       <w:r>
         <w:t>Troubleshooting the fictional dashboard never overrides physical greenhouse safety procedures.</w:t>
       </w:r>
@@ -1971,10 +2479,16 @@
           <w:tcPr>
             <w:tcW w:type="dxa" w:w="4680"/>
             <w:shd w:fill="075E54"/>
+            <w:tcMar>
+              <w:top w:w="90" w:type="dxa"/>
+              <w:start w:w="120" w:type="dxa"/>
+              <w:bottom w:w="90" w:type="dxa"/>
+              <w:end w:w="120" w:type="dxa"/>
+            </w:tcMar>
           </w:tcPr>
           <w:p>
             <w:pPr>
-              <w:spacing w:line="276" w:lineRule="auto" w:after="40"/>
+              <w:spacing w:line="276" w:lineRule="auto" w:after="0"/>
             </w:pPr>
             <w:r>
               <w:rPr>
@@ -1989,10 +2503,16 @@
           <w:tcPr>
             <w:tcW w:type="dxa" w:w="4680"/>
             <w:shd w:fill="075E54"/>
+            <w:tcMar>
+              <w:top w:w="90" w:type="dxa"/>
+              <w:start w:w="120" w:type="dxa"/>
+              <w:bottom w:w="90" w:type="dxa"/>
+              <w:end w:w="120" w:type="dxa"/>
+            </w:tcMar>
           </w:tcPr>
           <w:p>
             <w:pPr>
-              <w:spacing w:line="276" w:lineRule="auto" w:after="40"/>
+              <w:spacing w:line="276" w:lineRule="auto" w:after="0"/>
             </w:pPr>
             <w:r>
               <w:rPr>
@@ -2008,11 +2528,18 @@
         <w:tc>
           <w:tcPr>
             <w:tcW w:type="dxa" w:w="4680"/>
+            <w:tcMar>
+              <w:top w:w="90" w:type="dxa"/>
+              <w:start w:w="120" w:type="dxa"/>
+              <w:bottom w:w="90" w:type="dxa"/>
+              <w:end w:w="120" w:type="dxa"/>
+            </w:tcMar>
           </w:tcPr>
           <w:p>
             <w:pPr>
-              <w:spacing w:line="276" w:lineRule="auto" w:after="40"/>
+              <w:spacing w:line="276" w:lineRule="auto" w:after="0"/>
             </w:pPr>
+            <w:r/>
             <w:r>
               <w:t>Decide what readers need and what belongs in scope</w:t>
             </w:r>
@@ -2021,11 +2548,18 @@
         <w:tc>
           <w:tcPr>
             <w:tcW w:type="dxa" w:w="4680"/>
+            <w:tcMar>
+              <w:top w:w="90" w:type="dxa"/>
+              <w:start w:w="120" w:type="dxa"/>
+              <w:bottom w:w="90" w:type="dxa"/>
+              <w:end w:w="120" w:type="dxa"/>
+            </w:tcMar>
           </w:tcPr>
           <w:p>
             <w:pPr>
-              <w:spacing w:line="276" w:lineRule="auto" w:after="40"/>
+              <w:spacing w:line="276" w:lineRule="auto" w:after="0"/>
             </w:pPr>
+            <w:r/>
             <w:r>
               <w:t>Confirm every configured navigation file exists</w:t>
             </w:r>
@@ -2036,11 +2570,18 @@
         <w:tc>
           <w:tcPr>
             <w:tcW w:type="dxa" w:w="4680"/>
+            <w:tcMar>
+              <w:top w:w="90" w:type="dxa"/>
+              <w:start w:w="120" w:type="dxa"/>
+              <w:bottom w:w="90" w:type="dxa"/>
+              <w:end w:w="120" w:type="dxa"/>
+            </w:tcMar>
           </w:tcPr>
           <w:p>
             <w:pPr>
-              <w:spacing w:line="276" w:lineRule="auto" w:after="40"/>
+              <w:spacing w:line="276" w:lineRule="auto" w:after="0"/>
             </w:pPr>
+            <w:r/>
             <w:r>
               <w:t>Verify technical meaning and release accuracy</w:t>
             </w:r>
@@ -2049,11 +2590,18 @@
         <w:tc>
           <w:tcPr>
             <w:tcW w:type="dxa" w:w="4680"/>
+            <w:tcMar>
+              <w:top w:w="90" w:type="dxa"/>
+              <w:start w:w="120" w:type="dxa"/>
+              <w:bottom w:w="90" w:type="dxa"/>
+              <w:end w:w="120" w:type="dxa"/>
+            </w:tcMar>
           </w:tcPr>
           <w:p>
             <w:pPr>
-              <w:spacing w:line="276" w:lineRule="auto" w:after="40"/>
+              <w:spacing w:line="276" w:lineRule="auto" w:after="0"/>
             </w:pPr>
+            <w:r/>
             <w:r>
               <w:t>Detect missing pages, files, links, and anchors</w:t>
             </w:r>
@@ -2064,11 +2612,18 @@
         <w:tc>
           <w:tcPr>
             <w:tcW w:type="dxa" w:w="4680"/>
+            <w:tcMar>
+              <w:top w:w="90" w:type="dxa"/>
+              <w:start w:w="120" w:type="dxa"/>
+              <w:bottom w:w="90" w:type="dxa"/>
+              <w:end w:w="120" w:type="dxa"/>
+            </w:tcMar>
           </w:tcPr>
           <w:p>
             <w:pPr>
-              <w:spacing w:line="276" w:lineRule="auto" w:after="40"/>
+              <w:spacing w:line="276" w:lineRule="auto" w:after="0"/>
             </w:pPr>
+            <w:r/>
             <w:r>
               <w:t>Write procedures, explanations, warnings, and troubleshooting guidance</w:t>
             </w:r>
@@ -2077,11 +2632,18 @@
         <w:tc>
           <w:tcPr>
             <w:tcW w:type="dxa" w:w="4680"/>
+            <w:tcMar>
+              <w:top w:w="90" w:type="dxa"/>
+              <w:start w:w="120" w:type="dxa"/>
+              <w:bottom w:w="90" w:type="dxa"/>
+              <w:end w:w="120" w:type="dxa"/>
+            </w:tcMar>
           </w:tcPr>
           <w:p>
             <w:pPr>
-              <w:spacing w:line="276" w:lineRule="auto" w:after="40"/>
+              <w:spacing w:line="276" w:lineRule="auto" w:after="0"/>
             </w:pPr>
+            <w:r/>
             <w:r>
               <w:t>Enforce basic heading, image-text, and link-label rules</w:t>
             </w:r>
@@ -2092,11 +2654,18 @@
         <w:tc>
           <w:tcPr>
             <w:tcW w:type="dxa" w:w="4680"/>
+            <w:tcMar>
+              <w:top w:w="90" w:type="dxa"/>
+              <w:start w:w="120" w:type="dxa"/>
+              <w:bottom w:w="90" w:type="dxa"/>
+              <w:end w:w="120" w:type="dxa"/>
+            </w:tcMar>
           </w:tcPr>
           <w:p>
             <w:pPr>
-              <w:spacing w:line="276" w:lineRule="auto" w:after="40"/>
+              <w:spacing w:line="276" w:lineRule="auto" w:after="0"/>
             </w:pPr>
+            <w:r/>
             <w:r>
               <w:t>Decide whether a table, note, example, or cross-reference helps</w:t>
             </w:r>
@@ -2105,11 +2674,18 @@
         <w:tc>
           <w:tcPr>
             <w:tcW w:type="dxa" w:w="4680"/>
+            <w:tcMar>
+              <w:top w:w="90" w:type="dxa"/>
+              <w:start w:w="120" w:type="dxa"/>
+              <w:bottom w:w="90" w:type="dxa"/>
+              <w:end w:w="120" w:type="dxa"/>
+            </w:tcMar>
           </w:tcPr>
           <w:p>
             <w:pPr>
-              <w:spacing w:line="276" w:lineRule="auto" w:after="40"/>
+              <w:spacing w:line="276" w:lineRule="auto" w:after="0"/>
             </w:pPr>
+            <w:r/>
             <w:r>
               <w:t>Build the Zensical HTML site from Markdown</w:t>
             </w:r>
@@ -2120,11 +2696,18 @@
         <w:tc>
           <w:tcPr>
             <w:tcW w:type="dxa" w:w="4680"/>
+            <w:tcMar>
+              <w:top w:w="90" w:type="dxa"/>
+              <w:start w:w="120" w:type="dxa"/>
+              <w:bottom w:w="90" w:type="dxa"/>
+              <w:end w:w="120" w:type="dxa"/>
+            </w:tcMar>
           </w:tcPr>
           <w:p>
             <w:pPr>
-              <w:spacing w:line="276" w:lineRule="auto" w:after="40"/>
+              <w:spacing w:line="276" w:lineRule="auto" w:after="0"/>
             </w:pPr>
+            <w:r/>
             <w:r>
               <w:t>Review accessibility, usability, and visual quality</w:t>
             </w:r>
@@ -2133,11 +2716,18 @@
         <w:tc>
           <w:tcPr>
             <w:tcW w:type="dxa" w:w="4680"/>
+            <w:tcMar>
+              <w:top w:w="90" w:type="dxa"/>
+              <w:start w:w="120" w:type="dxa"/>
+              <w:bottom w:w="90" w:type="dxa"/>
+              <w:end w:w="120" w:type="dxa"/>
+            </w:tcMar>
           </w:tcPr>
           <w:p>
             <w:pPr>
-              <w:spacing w:line="276" w:lineRule="auto" w:after="40"/>
+              <w:spacing w:line="276" w:lineRule="auto" w:after="0"/>
             </w:pPr>
+            <w:r/>
             <w:r>
               <w:t>Generate the Word handbook and convert it to PDF</w:t>
             </w:r>
@@ -2148,11 +2738,18 @@
         <w:tc>
           <w:tcPr>
             <w:tcW w:type="dxa" w:w="4680"/>
+            <w:tcMar>
+              <w:top w:w="90" w:type="dxa"/>
+              <w:start w:w="120" w:type="dxa"/>
+              <w:bottom w:w="90" w:type="dxa"/>
+              <w:end w:w="120" w:type="dxa"/>
+            </w:tcMar>
           </w:tcPr>
           <w:p>
             <w:pPr>
-              <w:spacing w:line="276" w:lineRule="auto" w:after="40"/>
+              <w:spacing w:line="276" w:lineRule="auto" w:after="0"/>
             </w:pPr>
+            <w:r/>
             <w:r>
               <w:t>Approve the change</w:t>
             </w:r>
@@ -2161,11 +2758,18 @@
         <w:tc>
           <w:tcPr>
             <w:tcW w:type="dxa" w:w="4680"/>
+            <w:tcMar>
+              <w:top w:w="90" w:type="dxa"/>
+              <w:start w:w="120" w:type="dxa"/>
+              <w:bottom w:w="90" w:type="dxa"/>
+              <w:end w:w="120" w:type="dxa"/>
+            </w:tcMar>
           </w:tcPr>
           <w:p>
             <w:pPr>
-              <w:spacing w:line="276" w:lineRule="auto" w:after="40"/>
+              <w:spacing w:line="276" w:lineRule="auto" w:after="0"/>
             </w:pPr>
+            <w:r/>
             <w:r>
               <w:t>Check that expected artifacts exist and deploy the site</w:t>
             </w:r>
@@ -2174,6 +2778,9 @@
       </w:tr>
     </w:tbl>
     <w:p>
+      <w:pPr>
+        <w:spacing w:before="160"/>
+      </w:pPr>
       <w:r>
         <w:t>Automation handles repeatable questions with objective answers. Authors and reviewers remain responsible for accuracy, usefulness, safety, and clarity.</w:t>
       </w:r>
@@ -2291,12 +2898,18 @@
         </w:trPr>
         <w:tc>
           <w:tcPr>
-            <w:tcW w:type="dxa" w:w="3120"/>
+            <w:tcW w:type="dxa" w:w="2088"/>
             <w:shd w:fill="075E54"/>
+            <w:tcMar>
+              <w:top w:w="90" w:type="dxa"/>
+              <w:start w:w="120" w:type="dxa"/>
+              <w:bottom w:w="90" w:type="dxa"/>
+              <w:end w:w="120" w:type="dxa"/>
+            </w:tcMar>
           </w:tcPr>
           <w:p>
             <w:pPr>
-              <w:spacing w:line="276" w:lineRule="auto" w:after="40"/>
+              <w:spacing w:line="276" w:lineRule="auto" w:after="0"/>
             </w:pPr>
             <w:r>
               <w:rPr>
@@ -2309,37 +2922,49 @@
         </w:tc>
         <w:tc>
           <w:tcPr>
-            <w:tcW w:type="dxa" w:w="3120"/>
+            <w:tcW w:type="dxa" w:w="3672"/>
             <w:shd w:fill="075E54"/>
+            <w:tcMar>
+              <w:top w:w="90" w:type="dxa"/>
+              <w:start w:w="120" w:type="dxa"/>
+              <w:bottom w:w="90" w:type="dxa"/>
+              <w:end w:w="120" w:type="dxa"/>
+            </w:tcMar>
           </w:tcPr>
           <w:p>
             <w:pPr>
-              <w:spacing w:line="276" w:lineRule="auto" w:after="40"/>
+              <w:spacing w:line="276" w:lineRule="auto" w:after="0"/>
             </w:pPr>
             <w:r>
               <w:rPr>
                 <w:b/>
                 <w:color w:val="FFFFFF"/>
               </w:rPr>
-              <w:t>Made with</w:t>
+              <w:t>Made With</w:t>
             </w:r>
           </w:p>
         </w:tc>
         <w:tc>
           <w:tcPr>
-            <w:tcW w:type="dxa" w:w="3120"/>
+            <w:tcW w:type="dxa" w:w="3600"/>
             <w:shd w:fill="075E54"/>
+            <w:tcMar>
+              <w:top w:w="90" w:type="dxa"/>
+              <w:start w:w="120" w:type="dxa"/>
+              <w:bottom w:w="90" w:type="dxa"/>
+              <w:end w:w="120" w:type="dxa"/>
+            </w:tcMar>
           </w:tcPr>
           <w:p>
             <w:pPr>
-              <w:spacing w:line="276" w:lineRule="auto" w:after="40"/>
+              <w:spacing w:line="276" w:lineRule="auto" w:after="0"/>
             </w:pPr>
             <w:r>
               <w:rPr>
                 <w:b/>
                 <w:color w:val="FFFFFF"/>
               </w:rPr>
-              <w:t>Why it helps</w:t>
+              <w:t>Why It Helps</w:t>
             </w:r>
           </w:p>
         </w:tc>
@@ -2347,12 +2972,19 @@
       <w:tr>
         <w:tc>
           <w:tcPr>
-            <w:tcW w:type="dxa" w:w="3120"/>
+            <w:tcW w:type="dxa" w:w="2088"/>
+            <w:tcMar>
+              <w:top w:w="90" w:type="dxa"/>
+              <w:start w:w="120" w:type="dxa"/>
+              <w:bottom w:w="90" w:type="dxa"/>
+              <w:end w:w="120" w:type="dxa"/>
+            </w:tcMar>
           </w:tcPr>
           <w:p>
             <w:pPr>
-              <w:spacing w:line="276" w:lineRule="auto" w:after="40"/>
+              <w:spacing w:line="276" w:lineRule="auto" w:after="0"/>
             </w:pPr>
+            <w:r/>
             <w:r>
               <w:t>Cross-Reference</w:t>
             </w:r>
@@ -2360,25 +2992,48 @@
         </w:tc>
         <w:tc>
           <w:tcPr>
-            <w:tcW w:type="dxa" w:w="3120"/>
+            <w:tcW w:type="dxa" w:w="3672"/>
+            <w:tcMar>
+              <w:top w:w="90" w:type="dxa"/>
+              <w:start w:w="120" w:type="dxa"/>
+              <w:bottom w:w="90" w:type="dxa"/>
+              <w:end w:w="120" w:type="dxa"/>
+            </w:tcMar>
           </w:tcPr>
           <w:p>
             <w:pPr>
-              <w:spacing w:line="276" w:lineRule="auto" w:after="40"/>
+              <w:spacing w:line="276" w:lineRule="auto" w:after="0"/>
             </w:pPr>
+            <w:r/>
             <w:r>
-              <w:t>A deliberate `decision-states` anchor plus validation of the source file and fragment</w:t>
+              <w:t xml:space="preserve">A deliberate </w:t>
+            </w:r>
+            <w:r>
+              <w:rPr>
+                <w:rFonts w:ascii="DejaVu Sans Mono" w:hAnsi="DejaVu Sans Mono" w:eastAsia="DejaVu Sans Mono"/>
+              </w:rPr>
+              <w:t>decision-states</w:t>
+            </w:r>
+            <w:r>
+              <w:t xml:space="preserve"> anchor plus validation of the source file and fragment</w:t>
             </w:r>
           </w:p>
         </w:tc>
         <w:tc>
           <w:tcPr>
-            <w:tcW w:type="dxa" w:w="3120"/>
+            <w:tcW w:type="dxa" w:w="3600"/>
+            <w:tcMar>
+              <w:top w:w="90" w:type="dxa"/>
+              <w:start w:w="120" w:type="dxa"/>
+              <w:bottom w:w="90" w:type="dxa"/>
+              <w:end w:w="120" w:type="dxa"/>
+            </w:tcMar>
           </w:tcPr>
           <w:p>
             <w:pPr>
-              <w:spacing w:line="276" w:lineRule="auto" w:after="40"/>
+              <w:spacing w:line="276" w:lineRule="auto" w:after="0"/>
             </w:pPr>
+            <w:r/>
             <w:r>
               <w:t>Important links survive nearby heading edits, and broken targets stop the release</w:t>
             </w:r>
@@ -2388,12 +3043,19 @@
       <w:tr>
         <w:tc>
           <w:tcPr>
-            <w:tcW w:type="dxa" w:w="3120"/>
+            <w:tcW w:type="dxa" w:w="2088"/>
+            <w:tcMar>
+              <w:top w:w="90" w:type="dxa"/>
+              <w:start w:w="120" w:type="dxa"/>
+              <w:bottom w:w="90" w:type="dxa"/>
+              <w:end w:w="120" w:type="dxa"/>
+            </w:tcMar>
           </w:tcPr>
           <w:p>
             <w:pPr>
-              <w:spacing w:line="276" w:lineRule="auto" w:after="40"/>
+              <w:spacing w:line="276" w:lineRule="auto" w:after="0"/>
             </w:pPr>
+            <w:r/>
             <w:r>
               <w:t>Descriptive Link</w:t>
             </w:r>
@@ -2401,12 +3063,19 @@
         </w:tc>
         <w:tc>
           <w:tcPr>
-            <w:tcW w:type="dxa" w:w="3120"/>
+            <w:tcW w:type="dxa" w:w="3672"/>
+            <w:tcMar>
+              <w:top w:w="90" w:type="dxa"/>
+              <w:start w:w="120" w:type="dxa"/>
+              <w:bottom w:w="90" w:type="dxa"/>
+              <w:end w:w="120" w:type="dxa"/>
+            </w:tcMar>
           </w:tcPr>
           <w:p>
             <w:pPr>
-              <w:spacing w:line="276" w:lineRule="auto" w:after="40"/>
+              <w:spacing w:line="276" w:lineRule="auto" w:after="0"/>
             </w:pPr>
+            <w:r/>
             <w:r>
               <w:t>Task-specific link text plus a validator that rejects common context-free labels</w:t>
             </w:r>
@@ -2414,12 +3083,19 @@
         </w:tc>
         <w:tc>
           <w:tcPr>
-            <w:tcW w:type="dxa" w:w="3120"/>
+            <w:tcW w:type="dxa" w:w="3600"/>
+            <w:tcMar>
+              <w:top w:w="90" w:type="dxa"/>
+              <w:start w:w="120" w:type="dxa"/>
+              <w:bottom w:w="90" w:type="dxa"/>
+              <w:end w:w="120" w:type="dxa"/>
+            </w:tcMar>
           </w:tcPr>
           <w:p>
             <w:pPr>
-              <w:spacing w:line="276" w:lineRule="auto" w:after="40"/>
+              <w:spacing w:line="276" w:lineRule="auto" w:after="0"/>
             </w:pPr>
+            <w:r/>
             <w:r>
               <w:t>Readers and screen-reader users can understand the destination out of context</w:t>
             </w:r>
@@ -2429,12 +3105,19 @@
       <w:tr>
         <w:tc>
           <w:tcPr>
-            <w:tcW w:type="dxa" w:w="3120"/>
+            <w:tcW w:type="dxa" w:w="2088"/>
+            <w:tcMar>
+              <w:top w:w="90" w:type="dxa"/>
+              <w:start w:w="120" w:type="dxa"/>
+              <w:bottom w:w="90" w:type="dxa"/>
+              <w:end w:w="120" w:type="dxa"/>
+            </w:tcMar>
           </w:tcPr>
           <w:p>
             <w:pPr>
-              <w:spacing w:line="276" w:lineRule="auto" w:after="40"/>
+              <w:spacing w:line="276" w:lineRule="auto" w:after="0"/>
             </w:pPr>
+            <w:r/>
             <w:r>
               <w:t>Semantic Table</w:t>
             </w:r>
@@ -2442,12 +3125,19 @@
         </w:tc>
         <w:tc>
           <w:tcPr>
-            <w:tcW w:type="dxa" w:w="3120"/>
+            <w:tcW w:type="dxa" w:w="3672"/>
+            <w:tcMar>
+              <w:top w:w="90" w:type="dxa"/>
+              <w:start w:w="120" w:type="dxa"/>
+              <w:bottom w:w="90" w:type="dxa"/>
+              <w:end w:w="120" w:type="dxa"/>
+            </w:tcMar>
           </w:tcPr>
           <w:p>
             <w:pPr>
-              <w:spacing w:line="276" w:lineRule="auto" w:after="40"/>
+              <w:spacing w:line="276" w:lineRule="auto" w:after="0"/>
             </w:pPr>
+            <w:r/>
             <w:r>
               <w:t>Markdown table syntax, accessible HTML, and real Word tables with repeating header rows</w:t>
             </w:r>
@@ -2455,12 +3145,19 @@
         </w:tc>
         <w:tc>
           <w:tcPr>
-            <w:tcW w:type="dxa" w:w="3120"/>
+            <w:tcW w:type="dxa" w:w="3600"/>
+            <w:tcMar>
+              <w:top w:w="90" w:type="dxa"/>
+              <w:start w:w="120" w:type="dxa"/>
+              <w:bottom w:w="90" w:type="dxa"/>
+              <w:end w:w="120" w:type="dxa"/>
+            </w:tcMar>
           </w:tcPr>
           <w:p>
             <w:pPr>
-              <w:spacing w:line="276" w:lineRule="auto" w:after="40"/>
+              <w:spacing w:line="276" w:lineRule="auto" w:after="0"/>
             </w:pPr>
+            <w:r/>
             <w:r>
               <w:t>Relationships remain clear in HTML, Word, and PDF without separate copies</w:t>
             </w:r>
@@ -2470,12 +3167,19 @@
       <w:tr>
         <w:tc>
           <w:tcPr>
-            <w:tcW w:type="dxa" w:w="3120"/>
+            <w:tcW w:type="dxa" w:w="2088"/>
+            <w:tcMar>
+              <w:top w:w="90" w:type="dxa"/>
+              <w:start w:w="120" w:type="dxa"/>
+              <w:bottom w:w="90" w:type="dxa"/>
+              <w:end w:w="120" w:type="dxa"/>
+            </w:tcMar>
           </w:tcPr>
           <w:p>
             <w:pPr>
-              <w:spacing w:line="276" w:lineRule="auto" w:after="40"/>
+              <w:spacing w:line="276" w:lineRule="auto" w:after="0"/>
             </w:pPr>
+            <w:r/>
             <w:r>
               <w:t>Admonition</w:t>
             </w:r>
@@ -2483,25 +3187,48 @@
         </w:tc>
         <w:tc>
           <w:tcPr>
-            <w:tcW w:type="dxa" w:w="3120"/>
+            <w:tcW w:type="dxa" w:w="3672"/>
+            <w:tcMar>
+              <w:top w:w="90" w:type="dxa"/>
+              <w:start w:w="120" w:type="dxa"/>
+              <w:bottom w:w="90" w:type="dxa"/>
+              <w:end w:w="120" w:type="dxa"/>
+            </w:tcMar>
           </w:tcPr>
           <w:p>
             <w:pPr>
-              <w:spacing w:line="276" w:lineRule="auto" w:after="40"/>
+              <w:spacing w:line="276" w:lineRule="auto" w:after="0"/>
             </w:pPr>
+            <w:r/>
             <w:r>
-              <w:t>A labeled `!!! info` block plus styling in the publishing layer</w:t>
+              <w:t xml:space="preserve">A labeled </w:t>
+            </w:r>
+            <w:r>
+              <w:rPr>
+                <w:rFonts w:ascii="DejaVu Sans Mono" w:hAnsi="DejaVu Sans Mono" w:eastAsia="DejaVu Sans Mono"/>
+              </w:rPr>
+              <w:t>!!! info</w:t>
+            </w:r>
+            <w:r>
+              <w:t xml:space="preserve"> block plus styling in the publishing layer</w:t>
             </w:r>
           </w:p>
         </w:tc>
         <w:tc>
           <w:tcPr>
-            <w:tcW w:type="dxa" w:w="3120"/>
+            <w:tcW w:type="dxa" w:w="3600"/>
+            <w:tcMar>
+              <w:top w:w="90" w:type="dxa"/>
+              <w:start w:w="120" w:type="dxa"/>
+              <w:bottom w:w="90" w:type="dxa"/>
+              <w:end w:w="120" w:type="dxa"/>
+            </w:tcMar>
           </w:tcPr>
           <w:p>
             <w:pPr>
-              <w:spacing w:line="276" w:lineRule="auto" w:after="40"/>
+              <w:spacing w:line="276" w:lineRule="auto" w:after="0"/>
             </w:pPr>
+            <w:r/>
             <w:r>
               <w:t>Important context stands out while the source stays readable and reviewable</w:t>
             </w:r>
@@ -2511,12 +3238,19 @@
       <w:tr>
         <w:tc>
           <w:tcPr>
-            <w:tcW w:type="dxa" w:w="3120"/>
+            <w:tcW w:type="dxa" w:w="2088"/>
+            <w:tcMar>
+              <w:top w:w="90" w:type="dxa"/>
+              <w:start w:w="120" w:type="dxa"/>
+              <w:bottom w:w="90" w:type="dxa"/>
+              <w:end w:w="120" w:type="dxa"/>
+            </w:tcMar>
           </w:tcPr>
           <w:p>
             <w:pPr>
-              <w:spacing w:line="276" w:lineRule="auto" w:after="40"/>
+              <w:spacing w:line="276" w:lineRule="auto" w:after="0"/>
             </w:pPr>
+            <w:r/>
             <w:r>
               <w:t>Code Block</w:t>
             </w:r>
@@ -2524,12 +3258,19 @@
         </w:tc>
         <w:tc>
           <w:tcPr>
-            <w:tcW w:type="dxa" w:w="3120"/>
+            <w:tcW w:type="dxa" w:w="3672"/>
+            <w:tcMar>
+              <w:top w:w="90" w:type="dxa"/>
+              <w:start w:w="120" w:type="dxa"/>
+              <w:bottom w:w="90" w:type="dxa"/>
+              <w:end w:w="120" w:type="dxa"/>
+            </w:tcMar>
           </w:tcPr>
           <w:p>
             <w:pPr>
-              <w:spacing w:line="276" w:lineRule="auto" w:after="40"/>
+              <w:spacing w:line="276" w:lineRule="auto" w:after="0"/>
             </w:pPr>
+            <w:r/>
             <w:r>
               <w:t>Fenced Markdown, site copy support, and an explicit monospaced export style</w:t>
             </w:r>
@@ -2537,12 +3278,19 @@
         </w:tc>
         <w:tc>
           <w:tcPr>
-            <w:tcW w:type="dxa" w:w="3120"/>
+            <w:tcW w:type="dxa" w:w="3600"/>
+            <w:tcMar>
+              <w:top w:w="90" w:type="dxa"/>
+              <w:start w:w="120" w:type="dxa"/>
+              <w:bottom w:w="90" w:type="dxa"/>
+              <w:end w:w="120" w:type="dxa"/>
+            </w:tcMar>
           </w:tcPr>
           <w:p>
             <w:pPr>
-              <w:spacing w:line="276" w:lineRule="auto" w:after="40"/>
+              <w:spacing w:line="276" w:lineRule="auto" w:after="0"/>
             </w:pPr>
+            <w:r/>
             <w:r>
               <w:t>Commands retain spacing and can be copied with fewer transcription errors</w:t>
             </w:r>
@@ -2552,12 +3300,19 @@
       <w:tr>
         <w:tc>
           <w:tcPr>
-            <w:tcW w:type="dxa" w:w="3120"/>
+            <w:tcW w:type="dxa" w:w="2088"/>
+            <w:tcMar>
+              <w:top w:w="90" w:type="dxa"/>
+              <w:start w:w="120" w:type="dxa"/>
+              <w:bottom w:w="90" w:type="dxa"/>
+              <w:end w:w="120" w:type="dxa"/>
+            </w:tcMar>
           </w:tcPr>
           <w:p>
             <w:pPr>
-              <w:spacing w:line="276" w:lineRule="auto" w:after="40"/>
+              <w:spacing w:line="276" w:lineRule="auto" w:after="0"/>
             </w:pPr>
+            <w:r/>
             <w:r>
               <w:t>Explicit Navigation</w:t>
             </w:r>
@@ -2565,25 +3320,57 @@
         </w:tc>
         <w:tc>
           <w:tcPr>
-            <w:tcW w:type="dxa" w:w="3120"/>
+            <w:tcW w:type="dxa" w:w="3672"/>
+            <w:tcMar>
+              <w:top w:w="90" w:type="dxa"/>
+              <w:start w:w="120" w:type="dxa"/>
+              <w:bottom w:w="90" w:type="dxa"/>
+              <w:end w:w="120" w:type="dxa"/>
+            </w:tcMar>
           </w:tcPr>
           <w:p>
             <w:pPr>
-              <w:spacing w:line="276" w:lineRule="auto" w:after="40"/>
+              <w:spacing w:line="276" w:lineRule="auto" w:after="0"/>
             </w:pPr>
+            <w:r/>
             <w:r>
-              <w:t>The ordered `nav` list in `zensical.toml` plus checks for missing and unlisted pages</w:t>
+              <w:t xml:space="preserve">The ordered </w:t>
+            </w:r>
+            <w:r>
+              <w:rPr>
+                <w:rFonts w:ascii="DejaVu Sans Mono" w:hAnsi="DejaVu Sans Mono" w:eastAsia="DejaVu Sans Mono"/>
+              </w:rPr>
+              <w:t>nav</w:t>
+            </w:r>
+            <w:r>
+              <w:t xml:space="preserve"> list in </w:t>
+            </w:r>
+            <w:r>
+              <w:rPr>
+                <w:rFonts w:ascii="DejaVu Sans Mono" w:hAnsi="DejaVu Sans Mono" w:eastAsia="DejaVu Sans Mono"/>
+              </w:rPr>
+              <w:t>zensical.toml</w:t>
+            </w:r>
+            <w:r>
+              <w:t xml:space="preserve"> plus checks for missing and unlisted pages</w:t>
             </w:r>
           </w:p>
         </w:tc>
         <w:tc>
           <w:tcPr>
-            <w:tcW w:type="dxa" w:w="3120"/>
+            <w:tcW w:type="dxa" w:w="3600"/>
+            <w:tcMar>
+              <w:top w:w="90" w:type="dxa"/>
+              <w:start w:w="120" w:type="dxa"/>
+              <w:bottom w:w="90" w:type="dxa"/>
+              <w:end w:w="120" w:type="dxa"/>
+            </w:tcMar>
           </w:tcPr>
           <w:p>
             <w:pPr>
-              <w:spacing w:line="276" w:lineRule="auto" w:after="40"/>
+              <w:spacing w:line="276" w:lineRule="auto" w:after="0"/>
             </w:pPr>
+            <w:r/>
             <w:r>
               <w:t>Page order is intentional, reviewable, and traceable instead of inferred from filenames</w:t>
             </w:r>
@@ -2593,12 +3380,19 @@
       <w:tr>
         <w:tc>
           <w:tcPr>
-            <w:tcW w:type="dxa" w:w="3120"/>
+            <w:tcW w:type="dxa" w:w="2088"/>
+            <w:tcMar>
+              <w:top w:w="90" w:type="dxa"/>
+              <w:start w:w="120" w:type="dxa"/>
+              <w:bottom w:w="90" w:type="dxa"/>
+              <w:end w:w="120" w:type="dxa"/>
+            </w:tcMar>
           </w:tcPr>
           <w:p>
             <w:pPr>
-              <w:spacing w:line="276" w:lineRule="auto" w:after="40"/>
+              <w:spacing w:line="276" w:lineRule="auto" w:after="0"/>
             </w:pPr>
+            <w:r/>
             <w:r>
               <w:t>Brand Tokens</w:t>
             </w:r>
@@ -2606,12 +3400,19 @@
         </w:tc>
         <w:tc>
           <w:tcPr>
-            <w:tcW w:type="dxa" w:w="3120"/>
+            <w:tcW w:type="dxa" w:w="3672"/>
+            <w:tcMar>
+              <w:top w:w="90" w:type="dxa"/>
+              <w:start w:w="120" w:type="dxa"/>
+              <w:bottom w:w="90" w:type="dxa"/>
+              <w:end w:w="120" w:type="dxa"/>
+            </w:tcMar>
           </w:tcPr>
           <w:p>
             <w:pPr>
-              <w:spacing w:line="276" w:lineRule="auto" w:after="40"/>
+              <w:spacing w:line="276" w:lineRule="auto" w:after="0"/>
             </w:pPr>
+            <w:r/>
             <w:r>
               <w:t>Purpose-based CSS variables and a separate logo asset outside the Markdown</w:t>
             </w:r>
@@ -2619,12 +3420,19 @@
         </w:tc>
         <w:tc>
           <w:tcPr>
-            <w:tcW w:type="dxa" w:w="3120"/>
+            <w:tcW w:type="dxa" w:w="3600"/>
+            <w:tcMar>
+              <w:top w:w="90" w:type="dxa"/>
+              <w:start w:w="120" w:type="dxa"/>
+              <w:bottom w:w="90" w:type="dxa"/>
+              <w:end w:w="120" w:type="dxa"/>
+            </w:tcMar>
           </w:tcPr>
           <w:p>
             <w:pPr>
-              <w:spacing w:line="276" w:lineRule="auto" w:after="40"/>
+              <w:spacing w:line="276" w:lineRule="auto" w:after="0"/>
             </w:pPr>
+            <w:r/>
             <w:r>
               <w:t>Teams can rebrand consistently without changing technical meaning</w:t>
             </w:r>
@@ -2634,12 +3442,19 @@
       <w:tr>
         <w:tc>
           <w:tcPr>
-            <w:tcW w:type="dxa" w:w="3120"/>
+            <w:tcW w:type="dxa" w:w="2088"/>
+            <w:tcMar>
+              <w:top w:w="90" w:type="dxa"/>
+              <w:start w:w="120" w:type="dxa"/>
+              <w:bottom w:w="90" w:type="dxa"/>
+              <w:end w:w="120" w:type="dxa"/>
+            </w:tcMar>
           </w:tcPr>
           <w:p>
             <w:pPr>
-              <w:spacing w:line="276" w:lineRule="auto" w:after="40"/>
+              <w:spacing w:line="276" w:lineRule="auto" w:after="0"/>
             </w:pPr>
+            <w:r/>
             <w:r>
               <w:t>Automated Validation</w:t>
             </w:r>
@@ -2647,12 +3462,19 @@
         </w:tc>
         <w:tc>
           <w:tcPr>
-            <w:tcW w:type="dxa" w:w="3120"/>
+            <w:tcW w:type="dxa" w:w="3672"/>
+            <w:tcMar>
+              <w:top w:w="90" w:type="dxa"/>
+              <w:start w:w="120" w:type="dxa"/>
+              <w:bottom w:w="90" w:type="dxa"/>
+              <w:end w:w="120" w:type="dxa"/>
+            </w:tcMar>
           </w:tcPr>
           <w:p>
             <w:pPr>
-              <w:spacing w:line="276" w:lineRule="auto" w:after="40"/>
+              <w:spacing w:line="276" w:lineRule="auto" w:after="0"/>
             </w:pPr>
+            <w:r/>
             <w:r>
               <w:t>A renderer-independent Python script that checks navigation, structure, images, files, links, and anchors</w:t>
             </w:r>
@@ -2660,12 +3482,19 @@
         </w:tc>
         <w:tc>
           <w:tcPr>
-            <w:tcW w:type="dxa" w:w="3120"/>
+            <w:tcW w:type="dxa" w:w="3600"/>
+            <w:tcMar>
+              <w:top w:w="90" w:type="dxa"/>
+              <w:start w:w="120" w:type="dxa"/>
+              <w:bottom w:w="90" w:type="dxa"/>
+              <w:end w:w="120" w:type="dxa"/>
+            </w:tcMar>
           </w:tcPr>
           <w:p>
             <w:pPr>
-              <w:spacing w:line="276" w:lineRule="auto" w:after="40"/>
+              <w:spacing w:line="276" w:lineRule="auto" w:after="0"/>
             </w:pPr>
+            <w:r/>
             <w:r>
               <w:t>Fast, repeatable checks free reviewers for judgment-heavy work and leave pass-or-fail evidence</w:t>
             </w:r>
@@ -2675,12 +3504,19 @@
       <w:tr>
         <w:tc>
           <w:tcPr>
-            <w:tcW w:type="dxa" w:w="3120"/>
+            <w:tcW w:type="dxa" w:w="2088"/>
+            <w:tcMar>
+              <w:top w:w="90" w:type="dxa"/>
+              <w:start w:w="120" w:type="dxa"/>
+              <w:bottom w:w="90" w:type="dxa"/>
+              <w:end w:w="120" w:type="dxa"/>
+            </w:tcMar>
           </w:tcPr>
           <w:p>
             <w:pPr>
-              <w:spacing w:line="276" w:lineRule="auto" w:after="40"/>
+              <w:spacing w:line="276" w:lineRule="auto" w:after="0"/>
             </w:pPr>
+            <w:r/>
             <w:r>
               <w:t>Continuous Integration</w:t>
             </w:r>
@@ -2688,25 +3524,45 @@
         </w:tc>
         <w:tc>
           <w:tcPr>
-            <w:tcW w:type="dxa" w:w="3120"/>
+            <w:tcW w:type="dxa" w:w="3672"/>
+            <w:tcMar>
+              <w:top w:w="90" w:type="dxa"/>
+              <w:start w:w="120" w:type="dxa"/>
+              <w:bottom w:w="90" w:type="dxa"/>
+              <w:end w:w="120" w:type="dxa"/>
+            </w:tcMar>
           </w:tcPr>
           <w:p>
             <w:pPr>
-              <w:spacing w:line="276" w:lineRule="auto" w:after="40"/>
+              <w:spacing w:line="276" w:lineRule="auto" w:after="0"/>
             </w:pPr>
+            <w:r/>
             <w:r>
-              <w:t>`.github/workflows/docs.yml`, which repeats validation and publishing for proposed and accepted changes</w:t>
+              <w:rPr>
+                <w:rFonts w:ascii="DejaVu Sans Mono" w:hAnsi="DejaVu Sans Mono" w:eastAsia="DejaVu Sans Mono"/>
+              </w:rPr>
+              <w:t>.github/workflows/docs.yml</w:t>
+            </w:r>
+            <w:r>
+              <w:t>, which repeats validation and publishing for proposed and accepted changes</w:t>
             </w:r>
           </w:p>
         </w:tc>
         <w:tc>
           <w:tcPr>
-            <w:tcW w:type="dxa" w:w="3120"/>
+            <w:tcW w:type="dxa" w:w="3600"/>
+            <w:tcMar>
+              <w:top w:w="90" w:type="dxa"/>
+              <w:start w:w="120" w:type="dxa"/>
+              <w:bottom w:w="90" w:type="dxa"/>
+              <w:end w:w="120" w:type="dxa"/>
+            </w:tcMar>
           </w:tcPr>
           <w:p>
             <w:pPr>
-              <w:spacing w:line="276" w:lineRule="auto" w:after="40"/>
+              <w:spacing w:line="276" w:lineRule="auto" w:after="0"/>
             </w:pPr>
+            <w:r/>
             <w:r>
               <w:t>The workflow catches environment failures and records exactly which version passed</w:t>
             </w:r>
@@ -2716,12 +3572,19 @@
       <w:tr>
         <w:tc>
           <w:tcPr>
-            <w:tcW w:type="dxa" w:w="3120"/>
+            <w:tcW w:type="dxa" w:w="2088"/>
+            <w:tcMar>
+              <w:top w:w="90" w:type="dxa"/>
+              <w:start w:w="120" w:type="dxa"/>
+              <w:bottom w:w="90" w:type="dxa"/>
+              <w:end w:w="120" w:type="dxa"/>
+            </w:tcMar>
           </w:tcPr>
           <w:p>
             <w:pPr>
-              <w:spacing w:line="276" w:lineRule="auto" w:after="40"/>
+              <w:spacing w:line="276" w:lineRule="auto" w:after="0"/>
             </w:pPr>
+            <w:r/>
             <w:r>
               <w:t>Multi-Format Publishing</w:t>
             </w:r>
@@ -2729,12 +3592,19 @@
         </w:tc>
         <w:tc>
           <w:tcPr>
-            <w:tcW w:type="dxa" w:w="3120"/>
+            <w:tcW w:type="dxa" w:w="3672"/>
+            <w:tcMar>
+              <w:top w:w="90" w:type="dxa"/>
+              <w:start w:w="120" w:type="dxa"/>
+              <w:bottom w:w="90" w:type="dxa"/>
+              <w:end w:w="120" w:type="dxa"/>
+            </w:tcMar>
           </w:tcPr>
           <w:p>
             <w:pPr>
-              <w:spacing w:line="276" w:lineRule="auto" w:after="40"/>
+              <w:spacing w:line="276" w:lineRule="auto" w:after="0"/>
             </w:pPr>
+            <w:r/>
             <w:r>
               <w:t>One navigation order, Zensical for HTML, a Python Word export, and LibreOffice PDF conversion</w:t>
             </w:r>
@@ -2742,12 +3612,19 @@
         </w:tc>
         <w:tc>
           <w:tcPr>
-            <w:tcW w:type="dxa" w:w="3120"/>
+            <w:tcW w:type="dxa" w:w="3600"/>
+            <w:tcMar>
+              <w:top w:w="90" w:type="dxa"/>
+              <w:start w:w="120" w:type="dxa"/>
+              <w:bottom w:w="90" w:type="dxa"/>
+              <w:end w:w="120" w:type="dxa"/>
+            </w:tcMar>
           </w:tcPr>
           <w:p>
             <w:pPr>
-              <w:spacing w:line="276" w:lineRule="auto" w:after="40"/>
+              <w:spacing w:line="276" w:lineRule="auto" w:after="0"/>
             </w:pPr>
+            <w:r/>
             <w:r>
               <w:t>The website, Word handbook, and PDF stay synchronized from one maintained source</w:t>
             </w:r>
@@ -2758,6 +3635,7 @@
     <w:p>
       <w:pPr>
         <w:pStyle w:val="Heading2"/>
+        <w:spacing w:before="160"/>
       </w:pPr>
       <w:r>
         <w:t>Separate Content from Presentation</w:t>
@@ -4721,24 +5599,29 @@
     </w:p>
     <w:p>
       <w:pPr>
-        <w:pStyle w:val="ListBullet"/>
+        <w:pStyle w:val="Checklist"/>
       </w:pPr>
       <w:r>
         <w:rPr>
-          <w:color w:val="075E54"/>
-          <w:u w:val="single"/>
+          <w:b/>
+          <w:color w:val="16302B"/>
+          <w:u w:val="none"/>
         </w:rPr>
-        <w:t>[ ] The independent documentation validator passes.</w:t>
-      </w:r>
-    </w:p>
-    <w:p>
-      <w:pPr>
-        <w:pStyle w:val="ListBullet"/>
+        <w:t xml:space="preserve">[ ] </w:t>
+      </w:r>
+      <w:r>
+        <w:t>The independent documentation validator passes.</w:t>
+      </w:r>
+    </w:p>
+    <w:p>
+      <w:pPr>
+        <w:pStyle w:val="Checklist"/>
       </w:pPr>
       <w:r>
         <w:rPr>
-          <w:color w:val="075E54"/>
-          <w:u w:val="single"/>
+          <w:b/>
+          <w:color w:val="16302B"/>
+          <w:u w:val="none"/>
         </w:rPr>
         <w:t xml:space="preserve">[ ] </w:t>
       </w:r>
@@ -4754,38 +5637,50 @@
     </w:p>
     <w:p>
       <w:pPr>
-        <w:pStyle w:val="ListBullet"/>
+        <w:pStyle w:val="Checklist"/>
       </w:pPr>
       <w:r>
         <w:rPr>
-          <w:color w:val="075E54"/>
-          <w:u w:val="single"/>
+          <w:b/>
+          <w:color w:val="16302B"/>
+          <w:u w:val="none"/>
         </w:rPr>
-        <w:t>[ ] Every maintained page is present in explicit navigation.</w:t>
-      </w:r>
-    </w:p>
-    <w:p>
-      <w:pPr>
-        <w:pStyle w:val="ListBullet"/>
+        <w:t xml:space="preserve">[ ] </w:t>
+      </w:r>
+      <w:r>
+        <w:t>Every maintained page is present in explicit navigation.</w:t>
+      </w:r>
+    </w:p>
+    <w:p>
+      <w:pPr>
+        <w:pStyle w:val="Checklist"/>
       </w:pPr>
       <w:r>
         <w:rPr>
-          <w:color w:val="075E54"/>
-          <w:u w:val="single"/>
+          <w:b/>
+          <w:color w:val="16302B"/>
+          <w:u w:val="none"/>
         </w:rPr>
-        <w:t>[ ] Internal files and anchors resolve.</w:t>
-      </w:r>
-    </w:p>
-    <w:p>
-      <w:pPr>
-        <w:pStyle w:val="ListBullet"/>
+        <w:t xml:space="preserve">[ ] </w:t>
+      </w:r>
+      <w:r>
+        <w:t>Internal files and anchors resolve.</w:t>
+      </w:r>
+    </w:p>
+    <w:p>
+      <w:pPr>
+        <w:pStyle w:val="Checklist"/>
       </w:pPr>
       <w:r>
         <w:rPr>
-          <w:color w:val="075E54"/>
-          <w:u w:val="single"/>
+          <w:b/>
+          <w:color w:val="16302B"/>
+          <w:u w:val="none"/>
         </w:rPr>
-        <w:t>[ ] Word and PDF outputs are generated and pass artifact checks.</w:t>
+        <w:t xml:space="preserve">[ ] </w:t>
+      </w:r>
+      <w:r>
+        <w:t>Word and PDF outputs are generated and pass artifact checks.</w:t>
       </w:r>
     </w:p>
     <w:p>
@@ -4798,50 +5693,66 @@
     </w:p>
     <w:p>
       <w:pPr>
-        <w:pStyle w:val="ListBullet"/>
+        <w:pStyle w:val="Checklist"/>
       </w:pPr>
       <w:r>
         <w:rPr>
-          <w:color w:val="075E54"/>
-          <w:u w:val="single"/>
+          <w:b/>
+          <w:color w:val="16302B"/>
+          <w:u w:val="none"/>
         </w:rPr>
-        <w:t>[ ] The change answers a reader goal and states expected results.</w:t>
-      </w:r>
-    </w:p>
-    <w:p>
-      <w:pPr>
-        <w:pStyle w:val="ListBullet"/>
+        <w:t xml:space="preserve">[ ] </w:t>
+      </w:r>
+      <w:r>
+        <w:t>The change answers a reader goal and states expected results.</w:t>
+      </w:r>
+    </w:p>
+    <w:p>
+      <w:pPr>
+        <w:pStyle w:val="Checklist"/>
       </w:pPr>
       <w:r>
         <w:rPr>
-          <w:color w:val="075E54"/>
-          <w:u w:val="single"/>
+          <w:b/>
+          <w:color w:val="16302B"/>
+          <w:u w:val="none"/>
         </w:rPr>
-        <w:t>[ ] Terms, labels, units, and cross-references are consistent.</w:t>
-      </w:r>
-    </w:p>
-    <w:p>
-      <w:pPr>
-        <w:pStyle w:val="ListBullet"/>
+        <w:t xml:space="preserve">[ ] </w:t>
+      </w:r>
+      <w:r>
+        <w:t>Terms, labels, units, and cross-references are consistent.</w:t>
+      </w:r>
+    </w:p>
+    <w:p>
+      <w:pPr>
+        <w:pStyle w:val="Checklist"/>
       </w:pPr>
       <w:r>
         <w:rPr>
-          <w:color w:val="075E54"/>
-          <w:u w:val="single"/>
+          <w:b/>
+          <w:color w:val="16302B"/>
+          <w:u w:val="none"/>
         </w:rPr>
-        <w:t>[ ] No confidential, customer, proprietary, export-controlled, or classified information is present.</w:t>
-      </w:r>
-    </w:p>
-    <w:p>
-      <w:pPr>
-        <w:pStyle w:val="ListBullet"/>
+        <w:t xml:space="preserve">[ ] </w:t>
+      </w:r>
+      <w:r>
+        <w:t>No confidential, customer, proprietary, export-controlled, or classified information is present.</w:t>
+      </w:r>
+    </w:p>
+    <w:p>
+      <w:pPr>
+        <w:pStyle w:val="Checklist"/>
       </w:pPr>
       <w:r>
         <w:rPr>
-          <w:color w:val="075E54"/>
-          <w:u w:val="single"/>
+          <w:b/>
+          <w:color w:val="16302B"/>
+          <w:u w:val="none"/>
         </w:rPr>
-        <w:t>[ ] Fictional values and limitations are identified.</w:t>
+        <w:t xml:space="preserve">[ ] </w:t>
+      </w:r>
+      <w:r>
+        <w:t>Fictional values and limitations are identified.</w:t>
       </w:r>
     </w:p>
     <w:p>
@@ -4854,74 +5765,98 @@
     </w:p>
     <w:p>
       <w:pPr>
-        <w:pStyle w:val="ListBullet"/>
+        <w:pStyle w:val="Checklist"/>
       </w:pPr>
       <w:r>
         <w:rPr>
-          <w:color w:val="075E54"/>
-          <w:u w:val="single"/>
+          <w:b/>
+          <w:color w:val="16302B"/>
+          <w:u w:val="none"/>
         </w:rPr>
-        <w:t>[ ] Heading order and landmark structure are logical.</w:t>
-      </w:r>
-    </w:p>
-    <w:p>
-      <w:pPr>
-        <w:pStyle w:val="ListBullet"/>
+        <w:t xml:space="preserve">[ ] </w:t>
+      </w:r>
+      <w:r>
+        <w:t>Heading order and landmark structure are logical.</w:t>
+      </w:r>
+    </w:p>
+    <w:p>
+      <w:pPr>
+        <w:pStyle w:val="Checklist"/>
       </w:pPr>
       <w:r>
         <w:rPr>
-          <w:color w:val="075E54"/>
-          <w:u w:val="single"/>
+          <w:b/>
+          <w:color w:val="16302B"/>
+          <w:u w:val="none"/>
         </w:rPr>
-        <w:t>[ ] Keyboard focus is visible and the skip link works.</w:t>
-      </w:r>
-    </w:p>
-    <w:p>
-      <w:pPr>
-        <w:pStyle w:val="ListBullet"/>
+        <w:t xml:space="preserve">[ ] </w:t>
+      </w:r>
+      <w:r>
+        <w:t>Keyboard focus is visible and the skip link works.</w:t>
+      </w:r>
+    </w:p>
+    <w:p>
+      <w:pPr>
+        <w:pStyle w:val="Checklist"/>
       </w:pPr>
       <w:r>
         <w:rPr>
-          <w:color w:val="075E54"/>
-          <w:u w:val="single"/>
+          <w:b/>
+          <w:color w:val="16302B"/>
+          <w:u w:val="none"/>
         </w:rPr>
-        <w:t>[ ] Text remains usable at 200% zoom.</w:t>
-      </w:r>
-    </w:p>
-    <w:p>
-      <w:pPr>
-        <w:pStyle w:val="ListBullet"/>
+        <w:t xml:space="preserve">[ ] </w:t>
+      </w:r>
+      <w:r>
+        <w:t>Text remains usable at 200% zoom.</w:t>
+      </w:r>
+    </w:p>
+    <w:p>
+      <w:pPr>
+        <w:pStyle w:val="Checklist"/>
       </w:pPr>
       <w:r>
         <w:rPr>
-          <w:color w:val="075E54"/>
-          <w:u w:val="single"/>
+          <w:b/>
+          <w:color w:val="16302B"/>
+          <w:u w:val="none"/>
         </w:rPr>
-        <w:t>[ ] Pages have no horizontal overflow at 320, 360, 390, 768, 1024, and 1440 CSS pixels.</w:t>
-      </w:r>
-    </w:p>
-    <w:p>
-      <w:pPr>
-        <w:pStyle w:val="ListBullet"/>
+        <w:t xml:space="preserve">[ ] </w:t>
+      </w:r>
+      <w:r>
+        <w:t>Pages have no horizontal overflow at 320, 360, 390, 768, 1024, and 1440 CSS pixels.</w:t>
+      </w:r>
+    </w:p>
+    <w:p>
+      <w:pPr>
+        <w:pStyle w:val="Checklist"/>
       </w:pPr>
       <w:r>
         <w:rPr>
-          <w:color w:val="075E54"/>
-          <w:u w:val="single"/>
+          <w:b/>
+          <w:color w:val="16302B"/>
+          <w:u w:val="none"/>
         </w:rPr>
-        <w:t>[ ] Long labels, buttons, navigation, email addresses, and graphics wrap or crop safely.</w:t>
-      </w:r>
-    </w:p>
-    <w:p>
-      <w:pPr>
-        <w:pStyle w:val="ListBullet"/>
+        <w:t xml:space="preserve">[ ] </w:t>
+      </w:r>
+      <w:r>
+        <w:t>Long labels, buttons, navigation, email addresses, and graphics wrap or crop safely.</w:t>
+      </w:r>
+    </w:p>
+    <w:p>
+      <w:pPr>
+        <w:pStyle w:val="Checklist"/>
       </w:pPr>
       <w:r>
         <w:rPr>
-          <w:color w:val="075E54"/>
-          <w:u w:val="single"/>
+          <w:b/>
+          <w:color w:val="16302B"/>
+          <w:u w:val="none"/>
         </w:rPr>
-        <w:t>[ ] Motion is reduced when the operating-system preference requests it.</w:t>
+        <w:t xml:space="preserve">[ ] </w:t>
+      </w:r>
+      <w:r>
+        <w:t>Motion is reduced when the operating-system preference requests it.</w:t>
       </w:r>
     </w:p>
     <w:p>
@@ -4934,38 +5869,50 @@
     </w:p>
     <w:p>
       <w:pPr>
-        <w:pStyle w:val="ListBullet"/>
+        <w:pStyle w:val="Checklist"/>
       </w:pPr>
       <w:r>
         <w:rPr>
-          <w:color w:val="075E54"/>
-          <w:u w:val="single"/>
+          <w:b/>
+          <w:color w:val="16302B"/>
+          <w:u w:val="none"/>
         </w:rPr>
-        <w:t>[ ] Every Word and PDF page has been visually inspected.</w:t>
-      </w:r>
-    </w:p>
-    <w:p>
-      <w:pPr>
-        <w:pStyle w:val="ListBullet"/>
+        <w:t xml:space="preserve">[ ] </w:t>
+      </w:r>
+      <w:r>
+        <w:t>Every Word and PDF page has been visually inspected.</w:t>
+      </w:r>
+    </w:p>
+    <w:p>
+      <w:pPr>
+        <w:pStyle w:val="Checklist"/>
       </w:pPr>
       <w:r>
         <w:rPr>
-          <w:color w:val="075E54"/>
-          <w:u w:val="single"/>
+          <w:b/>
+          <w:color w:val="16302B"/>
+          <w:u w:val="none"/>
         </w:rPr>
-        <w:t>[ ] Headings, lists, tables, links, headers, and footers render correctly.</w:t>
-      </w:r>
-    </w:p>
-    <w:p>
-      <w:pPr>
-        <w:pStyle w:val="ListBullet"/>
+        <w:t xml:space="preserve">[ ] </w:t>
+      </w:r>
+      <w:r>
+        <w:t>Headings, lists, tables, links, headers, and footers render correctly.</w:t>
+      </w:r>
+    </w:p>
+    <w:p>
+      <w:pPr>
+        <w:pStyle w:val="Checklist"/>
       </w:pPr>
       <w:r>
         <w:rPr>
-          <w:color w:val="075E54"/>
-          <w:u w:val="single"/>
+          <w:b/>
+          <w:color w:val="16302B"/>
+          <w:u w:val="none"/>
         </w:rPr>
-        <w:t>[ ] File names, document properties, and visible content are suitable for public release.</w:t>
+        <w:t xml:space="preserve">[ ] </w:t>
+      </w:r>
+      <w:r>
+        <w:t>File names, document properties, and visible content are suitable for public release.</w:t>
       </w:r>
     </w:p>
     <w:sectPr>
@@ -17171,6 +18118,31 @@
         <w:shd w:val="clear" w:color="auto" w:fill="FBCAA2" w:themeFill="accent6" w:themeFillTint="7F"/>
       </w:tcPr>
     </w:tblStylePr>
+  </w:style>
+  <w:style w:type="paragraph" w:customStyle="1" w:styleId="Checklist">
+    <w:name w:val="Checklist"/>
+    <w:pPr>
+      <w:spacing w:line="276" w:lineRule="auto" w:after="60"/>
+      <w:ind w:left="504" w:hanging="360"/>
+    </w:pPr>
+    <w:rPr>
+      <w:rFonts w:ascii="Carlito" w:hAnsi="Carlito" w:eastAsia="Carlito"/>
+      <w:color w:val="16302B"/>
+      <w:sz w:val="21"/>
+      <w:u w:val="none"/>
+    </w:rPr>
+  </w:style>
+  <w:style w:type="paragraph" w:customStyle="1" w:styleId="Callout">
+    <w:name w:val="Callout"/>
+    <w:pPr>
+      <w:spacing w:before="160" w:after="180" w:line="276" w:lineRule="auto"/>
+      <w:ind w:left="288" w:right="173"/>
+    </w:pPr>
+    <w:rPr>
+      <w:rFonts w:ascii="Carlito" w:hAnsi="Carlito" w:eastAsia="Carlito"/>
+      <w:color w:val="16302B"/>
+      <w:sz w:val="20"/>
+    </w:rPr>
   </w:style>
   <w:style w:type="paragraph" w:customStyle="1" w:styleId="Code">
     <w:name w:val="Code"/>

</xml_diff>

<commit_message>
Prevent blank pages in portable output
</commit_message>
<xml_diff>
--- a/deliverables/greenhouse-sentinel-handbook.docx
+++ b/deliverables/greenhouse-sentinel-handbook.docx
@@ -35,6 +35,7 @@
     <w:p>
       <w:pPr>
         <w:pStyle w:val="Heading1"/>
+        <w:pageBreakBefore/>
       </w:pPr>
       <w:r>
         <w:t>Greenhouse Sentinel Documentation Demo</w:t>
@@ -1209,13 +1210,9 @@
       </w:r>
     </w:p>
     <w:p>
-      <w:r>
-        <w:br w:type="page"/>
-      </w:r>
-    </w:p>
-    <w:p>
       <w:pPr>
         <w:pStyle w:val="Heading1"/>
+        <w:pageBreakBefore/>
       </w:pPr>
       <w:r>
         <w:t>Quick Start</w:t>
@@ -1442,13 +1439,9 @@
       </w:r>
     </w:p>
     <w:p>
-      <w:r>
-        <w:br w:type="page"/>
-      </w:r>
-    </w:p>
-    <w:p>
       <w:pPr>
         <w:pStyle w:val="Heading1"/>
+        <w:pageBreakBefore/>
       </w:pPr>
       <w:r>
         <w:t>Operating Guide</w:t>
@@ -1651,13 +1644,9 @@
       </w:r>
     </w:p>
     <w:p>
-      <w:r>
-        <w:br w:type="page"/>
-      </w:r>
-    </w:p>
-    <w:p>
       <w:pPr>
         <w:pStyle w:val="Heading1"/>
+        <w:pageBreakBefore/>
       </w:pPr>
       <w:r>
         <w:t>Architecture</w:t>
@@ -2128,13 +2117,9 @@
       </w:r>
     </w:p>
     <w:p>
-      <w:r>
-        <w:br w:type="page"/>
-      </w:r>
-    </w:p>
-    <w:p>
       <w:pPr>
         <w:pStyle w:val="Heading1"/>
+        <w:pageBreakBefore/>
       </w:pPr>
       <w:r>
         <w:t>Troubleshooting</w:t>
@@ -2263,13 +2248,9 @@
       </w:r>
     </w:p>
     <w:p>
-      <w:r>
-        <w:br w:type="page"/>
-      </w:r>
-    </w:p>
-    <w:p>
       <w:pPr>
         <w:pStyle w:val="Heading1"/>
+        <w:pageBreakBefore/>
       </w:pPr>
       <w:r>
         <w:t>How This Repository Works</w:t>
@@ -3846,13 +3827,9 @@
       </w:r>
     </w:p>
     <w:p>
-      <w:r>
-        <w:br w:type="page"/>
-      </w:r>
-    </w:p>
-    <w:p>
       <w:pPr>
         <w:pStyle w:val="Heading1"/>
+        <w:pageBreakBefore/>
       </w:pPr>
       <w:r>
         <w:t>Build It from Scratch</w:t>
@@ -4854,13 +4831,9 @@
       </w:r>
     </w:p>
     <w:p>
-      <w:r>
-        <w:br w:type="page"/>
-      </w:r>
-    </w:p>
-    <w:p>
       <w:pPr>
         <w:pStyle w:val="Heading1"/>
+        <w:pageBreakBefore/>
       </w:pPr>
       <w:r>
         <w:t>Branding</w:t>
@@ -5045,13 +5018,9 @@
       </w:r>
     </w:p>
     <w:p>
-      <w:r>
-        <w:br w:type="page"/>
-      </w:r>
-    </w:p>
-    <w:p>
       <w:pPr>
         <w:pStyle w:val="Heading1"/>
+        <w:pageBreakBefore/>
       </w:pPr>
       <w:r>
         <w:t>Publishing</w:t>
@@ -5160,13 +5129,9 @@
       </w:r>
     </w:p>
     <w:p>
-      <w:r>
-        <w:br w:type="page"/>
-      </w:r>
-    </w:p>
-    <w:p>
       <w:pPr>
         <w:pStyle w:val="Heading1"/>
+        <w:pageBreakBefore/>
       </w:pPr>
       <w:r>
         <w:t>Writing Guide</w:t>
@@ -5425,13 +5390,9 @@
       </w:r>
     </w:p>
     <w:p>
-      <w:r>
-        <w:br w:type="page"/>
-      </w:r>
-    </w:p>
-    <w:p>
       <w:pPr>
         <w:pStyle w:val="Heading1"/>
+        <w:pageBreakBefore/>
       </w:pPr>
       <w:r>
         <w:t>Accessibility</w:t>
@@ -5577,13 +5538,9 @@
       </w:r>
     </w:p>
     <w:p>
-      <w:r>
-        <w:br w:type="page"/>
-      </w:r>
-    </w:p>
-    <w:p>
       <w:pPr>
         <w:pStyle w:val="Heading1"/>
+        <w:pageBreakBefore/>
       </w:pPr>
       <w:r>
         <w:t>Release Checklist</w:t>

</xml_diff>